<commit_message>
Partitions: month bounds no longer depend on the session's time zone
ensure-monthly-partitions failed on every run since 1 October with
"campaign_list_member_t1_2027_01 would overlap partition ..._2026_12": the
months up to December 2026 had been created from a US Eastern session (their
bounds sit at 04:00 / 05:00 UTC), and the job, now in UTC, passed plain dates
that start January at 00:00 UTC.

- fn_partition_bound reads a monthly partition's actual FROM / TO bound.
- fn_ensure_monthly_partitions starts a new month where the previous one
  ends and ends it where the next one begins; with no neighbour, 00:00 UTC.
  Existing partitions are untouched; no gap, no overlap.
- The seed's history months and a tenant move's history months use
  explicit UTC bounds.
- Patch 0034 (functions only); Platform Guide retention chapter note.

Co-Authored-By: Claude Opus 5.5 <noreply@anthropic.com>
</commit_message>
<xml_diff>
--- a/docs/manuals/CEP_Platform_Guide.docx
+++ b/docs/manuals/CEP_Platform_Guide.docx
@@ -19750,6 +19750,24 @@
           <w:szCs w:val="21"/>
         </w:rPr>
         <w:t xml:space="preserve">The Partitions check on the home page fails when a tenant lacks partitions for the months ahead; Repair onboarding on the tenant makes them.</w:t>
+      </w:r>
+    </w:p>
+    <w:p>
+      <w:pPr>
+        <w:pStyle w:val="ListParagraph"/>
+        <w:numPr>
+          <w:ilvl w:val="0"/>
+          <w:numId w:val="2"/>
+        </w:numPr>
+        <w:spacing w:after="60"/>
+      </w:pPr>
+      <w:r>
+        <w:rPr>
+          <w:rFonts w:ascii="Arial" w:cs="Arial" w:eastAsia="Arial" w:hAnsi="Arial"/>
+          <w:sz w:val="21"/>
+          <w:szCs w:val="21"/>
+        </w:rPr>
+        <w:t xml:space="preserve">A month's partition runs from 00:00 UTC on its first day. Partitions made before October 2026 may start a few hours off, in the time zone of the session that made them; each new month starts exactly where the previous one ends, so no row falls between two months or into two.</w:t>
       </w:r>
     </w:p>
     <w:p>

</xml_diff>

<commit_message>
Insights help: the engine switch guide, a Platform Guide chapter and a help panel on Report Engines, a User Guide chapter behind the help icon
docs/INSIGHTS_ENGINE_SWITCH.md is the operator's guide to moving a workspace between PostgreSQL and ClickHouse: the
server's four settings, the Report Engines row, the four buttons in order, rolling back, the checks and the limits.
The Platform Guide gains "Report Datasets and Report Engines" (18-report-engines.md), shown in the back-office guide
and linked from a help panel at the top of Report Engines (list_before_template, change_form_before_template). The
User Guide gains "Insights: Reports, Dashboards and Scheduled Delivery" (59-insights.md), the chapter behind the help
icon on every Insights page. Both Word manuals rebuilt. The schema comment lists QUARTER_HOUR among the freshness values.

Co-Authored-By: Claude Fable 5.1 <noreply@anthropic.com>
</commit_message>
<xml_diff>
--- a/docs/manuals/CEP_Platform_Guide.docx
+++ b/docs/manuals/CEP_Platform_Guide.docx
@@ -39,7 +39,7 @@
           <w:sz w:val="20"/>
           <w:szCs w:val="20"/>
         </w:rPr>
-        <w:t xml:space="preserve">Built 2026-10-09 from docs/manuals/platform-guide</w:t>
+        <w:t xml:space="preserve">Built 2026-10-16 from docs/manuals/platform-guide</w:t>
       </w:r>
     </w:p>
     <w:p>
@@ -1918,6 +1918,104 @@
           <w:szCs w:val="20"/>
         </w:rPr>
         <w:t xml:space="preserve">Things to know</w:t>
+      </w:r>
+    </w:p>
+    <w:p>
+      <w:pPr>
+        <w:spacing w:after="40"/>
+        <w:ind w:left="0"/>
+      </w:pPr>
+      <w:r>
+        <w:rPr>
+          <w:rFonts w:ascii="Arial" w:cs="Arial" w:eastAsia="Arial" w:hAnsi="Arial"/>
+          <w:sz w:val="22"/>
+          <w:szCs w:val="22"/>
+        </w:rPr>
+        <w:t xml:space="preserve">Report Datasets and Report Engines</w:t>
+      </w:r>
+    </w:p>
+    <w:p>
+      <w:pPr>
+        <w:spacing w:after="40"/>
+        <w:ind w:left="400"/>
+      </w:pPr>
+      <w:r>
+        <w:rPr>
+          <w:rFonts w:ascii="Arial" w:cs="Arial" w:eastAsia="Arial" w:hAnsi="Arial"/>
+          <w:sz w:val="20"/>
+          <w:szCs w:val="20"/>
+        </w:rPr>
+        <w:t xml:space="preserve">What these pages are for</w:t>
+      </w:r>
+    </w:p>
+    <w:p>
+      <w:pPr>
+        <w:spacing w:after="40"/>
+        <w:ind w:left="400"/>
+      </w:pPr>
+      <w:r>
+        <w:rPr>
+          <w:rFonts w:ascii="Arial" w:cs="Arial" w:eastAsia="Arial" w:hAnsi="Arial"/>
+          <w:sz w:val="20"/>
+          <w:szCs w:val="20"/>
+        </w:rPr>
+        <w:t xml:space="preserve">How a report runs</w:t>
+      </w:r>
+    </w:p>
+    <w:p>
+      <w:pPr>
+        <w:spacing w:after="40"/>
+        <w:ind w:left="400"/>
+      </w:pPr>
+      <w:r>
+        <w:rPr>
+          <w:rFonts w:ascii="Arial" w:cs="Arial" w:eastAsia="Arial" w:hAnsi="Arial"/>
+          <w:sz w:val="20"/>
+          <w:szCs w:val="20"/>
+        </w:rPr>
+        <w:t xml:space="preserve">Report Datasets</w:t>
+      </w:r>
+    </w:p>
+    <w:p>
+      <w:pPr>
+        <w:spacing w:after="40"/>
+        <w:ind w:left="400"/>
+      </w:pPr>
+      <w:r>
+        <w:rPr>
+          <w:rFonts w:ascii="Arial" w:cs="Arial" w:eastAsia="Arial" w:hAnsi="Arial"/>
+          <w:sz w:val="20"/>
+          <w:szCs w:val="20"/>
+        </w:rPr>
+        <w:t xml:space="preserve">Report Engines</w:t>
+      </w:r>
+    </w:p>
+    <w:p>
+      <w:pPr>
+        <w:spacing w:after="40"/>
+        <w:ind w:left="400"/>
+      </w:pPr>
+      <w:r>
+        <w:rPr>
+          <w:rFonts w:ascii="Arial" w:cs="Arial" w:eastAsia="Arial" w:hAnsi="Arial"/>
+          <w:sz w:val="20"/>
+          <w:szCs w:val="20"/>
+        </w:rPr>
+        <w:t xml:space="preserve">When something goes wrong</w:t>
+      </w:r>
+    </w:p>
+    <w:p>
+      <w:pPr>
+        <w:spacing w:after="40"/>
+        <w:ind w:left="400"/>
+      </w:pPr>
+      <w:r>
+        <w:rPr>
+          <w:rFonts w:ascii="Arial" w:cs="Arial" w:eastAsia="Arial" w:hAnsi="Arial"/>
+          <w:sz w:val="20"/>
+          <w:szCs w:val="20"/>
+        </w:rPr>
+        <w:t xml:space="preserve">Related chapters</w:t>
       </w:r>
     </w:p>
     <w:p>
@@ -26774,6 +26872,2585 @@
           <w:szCs w:val="21"/>
         </w:rPr>
         <w:t xml:space="preserve">The retry state lives on the customer's state record; nothing about retries needs a patch or a setting.</w:t>
+      </w:r>
+    </w:p>
+    <w:p>
+      <w:r>
+        <w:br w:type="page"/>
+      </w:r>
+    </w:p>
+    <w:p>
+      <w:pPr>
+        <w:pStyle w:val="Heading1"/>
+        <w:spacing w:after="120" w:before="0"/>
+      </w:pPr>
+      <w:r>
+        <w:rPr>
+          <w:rFonts w:ascii="Arial" w:cs="Arial" w:eastAsia="Arial" w:hAnsi="Arial"/>
+        </w:rPr>
+        <w:t xml:space="preserve">Report Datasets and Report Engines</w:t>
+      </w:r>
+    </w:p>
+    <w:p>
+      <w:pPr>
+        <w:spacing w:after="120"/>
+      </w:pPr>
+      <w:r>
+        <w:rPr>
+          <w:rFonts w:ascii="Arial" w:cs="Arial" w:eastAsia="Arial" w:hAnsi="Arial"/>
+          <w:b/>
+          <w:bCs/>
+          <w:sz w:val="21"/>
+          <w:szCs w:val="21"/>
+        </w:rPr>
+        <w:t xml:space="preserve">Where:</w:t>
+      </w:r>
+      <w:r>
+        <w:rPr>
+          <w:rFonts w:ascii="Arial" w:cs="Arial" w:eastAsia="Arial" w:hAnsi="Arial"/>
+          <w:sz w:val="21"/>
+          <w:szCs w:val="21"/>
+        </w:rPr>
+        <w:t xml:space="preserve"> Configuration → Report Datasets, and Configuration → Report Engines.</w:t>
+      </w:r>
+    </w:p>
+    <w:p>
+      <w:pPr>
+        <w:pStyle w:val="Heading2"/>
+        <w:spacing w:after="120" w:before="240"/>
+      </w:pPr>
+      <w:r>
+        <w:rPr>
+          <w:rFonts w:ascii="Arial" w:cs="Arial" w:eastAsia="Arial" w:hAnsi="Arial"/>
+        </w:rPr>
+        <w:t xml:space="preserve">What these pages are for</w:t>
+      </w:r>
+    </w:p>
+    <w:p>
+      <w:pPr>
+        <w:spacing w:after="120"/>
+      </w:pPr>
+      <w:r>
+        <w:rPr>
+          <w:rFonts w:ascii="Arial" w:cs="Arial" w:eastAsia="Arial" w:hAnsi="Arial"/>
+          <w:sz w:val="21"/>
+          <w:szCs w:val="21"/>
+        </w:rPr>
+        <w:t xml:space="preserve">Insights, the suite's reporting app, lets a workspace build its own reports, dashboards and scheduled deliveries on the data the platform already keeps. Two things make that possible and both live here:</w:t>
+      </w:r>
+    </w:p>
+    <w:p>
+      <w:pPr>
+        <w:pStyle w:val="ListParagraph"/>
+        <w:numPr>
+          <w:ilvl w:val="0"/>
+          <w:numId w:val="2"/>
+        </w:numPr>
+        <w:spacing w:after="60"/>
+      </w:pPr>
+      <w:r>
+        <w:rPr>
+          <w:rFonts w:ascii="Arial" w:cs="Arial" w:eastAsia="Arial" w:hAnsi="Arial"/>
+          <w:b/>
+          <w:bCs/>
+          <w:sz w:val="21"/>
+          <w:szCs w:val="21"/>
+        </w:rPr>
+        <w:t xml:space="preserve">Report Datasets</w:t>
+      </w:r>
+      <w:r>
+        <w:rPr>
+          <w:rFonts w:ascii="Arial" w:cs="Arial" w:eastAsia="Arial" w:hAnsi="Arial"/>
+          <w:sz w:val="21"/>
+          <w:szCs w:val="21"/>
+        </w:rPr>
+        <w:t xml:space="preserve"> is the catalogue: what a report can be built on (a dataset such as Messages or Attributed Orders), which fields each dataset offers, how each field may be filtered, grouped and totalled, how it is displayed, and how sensitive it is. Report authors see labels, never table or column names.</w:t>
+      </w:r>
+    </w:p>
+    <w:p>
+      <w:pPr>
+        <w:pStyle w:val="ListParagraph"/>
+        <w:numPr>
+          <w:ilvl w:val="0"/>
+          <w:numId w:val="2"/>
+        </w:numPr>
+        <w:spacing w:after="60"/>
+      </w:pPr>
+      <w:r>
+        <w:rPr>
+          <w:rFonts w:ascii="Arial" w:cs="Arial" w:eastAsia="Arial" w:hAnsi="Arial"/>
+          <w:b/>
+          <w:bCs/>
+          <w:sz w:val="21"/>
+          <w:szCs w:val="21"/>
+        </w:rPr>
+        <w:t xml:space="preserve">Report Engines</w:t>
+      </w:r>
+      <w:r>
+        <w:rPr>
+          <w:rFonts w:ascii="Arial" w:cs="Arial" w:eastAsia="Arial" w:hAnsi="Arial"/>
+          <w:sz w:val="21"/>
+          <w:szCs w:val="21"/>
+        </w:rPr>
+        <w:t xml:space="preserve"> says, per workspace, which analytics engine runs its reports: </w:t>
+      </w:r>
+      <w:r>
+        <w:rPr>
+          <w:rFonts w:ascii="Arial" w:cs="Arial" w:eastAsia="Arial" w:hAnsi="Arial"/>
+          <w:b/>
+          <w:bCs/>
+          <w:sz w:val="21"/>
+          <w:szCs w:val="21"/>
+        </w:rPr>
+        <w:t xml:space="preserve">PostgreSQL</w:t>
+      </w:r>
+      <w:r>
+        <w:rPr>
+          <w:rFonts w:ascii="Arial" w:cs="Arial" w:eastAsia="Arial" w:hAnsi="Arial"/>
+          <w:sz w:val="21"/>
+          <w:szCs w:val="21"/>
+        </w:rPr>
+        <w:t xml:space="preserve">, the live reporting views on the workspace's own database, or </w:t>
+      </w:r>
+      <w:r>
+        <w:rPr>
+          <w:rFonts w:ascii="Arial" w:cs="Arial" w:eastAsia="Arial" w:hAnsi="Arial"/>
+          <w:b/>
+          <w:bCs/>
+          <w:sz w:val="21"/>
+          <w:szCs w:val="21"/>
+        </w:rPr>
+        <w:t xml:space="preserve">ClickHouse</w:t>
+      </w:r>
+      <w:r>
+        <w:rPr>
+          <w:rFonts w:ascii="Arial" w:cs="Arial" w:eastAsia="Arial" w:hAnsi="Arial"/>
+          <w:sz w:val="21"/>
+          <w:szCs w:val="21"/>
+        </w:rPr>
+        <w:t xml:space="preserve">, reporting tables loaded from those views. It also holds the workspace's query limits.</w:t>
+      </w:r>
+    </w:p>
+    <w:p>
+      <w:pPr>
+        <w:spacing w:after="120"/>
+      </w:pPr>
+      <w:r>
+        <w:rPr>
+          <w:rFonts w:ascii="Arial" w:cs="Arial" w:eastAsia="Arial" w:hAnsi="Arial"/>
+          <w:sz w:val="21"/>
+          <w:szCs w:val="21"/>
+        </w:rPr>
+        <w:t xml:space="preserve">Nothing on these pages changes a workspace's data. They decide what can be reported on, where the query runs and how much of the engine one workspace may use.</w:t>
+      </w:r>
+    </w:p>
+    <w:p>
+      <w:pPr>
+        <w:pStyle w:val="Heading2"/>
+        <w:spacing w:after="120" w:before="240"/>
+      </w:pPr>
+      <w:r>
+        <w:rPr>
+          <w:rFonts w:ascii="Arial" w:cs="Arial" w:eastAsia="Arial" w:hAnsi="Arial"/>
+        </w:rPr>
+        <w:t xml:space="preserve">How a report runs</w:t>
+      </w:r>
+    </w:p>
+    <w:p>
+      <w:pPr>
+        <w:spacing w:after="120"/>
+      </w:pPr>
+      <w:r>
+        <w:rPr>
+          <w:rFonts w:ascii="Arial" w:cs="Arial" w:eastAsia="Arial" w:hAnsi="Arial"/>
+          <w:sz w:val="21"/>
+          <w:szCs w:val="21"/>
+        </w:rPr>
+        <w:t xml:space="preserve">A report is a definition: columns (dimensions to group by, measures to total), filters, a sort, a limit and a view. The engine checks the definition against the catalogue, compiles it to SQL for the workspace's engine with every value bound as a parameter and the workspace restriction always present, and runs it as one short read-only query under a statement timeout, a row cap and a per-workspace cap on concurrent runs. Every preview, run, export and scheduled delivery is written to the run log (Insights → Run Log in the app, for report administrators). A query that runs too long is stopped and the person is told to narrow it; nothing else in the platform is affected. On the dev server the engine runs as its own process, </w:t>
+      </w:r>
+      <w:r>
+        <w:rPr>
+          <w:rFonts w:ascii="Consolas" w:cs="Consolas" w:eastAsia="Consolas" w:hAnsi="Consolas"/>
+          <w:sz w:val="21"/>
+          <w:szCs w:val="21"/>
+        </w:rPr>
+        <w:t xml:space="preserve">cep-insights</w:t>
+      </w:r>
+      <w:r>
+        <w:rPr>
+          <w:rFonts w:ascii="Arial" w:cs="Arial" w:eastAsia="Arial" w:hAnsi="Arial"/>
+          <w:sz w:val="21"/>
+          <w:szCs w:val="21"/>
+        </w:rPr>
+        <w:t xml:space="preserve">, so a heavy report cannot slow the app.</w:t>
+      </w:r>
+    </w:p>
+    <w:p>
+      <w:pPr>
+        <w:pStyle w:val="Heading2"/>
+        <w:spacing w:after="120" w:before="240"/>
+      </w:pPr>
+      <w:r>
+        <w:rPr>
+          <w:rFonts w:ascii="Arial" w:cs="Arial" w:eastAsia="Arial" w:hAnsi="Arial"/>
+        </w:rPr>
+        <w:t xml:space="preserve">Report Datasets</w:t>
+      </w:r>
+    </w:p>
+    <w:tbl>
+      <w:tblPr>
+        <w:tblW w:type="dxa" w:w="10080"/>
+        <w:tblBorders>
+          <w:top w:val="single" w:color="D9DBE3" w:sz="4"/>
+          <w:left w:val="none"/>
+          <w:bottom w:val="single" w:color="D9DBE3" w:sz="4"/>
+          <w:right w:val="none"/>
+          <w:insideH w:val="single" w:color="E6E8EF" w:sz="4"/>
+          <w:insideV w:val="none"/>
+        </w:tblBorders>
+      </w:tblPr>
+      <w:tblGrid>
+        <w:gridCol w:w="2600"/>
+        <w:gridCol w:w="7480"/>
+      </w:tblGrid>
+      <w:tr>
+        <w:trPr>
+          <w:tblHeader/>
+        </w:trPr>
+        <w:tc>
+          <w:tcPr>
+            <w:tcW w:type="dxa" w:w="2600"/>
+            <w:shd w:fill="EEEFF5" w:color="auto" w:val="clear"/>
+            <w:tcMar>
+              <w:top w:type="dxa" w:w="60"/>
+              <w:left w:type="dxa" w:w="90"/>
+              <w:bottom w:type="dxa" w:w="60"/>
+              <w:right w:type="dxa" w:w="90"/>
+            </w:tcMar>
+          </w:tcPr>
+          <w:p>
+            <w:r>
+              <w:rPr>
+                <w:rFonts w:ascii="Arial" w:cs="Arial" w:eastAsia="Arial" w:hAnsi="Arial"/>
+                <w:b/>
+                <w:bCs/>
+                <w:sz w:val="18"/>
+                <w:szCs w:val="18"/>
+              </w:rPr>
+              <w:t xml:space="preserve">Field</w:t>
+            </w:r>
+          </w:p>
+        </w:tc>
+        <w:tc>
+          <w:tcPr>
+            <w:tcW w:type="dxa" w:w="7480"/>
+            <w:shd w:fill="EEEFF5" w:color="auto" w:val="clear"/>
+            <w:tcMar>
+              <w:top w:type="dxa" w:w="60"/>
+              <w:left w:type="dxa" w:w="90"/>
+              <w:bottom w:type="dxa" w:w="60"/>
+              <w:right w:type="dxa" w:w="90"/>
+            </w:tcMar>
+          </w:tcPr>
+          <w:p>
+            <w:r>
+              <w:rPr>
+                <w:rFonts w:ascii="Arial" w:cs="Arial" w:eastAsia="Arial" w:hAnsi="Arial"/>
+                <w:b/>
+                <w:bCs/>
+                <w:sz w:val="18"/>
+                <w:szCs w:val="18"/>
+              </w:rPr>
+              <w:t xml:space="preserve">Meaning</w:t>
+            </w:r>
+          </w:p>
+        </w:tc>
+      </w:tr>
+      <w:tr>
+        <w:tc>
+          <w:tcPr>
+            <w:tcW w:type="dxa" w:w="2600"/>
+            <w:tcMar>
+              <w:top w:type="dxa" w:w="60"/>
+              <w:left w:type="dxa" w:w="90"/>
+              <w:bottom w:type="dxa" w:w="60"/>
+              <w:right w:type="dxa" w:w="90"/>
+            </w:tcMar>
+          </w:tcPr>
+          <w:p>
+            <w:r>
+              <w:rPr>
+                <w:rFonts w:ascii="Arial" w:cs="Arial" w:eastAsia="Arial" w:hAnsi="Arial"/>
+                <w:sz w:val="19"/>
+                <w:szCs w:val="19"/>
+              </w:rPr>
+              <w:t xml:space="preserve">Key, label, description</w:t>
+            </w:r>
+          </w:p>
+        </w:tc>
+        <w:tc>
+          <w:tcPr>
+            <w:tcW w:type="dxa" w:w="7480"/>
+            <w:tcMar>
+              <w:top w:type="dxa" w:w="60"/>
+              <w:left w:type="dxa" w:w="90"/>
+              <w:bottom w:type="dxa" w:w="60"/>
+              <w:right w:type="dxa" w:w="90"/>
+            </w:tcMar>
+          </w:tcPr>
+          <w:p>
+            <w:r>
+              <w:rPr>
+                <w:rFonts w:ascii="Arial" w:cs="Arial" w:eastAsia="Arial" w:hAnsi="Arial"/>
+                <w:sz w:val="19"/>
+                <w:szCs w:val="19"/>
+              </w:rPr>
+              <w:t xml:space="preserve">How the dataset is named in the catalogue and described to authors.</w:t>
+            </w:r>
+          </w:p>
+        </w:tc>
+      </w:tr>
+      <w:tr>
+        <w:tc>
+          <w:tcPr>
+            <w:tcW w:type="dxa" w:w="2600"/>
+            <w:tcMar>
+              <w:top w:type="dxa" w:w="60"/>
+              <w:left w:type="dxa" w:w="90"/>
+              <w:bottom w:type="dxa" w:w="60"/>
+              <w:right w:type="dxa" w:w="90"/>
+            </w:tcMar>
+          </w:tcPr>
+          <w:p>
+            <w:r>
+              <w:rPr>
+                <w:rFonts w:ascii="Arial" w:cs="Arial" w:eastAsia="Arial" w:hAnsi="Arial"/>
+                <w:sz w:val="19"/>
+                <w:szCs w:val="19"/>
+              </w:rPr>
+              <w:t xml:space="preserve">Component</w:t>
+            </w:r>
+          </w:p>
+        </w:tc>
+        <w:tc>
+          <w:tcPr>
+            <w:tcW w:type="dxa" w:w="7480"/>
+            <w:tcMar>
+              <w:top w:type="dxa" w:w="60"/>
+              <w:left w:type="dxa" w:w="90"/>
+              <w:bottom w:type="dxa" w:w="60"/>
+              <w:right w:type="dxa" w:w="90"/>
+            </w:tcMar>
+          </w:tcPr>
+          <w:p>
+            <w:r>
+              <w:rPr>
+                <w:rFonts w:ascii="Arial" w:cs="Arial" w:eastAsia="Arial" w:hAnsi="Arial"/>
+                <w:sz w:val="19"/>
+                <w:szCs w:val="19"/>
+              </w:rPr>
+              <w:t xml:space="preserve">Which suite component the data belongs to (Engagement today). Reports group by it.</w:t>
+            </w:r>
+          </w:p>
+        </w:tc>
+      </w:tr>
+      <w:tr>
+        <w:tc>
+          <w:tcPr>
+            <w:tcW w:type="dxa" w:w="2600"/>
+            <w:tcMar>
+              <w:top w:type="dxa" w:w="60"/>
+              <w:left w:type="dxa" w:w="90"/>
+              <w:bottom w:type="dxa" w:w="60"/>
+              <w:right w:type="dxa" w:w="90"/>
+            </w:tcMar>
+          </w:tcPr>
+          <w:p>
+            <w:r>
+              <w:rPr>
+                <w:rFonts w:ascii="Arial" w:cs="Arial" w:eastAsia="Arial" w:hAnsi="Arial"/>
+                <w:sz w:val="19"/>
+                <w:szCs w:val="19"/>
+              </w:rPr>
+              <w:t xml:space="preserve">Primary key, time field</w:t>
+            </w:r>
+          </w:p>
+        </w:tc>
+        <w:tc>
+          <w:tcPr>
+            <w:tcW w:type="dxa" w:w="7480"/>
+            <w:tcMar>
+              <w:top w:type="dxa" w:w="60"/>
+              <w:left w:type="dxa" w:w="90"/>
+              <w:bottom w:type="dxa" w:w="60"/>
+              <w:right w:type="dxa" w:w="90"/>
+            </w:tcMar>
+          </w:tcPr>
+          <w:p>
+            <w:r>
+              <w:rPr>
+                <w:rFonts w:ascii="Arial" w:cs="Arial" w:eastAsia="Arial" w:hAnsi="Arial"/>
+                <w:sz w:val="19"/>
+                <w:szCs w:val="19"/>
+              </w:rPr>
+              <w:t xml:space="preserve">The row's identity, and the column a dashboard's period applies to.</w:t>
+            </w:r>
+          </w:p>
+        </w:tc>
+      </w:tr>
+      <w:tr>
+        <w:tc>
+          <w:tcPr>
+            <w:tcW w:type="dxa" w:w="2600"/>
+            <w:tcMar>
+              <w:top w:type="dxa" w:w="60"/>
+              <w:left w:type="dxa" w:w="90"/>
+              <w:bottom w:type="dxa" w:w="60"/>
+              <w:right w:type="dxa" w:w="90"/>
+            </w:tcMar>
+          </w:tcPr>
+          <w:p>
+            <w:r>
+              <w:rPr>
+                <w:rFonts w:ascii="Arial" w:cs="Arial" w:eastAsia="Arial" w:hAnsi="Arial"/>
+                <w:sz w:val="19"/>
+                <w:szCs w:val="19"/>
+              </w:rPr>
+              <w:t xml:space="preserve">Freshness policy</w:t>
+            </w:r>
+          </w:p>
+        </w:tc>
+        <w:tc>
+          <w:tcPr>
+            <w:tcW w:type="dxa" w:w="7480"/>
+            <w:tcMar>
+              <w:top w:type="dxa" w:w="60"/>
+              <w:left w:type="dxa" w:w="90"/>
+              <w:bottom w:type="dxa" w:w="60"/>
+              <w:right w:type="dxa" w:w="90"/>
+            </w:tcMar>
+          </w:tcPr>
+          <w:p>
+            <w:r>
+              <w:rPr>
+                <w:rFonts w:ascii="Arial" w:cs="Arial" w:eastAsia="Arial" w:hAnsi="Arial"/>
+                <w:sz w:val="19"/>
+                <w:szCs w:val="19"/>
+              </w:rPr>
+              <w:t xml:space="preserve">What the dataset promises: live, or as of a refresh.</w:t>
+            </w:r>
+          </w:p>
+        </w:tc>
+      </w:tr>
+      <w:tr>
+        <w:tc>
+          <w:tcPr>
+            <w:tcW w:type="dxa" w:w="2600"/>
+            <w:tcMar>
+              <w:top w:type="dxa" w:w="60"/>
+              <w:left w:type="dxa" w:w="90"/>
+              <w:bottom w:type="dxa" w:w="60"/>
+              <w:right w:type="dxa" w:w="90"/>
+            </w:tcMar>
+          </w:tcPr>
+          <w:p>
+            <w:r>
+              <w:rPr>
+                <w:rFonts w:ascii="Arial" w:cs="Arial" w:eastAsia="Arial" w:hAnsi="Arial"/>
+                <w:sz w:val="19"/>
+                <w:szCs w:val="19"/>
+              </w:rPr>
+              <w:t xml:space="preserve">Status</w:t>
+            </w:r>
+          </w:p>
+        </w:tc>
+        <w:tc>
+          <w:tcPr>
+            <w:tcW w:type="dxa" w:w="7480"/>
+            <w:tcMar>
+              <w:top w:type="dxa" w:w="60"/>
+              <w:left w:type="dxa" w:w="90"/>
+              <w:bottom w:type="dxa" w:w="60"/>
+              <w:right w:type="dxa" w:w="90"/>
+            </w:tcMar>
+          </w:tcPr>
+          <w:p>
+            <w:r>
+              <w:rPr>
+                <w:rFonts w:ascii="Arial" w:cs="Arial" w:eastAsia="Arial" w:hAnsi="Arial"/>
+                <w:sz w:val="19"/>
+                <w:szCs w:val="19"/>
+              </w:rPr>
+              <w:t xml:space="preserve">ACTIVE datasets are offered; anything else is hidden without being deleted.</w:t>
+            </w:r>
+          </w:p>
+        </w:tc>
+      </w:tr>
+      <w:tr>
+        <w:tc>
+          <w:tcPr>
+            <w:tcW w:type="dxa" w:w="2600"/>
+            <w:tcMar>
+              <w:top w:type="dxa" w:w="60"/>
+              <w:left w:type="dxa" w:w="90"/>
+              <w:bottom w:type="dxa" w:w="60"/>
+              <w:right w:type="dxa" w:w="90"/>
+            </w:tcMar>
+          </w:tcPr>
+          <w:p>
+            <w:r>
+              <w:rPr>
+                <w:rFonts w:ascii="Arial" w:cs="Arial" w:eastAsia="Arial" w:hAnsi="Arial"/>
+                <w:sz w:val="19"/>
+                <w:szCs w:val="19"/>
+              </w:rPr>
+              <w:t xml:space="preserve">Sources</w:t>
+            </w:r>
+          </w:p>
+        </w:tc>
+        <w:tc>
+          <w:tcPr>
+            <w:tcW w:type="dxa" w:w="7480"/>
+            <w:tcMar>
+              <w:top w:type="dxa" w:w="60"/>
+              <w:left w:type="dxa" w:w="90"/>
+              <w:bottom w:type="dxa" w:w="60"/>
+              <w:right w:type="dxa" w:w="90"/>
+            </w:tcMar>
+          </w:tcPr>
+          <w:p>
+            <w:r>
+              <w:rPr>
+                <w:rFonts w:ascii="Arial" w:cs="Arial" w:eastAsia="Arial" w:hAnsi="Arial"/>
+                <w:sz w:val="19"/>
+                <w:szCs w:val="19"/>
+              </w:rPr>
+              <w:t xml:space="preserve">One per engine: the view or table that holds the dataset on PostgreSQL and on ClickHouse. A workspace sees a dataset only when its engine has an ACTIVE source for it.</w:t>
+            </w:r>
+          </w:p>
+        </w:tc>
+      </w:tr>
+      <w:tr>
+        <w:tc>
+          <w:tcPr>
+            <w:tcW w:type="dxa" w:w="2600"/>
+            <w:tcMar>
+              <w:top w:type="dxa" w:w="60"/>
+              <w:left w:type="dxa" w:w="90"/>
+              <w:bottom w:type="dxa" w:w="60"/>
+              <w:right w:type="dxa" w:w="90"/>
+            </w:tcMar>
+          </w:tcPr>
+          <w:p>
+            <w:r>
+              <w:rPr>
+                <w:rFonts w:ascii="Arial" w:cs="Arial" w:eastAsia="Arial" w:hAnsi="Arial"/>
+                <w:sz w:val="19"/>
+                <w:szCs w:val="19"/>
+              </w:rPr>
+              <w:t xml:space="preserve">Fields</w:t>
+            </w:r>
+          </w:p>
+        </w:tc>
+        <w:tc>
+          <w:tcPr>
+            <w:tcW w:type="dxa" w:w="7480"/>
+            <w:tcMar>
+              <w:top w:type="dxa" w:w="60"/>
+              <w:left w:type="dxa" w:w="90"/>
+              <w:bottom w:type="dxa" w:w="60"/>
+              <w:right w:type="dxa" w:w="90"/>
+            </w:tcMar>
+          </w:tcPr>
+          <w:p>
+            <w:r>
+              <w:rPr>
+                <w:rFonts w:ascii="Arial" w:cs="Arial" w:eastAsia="Arial" w:hAnsi="Arial"/>
+                <w:sz w:val="19"/>
+                <w:szCs w:val="19"/>
+              </w:rPr>
+              <w:t xml:space="preserve">Each with its key, label, the column behind it, its type (string, number, date, datetime, boolean), its role (dimension or measure), the aggregates it allows (sum, count, distinct count, average, min, max), its display format (integer, decimal, money, percent, date, datetime) and its sensitivity.</w:t>
+            </w:r>
+          </w:p>
+        </w:tc>
+      </w:tr>
+    </w:tbl>
+    <w:p>
+      <w:pPr>
+        <w:spacing w:after="120"/>
+      </w:pPr>
+    </w:p>
+    <w:p>
+      <w:pPr>
+        <w:pStyle w:val="Heading3"/>
+        <w:spacing w:after="120" w:before="240"/>
+      </w:pPr>
+      <w:r>
+        <w:rPr>
+          <w:rFonts w:ascii="Arial" w:cs="Arial" w:eastAsia="Arial" w:hAnsi="Arial"/>
+        </w:rPr>
+        <w:t xml:space="preserve">Sensitivity</w:t>
+      </w:r>
+    </w:p>
+    <w:p>
+      <w:pPr>
+        <w:pStyle w:val="ListParagraph"/>
+        <w:numPr>
+          <w:ilvl w:val="0"/>
+          <w:numId w:val="2"/>
+        </w:numPr>
+        <w:spacing w:after="60"/>
+      </w:pPr>
+      <w:r>
+        <w:rPr>
+          <w:rFonts w:ascii="Arial" w:cs="Arial" w:eastAsia="Arial" w:hAnsi="Arial"/>
+          <w:b/>
+          <w:bCs/>
+          <w:sz w:val="21"/>
+          <w:szCs w:val="21"/>
+        </w:rPr>
+        <w:t xml:space="preserve">NORMAL</w:t>
+      </w:r>
+      <w:r>
+        <w:rPr>
+          <w:rFonts w:ascii="Arial" w:cs="Arial" w:eastAsia="Arial" w:hAnsi="Arial"/>
+          <w:sz w:val="21"/>
+          <w:szCs w:val="21"/>
+        </w:rPr>
+        <w:t xml:space="preserve"> fields are offered to everyone with Reports · View.</w:t>
+      </w:r>
+    </w:p>
+    <w:p>
+      <w:pPr>
+        <w:pStyle w:val="ListParagraph"/>
+        <w:numPr>
+          <w:ilvl w:val="0"/>
+          <w:numId w:val="2"/>
+        </w:numPr>
+        <w:spacing w:after="60"/>
+      </w:pPr>
+      <w:r>
+        <w:rPr>
+          <w:rFonts w:ascii="Arial" w:cs="Arial" w:eastAsia="Arial" w:hAnsi="Arial"/>
+          <w:b/>
+          <w:bCs/>
+          <w:sz w:val="21"/>
+          <w:szCs w:val="21"/>
+        </w:rPr>
+        <w:t xml:space="preserve">PII</w:t>
+      </w:r>
+      <w:r>
+        <w:rPr>
+          <w:rFonts w:ascii="Arial" w:cs="Arial" w:eastAsia="Arial" w:hAnsi="Arial"/>
+          <w:sz w:val="21"/>
+          <w:szCs w:val="21"/>
+        </w:rPr>
+        <w:t xml:space="preserve"> fields (a customer's identifier, an email address) can be built on only by people with Report Admin (</w:t>
+      </w:r>
+      <w:r>
+        <w:rPr>
+          <w:rFonts w:ascii="Consolas" w:cs="Consolas" w:eastAsia="Consolas" w:hAnsi="Consolas"/>
+          <w:sz w:val="21"/>
+          <w:szCs w:val="21"/>
+        </w:rPr>
+        <w:t xml:space="preserve">report.admin</w:t>
+      </w:r>
+      <w:r>
+        <w:rPr>
+          <w:rFonts w:ascii="Arial" w:cs="Arial" w:eastAsia="Arial" w:hAnsi="Arial"/>
+          <w:sz w:val="21"/>
+          <w:szCs w:val="21"/>
+        </w:rPr>
+        <w:t xml:space="preserve">) or User Admin (</w:t>
+      </w:r>
+      <w:r>
+        <w:rPr>
+          <w:rFonts w:ascii="Consolas" w:cs="Consolas" w:eastAsia="Consolas" w:hAnsi="Consolas"/>
+          <w:sz w:val="21"/>
+          <w:szCs w:val="21"/>
+        </w:rPr>
+        <w:t xml:space="preserve">user.admin</w:t>
+      </w:r>
+      <w:r>
+        <w:rPr>
+          <w:rFonts w:ascii="Arial" w:cs="Arial" w:eastAsia="Arial" w:hAnsi="Arial"/>
+          <w:sz w:val="21"/>
+          <w:szCs w:val="21"/>
+        </w:rPr>
+        <w:t xml:space="preserve">). Everyone else does not see them in the catalogue, and when they open a shared report that has such a column, its values are masked in the grid, the exports and the deliveries.</w:t>
+      </w:r>
+    </w:p>
+    <w:p>
+      <w:pPr>
+        <w:pStyle w:val="ListParagraph"/>
+        <w:numPr>
+          <w:ilvl w:val="0"/>
+          <w:numId w:val="2"/>
+        </w:numPr>
+        <w:spacing w:after="60"/>
+      </w:pPr>
+      <w:r>
+        <w:rPr>
+          <w:rFonts w:ascii="Arial" w:cs="Arial" w:eastAsia="Arial" w:hAnsi="Arial"/>
+          <w:b/>
+          <w:bCs/>
+          <w:sz w:val="21"/>
+          <w:szCs w:val="21"/>
+        </w:rPr>
+        <w:t xml:space="preserve">CONFIDENTIAL</w:t>
+      </w:r>
+      <w:r>
+        <w:rPr>
+          <w:rFonts w:ascii="Arial" w:cs="Arial" w:eastAsia="Arial" w:hAnsi="Arial"/>
+          <w:sz w:val="21"/>
+          <w:szCs w:val="21"/>
+        </w:rPr>
+        <w:t xml:space="preserve"> fields are never offered.</w:t>
+      </w:r>
+    </w:p>
+    <w:p>
+      <w:pPr>
+        <w:spacing w:after="120"/>
+      </w:pPr>
+      <w:r>
+        <w:rPr>
+          <w:rFonts w:ascii="Arial" w:cs="Arial" w:eastAsia="Arial" w:hAnsi="Arial"/>
+          <w:sz w:val="21"/>
+          <w:szCs w:val="21"/>
+        </w:rPr>
+        <w:t xml:space="preserve">The four datasets shipped are Messages, Attributed Orders, Contacts and Journey Enrolments. Adding a field means adding it to the reporting view (or table) first, then here; the catalogue is cached for a minute.</w:t>
+      </w:r>
+    </w:p>
+    <w:p>
+      <w:pPr>
+        <w:pStyle w:val="Heading2"/>
+        <w:spacing w:after="120" w:before="240"/>
+      </w:pPr>
+      <w:r>
+        <w:rPr>
+          <w:rFonts w:ascii="Arial" w:cs="Arial" w:eastAsia="Arial" w:hAnsi="Arial"/>
+        </w:rPr>
+        <w:t xml:space="preserve">Report Engines</w:t>
+      </w:r>
+    </w:p>
+    <w:p>
+      <w:pPr>
+        <w:spacing w:after="120"/>
+      </w:pPr>
+      <w:r>
+        <w:rPr>
+          <w:rFonts w:ascii="Arial" w:cs="Arial" w:eastAsia="Arial" w:hAnsi="Arial"/>
+          <w:sz w:val="21"/>
+          <w:szCs w:val="21"/>
+        </w:rPr>
+        <w:t xml:space="preserve">One row per workspace. A workspace without a row runs on PostgreSQL with the default limits.</w:t>
+      </w:r>
+    </w:p>
+    <w:tbl>
+      <w:tblPr>
+        <w:tblW w:type="dxa" w:w="10080"/>
+        <w:tblBorders>
+          <w:top w:val="single" w:color="D9DBE3" w:sz="4"/>
+          <w:left w:val="none"/>
+          <w:bottom w:val="single" w:color="D9DBE3" w:sz="4"/>
+          <w:right w:val="none"/>
+          <w:insideH w:val="single" w:color="E6E8EF" w:sz="4"/>
+          <w:insideV w:val="none"/>
+        </w:tblBorders>
+      </w:tblPr>
+      <w:tblGrid>
+        <w:gridCol w:w="2600"/>
+        <w:gridCol w:w="3740"/>
+        <w:gridCol w:w="3740"/>
+      </w:tblGrid>
+      <w:tr>
+        <w:trPr>
+          <w:tblHeader/>
+        </w:trPr>
+        <w:tc>
+          <w:tcPr>
+            <w:tcW w:type="dxa" w:w="2600"/>
+            <w:shd w:fill="EEEFF5" w:color="auto" w:val="clear"/>
+            <w:tcMar>
+              <w:top w:type="dxa" w:w="60"/>
+              <w:left w:type="dxa" w:w="90"/>
+              <w:bottom w:type="dxa" w:w="60"/>
+              <w:right w:type="dxa" w:w="90"/>
+            </w:tcMar>
+          </w:tcPr>
+          <w:p>
+            <w:r>
+              <w:rPr>
+                <w:rFonts w:ascii="Arial" w:cs="Arial" w:eastAsia="Arial" w:hAnsi="Arial"/>
+                <w:b/>
+                <w:bCs/>
+                <w:sz w:val="18"/>
+                <w:szCs w:val="18"/>
+              </w:rPr>
+              <w:t xml:space="preserve">Field</w:t>
+            </w:r>
+          </w:p>
+        </w:tc>
+        <w:tc>
+          <w:tcPr>
+            <w:tcW w:type="dxa" w:w="3740"/>
+            <w:shd w:fill="EEEFF5" w:color="auto" w:val="clear"/>
+            <w:tcMar>
+              <w:top w:type="dxa" w:w="60"/>
+              <w:left w:type="dxa" w:w="90"/>
+              <w:bottom w:type="dxa" w:w="60"/>
+              <w:right w:type="dxa" w:w="90"/>
+            </w:tcMar>
+          </w:tcPr>
+          <w:p>
+            <w:r>
+              <w:rPr>
+                <w:rFonts w:ascii="Arial" w:cs="Arial" w:eastAsia="Arial" w:hAnsi="Arial"/>
+                <w:b/>
+                <w:bCs/>
+                <w:sz w:val="18"/>
+                <w:szCs w:val="18"/>
+              </w:rPr>
+              <w:t xml:space="preserve">Values</w:t>
+            </w:r>
+          </w:p>
+        </w:tc>
+        <w:tc>
+          <w:tcPr>
+            <w:tcW w:type="dxa" w:w="3740"/>
+            <w:shd w:fill="EEEFF5" w:color="auto" w:val="clear"/>
+            <w:tcMar>
+              <w:top w:type="dxa" w:w="60"/>
+              <w:left w:type="dxa" w:w="90"/>
+              <w:bottom w:type="dxa" w:w="60"/>
+              <w:right w:type="dxa" w:w="90"/>
+            </w:tcMar>
+          </w:tcPr>
+          <w:p>
+            <w:r>
+              <w:rPr>
+                <w:rFonts w:ascii="Arial" w:cs="Arial" w:eastAsia="Arial" w:hAnsi="Arial"/>
+                <w:b/>
+                <w:bCs/>
+                <w:sz w:val="18"/>
+                <w:szCs w:val="18"/>
+              </w:rPr>
+              <w:t xml:space="preserve">Meaning</w:t>
+            </w:r>
+          </w:p>
+        </w:tc>
+      </w:tr>
+      <w:tr>
+        <w:tc>
+          <w:tcPr>
+            <w:tcW w:type="dxa" w:w="2600"/>
+            <w:tcMar>
+              <w:top w:type="dxa" w:w="60"/>
+              <w:left w:type="dxa" w:w="90"/>
+              <w:bottom w:type="dxa" w:w="60"/>
+              <w:right w:type="dxa" w:w="90"/>
+            </w:tcMar>
+          </w:tcPr>
+          <w:p>
+            <w:r>
+              <w:rPr>
+                <w:rFonts w:ascii="Arial" w:cs="Arial" w:eastAsia="Arial" w:hAnsi="Arial"/>
+                <w:sz w:val="19"/>
+                <w:szCs w:val="19"/>
+              </w:rPr>
+              <w:t xml:space="preserve">Engine</w:t>
+            </w:r>
+          </w:p>
+        </w:tc>
+        <w:tc>
+          <w:tcPr>
+            <w:tcW w:type="dxa" w:w="3740"/>
+            <w:tcMar>
+              <w:top w:type="dxa" w:w="60"/>
+              <w:left w:type="dxa" w:w="90"/>
+              <w:bottom w:type="dxa" w:w="60"/>
+              <w:right w:type="dxa" w:w="90"/>
+            </w:tcMar>
+          </w:tcPr>
+          <w:p>
+            <w:r>
+              <w:rPr>
+                <w:rFonts w:ascii="Consolas" w:cs="Consolas" w:eastAsia="Consolas" w:hAnsi="Consolas"/>
+                <w:sz w:val="19"/>
+                <w:szCs w:val="19"/>
+              </w:rPr>
+              <w:t xml:space="preserve">postgresql</w:t>
+            </w:r>
+            <w:r>
+              <w:rPr>
+                <w:rFonts w:ascii="Arial" w:cs="Arial" w:eastAsia="Arial" w:hAnsi="Arial"/>
+                <w:sz w:val="19"/>
+                <w:szCs w:val="19"/>
+              </w:rPr>
+              <w:t xml:space="preserve">, </w:t>
+            </w:r>
+            <w:r>
+              <w:rPr>
+                <w:rFonts w:ascii="Consolas" w:cs="Consolas" w:eastAsia="Consolas" w:hAnsi="Consolas"/>
+                <w:sz w:val="19"/>
+                <w:szCs w:val="19"/>
+              </w:rPr>
+              <w:t xml:space="preserve">clickhouse</w:t>
+            </w:r>
+          </w:p>
+        </w:tc>
+        <w:tc>
+          <w:tcPr>
+            <w:tcW w:type="dxa" w:w="3740"/>
+            <w:tcMar>
+              <w:top w:type="dxa" w:w="60"/>
+              <w:left w:type="dxa" w:w="90"/>
+              <w:bottom w:type="dxa" w:w="60"/>
+              <w:right w:type="dxa" w:w="90"/>
+            </w:tcMar>
+          </w:tcPr>
+          <w:p>
+            <w:r>
+              <w:rPr>
+                <w:rFonts w:ascii="Arial" w:cs="Arial" w:eastAsia="Arial" w:hAnsi="Arial"/>
+                <w:sz w:val="19"/>
+                <w:szCs w:val="19"/>
+              </w:rPr>
+              <w:t xml:space="preserve">The engine the workspace is on, or moving to.</w:t>
+            </w:r>
+          </w:p>
+        </w:tc>
+      </w:tr>
+      <w:tr>
+        <w:tc>
+          <w:tcPr>
+            <w:tcW w:type="dxa" w:w="2600"/>
+            <w:tcMar>
+              <w:top w:type="dxa" w:w="60"/>
+              <w:left w:type="dxa" w:w="90"/>
+              <w:bottom w:type="dxa" w:w="60"/>
+              <w:right w:type="dxa" w:w="90"/>
+            </w:tcMar>
+          </w:tcPr>
+          <w:p>
+            <w:r>
+              <w:rPr>
+                <w:rFonts w:ascii="Arial" w:cs="Arial" w:eastAsia="Arial" w:hAnsi="Arial"/>
+                <w:sz w:val="19"/>
+                <w:szCs w:val="19"/>
+              </w:rPr>
+              <w:t xml:space="preserve">Status</w:t>
+            </w:r>
+          </w:p>
+        </w:tc>
+        <w:tc>
+          <w:tcPr>
+            <w:tcW w:type="dxa" w:w="3740"/>
+            <w:tcMar>
+              <w:top w:type="dxa" w:w="60"/>
+              <w:left w:type="dxa" w:w="90"/>
+              <w:bottom w:type="dxa" w:w="60"/>
+              <w:right w:type="dxa" w:w="90"/>
+            </w:tcMar>
+          </w:tcPr>
+          <w:p>
+            <w:r>
+              <w:rPr>
+                <w:rFonts w:ascii="Consolas" w:cs="Consolas" w:eastAsia="Consolas" w:hAnsi="Consolas"/>
+                <w:sz w:val="19"/>
+                <w:szCs w:val="19"/>
+              </w:rPr>
+              <w:t xml:space="preserve">ACTIVE</w:t>
+            </w:r>
+            <w:r>
+              <w:rPr>
+                <w:rFonts w:ascii="Arial" w:cs="Arial" w:eastAsia="Arial" w:hAnsi="Arial"/>
+                <w:sz w:val="19"/>
+                <w:szCs w:val="19"/>
+              </w:rPr>
+              <w:t xml:space="preserve">, </w:t>
+            </w:r>
+            <w:r>
+              <w:rPr>
+                <w:rFonts w:ascii="Consolas" w:cs="Consolas" w:eastAsia="Consolas" w:hAnsi="Consolas"/>
+                <w:sz w:val="19"/>
+                <w:szCs w:val="19"/>
+              </w:rPr>
+              <w:t xml:space="preserve">MIGRATING</w:t>
+            </w:r>
+            <w:r>
+              <w:rPr>
+                <w:rFonts w:ascii="Arial" w:cs="Arial" w:eastAsia="Arial" w:hAnsi="Arial"/>
+                <w:sz w:val="19"/>
+                <w:szCs w:val="19"/>
+              </w:rPr>
+              <w:t xml:space="preserve">, </w:t>
+            </w:r>
+            <w:r>
+              <w:rPr>
+                <w:rFonts w:ascii="Consolas" w:cs="Consolas" w:eastAsia="Consolas" w:hAnsi="Consolas"/>
+                <w:sz w:val="19"/>
+                <w:szCs w:val="19"/>
+              </w:rPr>
+              <w:t xml:space="preserve">READ_ONLY</w:t>
+            </w:r>
+          </w:p>
+        </w:tc>
+        <w:tc>
+          <w:tcPr>
+            <w:tcW w:type="dxa" w:w="3740"/>
+            <w:tcMar>
+              <w:top w:type="dxa" w:w="60"/>
+              <w:left w:type="dxa" w:w="90"/>
+              <w:bottom w:type="dxa" w:w="60"/>
+              <w:right w:type="dxa" w:w="90"/>
+            </w:tcMar>
+          </w:tcPr>
+          <w:p>
+            <w:r>
+              <w:rPr>
+                <w:rFonts w:ascii="Arial" w:cs="Arial" w:eastAsia="Arial" w:hAnsi="Arial"/>
+                <w:sz w:val="19"/>
+                <w:szCs w:val="19"/>
+              </w:rPr>
+              <w:t xml:space="preserve">With ClickHouse, </w:t>
+            </w:r>
+            <w:r>
+              <w:rPr>
+                <w:rFonts w:ascii="Consolas" w:cs="Consolas" w:eastAsia="Consolas" w:hAnsi="Consolas"/>
+                <w:sz w:val="19"/>
+                <w:szCs w:val="19"/>
+              </w:rPr>
+              <w:t xml:space="preserve">MIGRATING</w:t>
+            </w:r>
+            <w:r>
+              <w:rPr>
+                <w:rFonts w:ascii="Arial" w:cs="Arial" w:eastAsia="Arial" w:hAnsi="Arial"/>
+                <w:sz w:val="19"/>
+                <w:szCs w:val="19"/>
+              </w:rPr>
+              <w:t xml:space="preserve"> means the tables are being loaded or checked and reports </w:t>
+            </w:r>
+            <w:r>
+              <w:rPr>
+                <w:rFonts w:ascii="Arial" w:cs="Arial" w:eastAsia="Arial" w:hAnsi="Arial"/>
+                <w:b/>
+                <w:bCs/>
+                <w:sz w:val="19"/>
+                <w:szCs w:val="19"/>
+              </w:rPr>
+              <w:t xml:space="preserve">still run on PostgreSQL</w:t>
+            </w:r>
+            <w:r>
+              <w:rPr>
+                <w:rFonts w:ascii="Arial" w:cs="Arial" w:eastAsia="Arial" w:hAnsi="Arial"/>
+                <w:sz w:val="19"/>
+                <w:szCs w:val="19"/>
+              </w:rPr>
+              <w:t xml:space="preserve">. </w:t>
+            </w:r>
+            <w:r>
+              <w:rPr>
+                <w:rFonts w:ascii="Consolas" w:cs="Consolas" w:eastAsia="Consolas" w:hAnsi="Consolas"/>
+                <w:sz w:val="19"/>
+                <w:szCs w:val="19"/>
+              </w:rPr>
+              <w:t xml:space="preserve">ACTIVE</w:t>
+            </w:r>
+            <w:r>
+              <w:rPr>
+                <w:rFonts w:ascii="Arial" w:cs="Arial" w:eastAsia="Arial" w:hAnsi="Arial"/>
+                <w:sz w:val="19"/>
+                <w:szCs w:val="19"/>
+              </w:rPr>
+              <w:t xml:space="preserve"> means reports run on the engine named.</w:t>
+            </w:r>
+          </w:p>
+        </w:tc>
+      </w:tr>
+      <w:tr>
+        <w:tc>
+          <w:tcPr>
+            <w:tcW w:type="dxa" w:w="2600"/>
+            <w:tcMar>
+              <w:top w:type="dxa" w:w="60"/>
+              <w:left w:type="dxa" w:w="90"/>
+              <w:bottom w:type="dxa" w:w="60"/>
+              <w:right w:type="dxa" w:w="90"/>
+            </w:tcMar>
+          </w:tcPr>
+          <w:p>
+            <w:r>
+              <w:rPr>
+                <w:rFonts w:ascii="Arial" w:cs="Arial" w:eastAsia="Arial" w:hAnsi="Arial"/>
+                <w:sz w:val="19"/>
+                <w:szCs w:val="19"/>
+              </w:rPr>
+              <w:t xml:space="preserve">Freshness SLA</w:t>
+            </w:r>
+          </w:p>
+        </w:tc>
+        <w:tc>
+          <w:tcPr>
+            <w:tcW w:type="dxa" w:w="3740"/>
+            <w:tcMar>
+              <w:top w:type="dxa" w:w="60"/>
+              <w:left w:type="dxa" w:w="90"/>
+              <w:bottom w:type="dxa" w:w="60"/>
+              <w:right w:type="dxa" w:w="90"/>
+            </w:tcMar>
+          </w:tcPr>
+          <w:p>
+            <w:r>
+              <w:rPr>
+                <w:rFonts w:ascii="Consolas" w:cs="Consolas" w:eastAsia="Consolas" w:hAnsi="Consolas"/>
+                <w:sz w:val="19"/>
+                <w:szCs w:val="19"/>
+              </w:rPr>
+              <w:t xml:space="preserve">LIVE</w:t>
+            </w:r>
+            <w:r>
+              <w:rPr>
+                <w:rFonts w:ascii="Arial" w:cs="Arial" w:eastAsia="Arial" w:hAnsi="Arial"/>
+                <w:sz w:val="19"/>
+                <w:szCs w:val="19"/>
+              </w:rPr>
+              <w:t xml:space="preserve">, </w:t>
+            </w:r>
+            <w:r>
+              <w:rPr>
+                <w:rFonts w:ascii="Consolas" w:cs="Consolas" w:eastAsia="Consolas" w:hAnsi="Consolas"/>
+                <w:sz w:val="19"/>
+                <w:szCs w:val="19"/>
+              </w:rPr>
+              <w:t xml:space="preserve">QUARTER_HOUR</w:t>
+            </w:r>
+            <w:r>
+              <w:rPr>
+                <w:rFonts w:ascii="Arial" w:cs="Arial" w:eastAsia="Arial" w:hAnsi="Arial"/>
+                <w:sz w:val="19"/>
+                <w:szCs w:val="19"/>
+              </w:rPr>
+              <w:t xml:space="preserve">, </w:t>
+            </w:r>
+            <w:r>
+              <w:rPr>
+                <w:rFonts w:ascii="Consolas" w:cs="Consolas" w:eastAsia="Consolas" w:hAnsi="Consolas"/>
+                <w:sz w:val="19"/>
+                <w:szCs w:val="19"/>
+              </w:rPr>
+              <w:t xml:space="preserve">MINUTES_5</w:t>
+            </w:r>
+            <w:r>
+              <w:rPr>
+                <w:rFonts w:ascii="Arial" w:cs="Arial" w:eastAsia="Arial" w:hAnsi="Arial"/>
+                <w:sz w:val="19"/>
+                <w:szCs w:val="19"/>
+              </w:rPr>
+              <w:t xml:space="preserve">, </w:t>
+            </w:r>
+            <w:r>
+              <w:rPr>
+                <w:rFonts w:ascii="Consolas" w:cs="Consolas" w:eastAsia="Consolas" w:hAnsi="Consolas"/>
+                <w:sz w:val="19"/>
+                <w:szCs w:val="19"/>
+              </w:rPr>
+              <w:t xml:space="preserve">HOURLY</w:t>
+            </w:r>
+            <w:r>
+              <w:rPr>
+                <w:rFonts w:ascii="Arial" w:cs="Arial" w:eastAsia="Arial" w:hAnsi="Arial"/>
+                <w:sz w:val="19"/>
+                <w:szCs w:val="19"/>
+              </w:rPr>
+              <w:t xml:space="preserve">, </w:t>
+            </w:r>
+            <w:r>
+              <w:rPr>
+                <w:rFonts w:ascii="Consolas" w:cs="Consolas" w:eastAsia="Consolas" w:hAnsi="Consolas"/>
+                <w:sz w:val="19"/>
+                <w:szCs w:val="19"/>
+              </w:rPr>
+              <w:t xml:space="preserve">DAILY</w:t>
+            </w:r>
+          </w:p>
+        </w:tc>
+        <w:tc>
+          <w:tcPr>
+            <w:tcW w:type="dxa" w:w="3740"/>
+            <w:tcMar>
+              <w:top w:type="dxa" w:w="60"/>
+              <w:left w:type="dxa" w:w="90"/>
+              <w:bottom w:type="dxa" w:w="60"/>
+              <w:right w:type="dxa" w:w="90"/>
+            </w:tcMar>
+          </w:tcPr>
+          <w:p>
+            <w:r>
+              <w:rPr>
+                <w:rFonts w:ascii="Arial" w:cs="Arial" w:eastAsia="Arial" w:hAnsi="Arial"/>
+                <w:sz w:val="19"/>
+                <w:szCs w:val="19"/>
+              </w:rPr>
+              <w:t xml:space="preserve">What the line under a report's title tells people: "live data", or "data as of the last quarter hour".</w:t>
+            </w:r>
+          </w:p>
+        </w:tc>
+      </w:tr>
+      <w:tr>
+        <w:tc>
+          <w:tcPr>
+            <w:tcW w:type="dxa" w:w="2600"/>
+            <w:tcMar>
+              <w:top w:type="dxa" w:w="60"/>
+              <w:left w:type="dxa" w:w="90"/>
+              <w:bottom w:type="dxa" w:w="60"/>
+              <w:right w:type="dxa" w:w="90"/>
+            </w:tcMar>
+          </w:tcPr>
+          <w:p>
+            <w:r>
+              <w:rPr>
+                <w:rFonts w:ascii="Arial" w:cs="Arial" w:eastAsia="Arial" w:hAnsi="Arial"/>
+                <w:sz w:val="19"/>
+                <w:szCs w:val="19"/>
+              </w:rPr>
+              <w:t xml:space="preserve">Query limits</w:t>
+            </w:r>
+          </w:p>
+        </w:tc>
+        <w:tc>
+          <w:tcPr>
+            <w:tcW w:type="dxa" w:w="3740"/>
+            <w:tcMar>
+              <w:top w:type="dxa" w:w="60"/>
+              <w:left w:type="dxa" w:w="90"/>
+              <w:bottom w:type="dxa" w:w="60"/>
+              <w:right w:type="dxa" w:w="90"/>
+            </w:tcMar>
+          </w:tcPr>
+          <w:p>
+            <w:r>
+              <w:rPr>
+                <w:rFonts w:ascii="Arial" w:cs="Arial" w:eastAsia="Arial" w:hAnsi="Arial"/>
+                <w:sz w:val="19"/>
+                <w:szCs w:val="19"/>
+              </w:rPr>
+              <w:t xml:space="preserve">JSON</w:t>
+            </w:r>
+          </w:p>
+        </w:tc>
+        <w:tc>
+          <w:tcPr>
+            <w:tcW w:type="dxa" w:w="3740"/>
+            <w:tcMar>
+              <w:top w:type="dxa" w:w="60"/>
+              <w:left w:type="dxa" w:w="90"/>
+              <w:bottom w:type="dxa" w:w="60"/>
+              <w:right w:type="dxa" w:w="90"/>
+            </w:tcMar>
+          </w:tcPr>
+          <w:p>
+            <w:r>
+              <w:rPr>
+                <w:rFonts w:ascii="Consolas" w:cs="Consolas" w:eastAsia="Consolas" w:hAnsi="Consolas"/>
+                <w:sz w:val="19"/>
+                <w:szCs w:val="19"/>
+              </w:rPr>
+              <w:t xml:space="preserve">statement_timeout_ms</w:t>
+            </w:r>
+            <w:r>
+              <w:rPr>
+                <w:rFonts w:ascii="Arial" w:cs="Arial" w:eastAsia="Arial" w:hAnsi="Arial"/>
+                <w:sz w:val="19"/>
+                <w:szCs w:val="19"/>
+              </w:rPr>
+              <w:t xml:space="preserve"> (15,000), </w:t>
+            </w:r>
+            <w:r>
+              <w:rPr>
+                <w:rFonts w:ascii="Consolas" w:cs="Consolas" w:eastAsia="Consolas" w:hAnsi="Consolas"/>
+                <w:sz w:val="19"/>
+                <w:szCs w:val="19"/>
+              </w:rPr>
+              <w:t xml:space="preserve">preview_rows</w:t>
+            </w:r>
+            <w:r>
+              <w:rPr>
+                <w:rFonts w:ascii="Arial" w:cs="Arial" w:eastAsia="Arial" w:hAnsi="Arial"/>
+                <w:sz w:val="19"/>
+                <w:szCs w:val="19"/>
+              </w:rPr>
+              <w:t xml:space="preserve"> (200), </w:t>
+            </w:r>
+            <w:r>
+              <w:rPr>
+                <w:rFonts w:ascii="Consolas" w:cs="Consolas" w:eastAsia="Consolas" w:hAnsi="Consolas"/>
+                <w:sz w:val="19"/>
+                <w:szCs w:val="19"/>
+              </w:rPr>
+              <w:t xml:space="preserve">run_rows</w:t>
+            </w:r>
+            <w:r>
+              <w:rPr>
+                <w:rFonts w:ascii="Arial" w:cs="Arial" w:eastAsia="Arial" w:hAnsi="Arial"/>
+                <w:sz w:val="19"/>
+                <w:szCs w:val="19"/>
+              </w:rPr>
+              <w:t xml:space="preserve"> (5,000), </w:t>
+            </w:r>
+            <w:r>
+              <w:rPr>
+                <w:rFonts w:ascii="Consolas" w:cs="Consolas" w:eastAsia="Consolas" w:hAnsi="Consolas"/>
+                <w:sz w:val="19"/>
+                <w:szCs w:val="19"/>
+              </w:rPr>
+              <w:t xml:space="preserve">export_rows</w:t>
+            </w:r>
+            <w:r>
+              <w:rPr>
+                <w:rFonts w:ascii="Arial" w:cs="Arial" w:eastAsia="Arial" w:hAnsi="Arial"/>
+                <w:sz w:val="19"/>
+                <w:szCs w:val="19"/>
+              </w:rPr>
+              <w:t xml:space="preserve"> (100,000), </w:t>
+            </w:r>
+            <w:r>
+              <w:rPr>
+                <w:rFonts w:ascii="Consolas" w:cs="Consolas" w:eastAsia="Consolas" w:hAnsi="Consolas"/>
+                <w:sz w:val="19"/>
+                <w:szCs w:val="19"/>
+              </w:rPr>
+              <w:t xml:space="preserve">concurrent</w:t>
+            </w:r>
+            <w:r>
+              <w:rPr>
+                <w:rFonts w:ascii="Arial" w:cs="Arial" w:eastAsia="Arial" w:hAnsi="Arial"/>
+                <w:sz w:val="19"/>
+                <w:szCs w:val="19"/>
+              </w:rPr>
+              <w:t xml:space="preserve"> (4). Empty means these defaults. Raise them for a workspace that needs more; the limits protect everyone else.</w:t>
+            </w:r>
+          </w:p>
+        </w:tc>
+      </w:tr>
+      <w:tr>
+        <w:tc>
+          <w:tcPr>
+            <w:tcW w:type="dxa" w:w="2600"/>
+            <w:tcMar>
+              <w:top w:type="dxa" w:w="60"/>
+              <w:left w:type="dxa" w:w="90"/>
+              <w:bottom w:type="dxa" w:w="60"/>
+              <w:right w:type="dxa" w:w="90"/>
+            </w:tcMar>
+          </w:tcPr>
+          <w:p>
+            <w:r>
+              <w:rPr>
+                <w:rFonts w:ascii="Arial" w:cs="Arial" w:eastAsia="Arial" w:hAnsi="Arial"/>
+                <w:sz w:val="19"/>
+                <w:szCs w:val="19"/>
+              </w:rPr>
+              <w:t xml:space="preserve">Connection profile</w:t>
+            </w:r>
+          </w:p>
+        </w:tc>
+        <w:tc>
+          <w:tcPr>
+            <w:tcW w:type="dxa" w:w="3740"/>
+            <w:tcMar>
+              <w:top w:type="dxa" w:w="60"/>
+              <w:left w:type="dxa" w:w="90"/>
+              <w:bottom w:type="dxa" w:w="60"/>
+              <w:right w:type="dxa" w:w="90"/>
+            </w:tcMar>
+          </w:tcPr>
+          <w:p>
+            <w:r>
+              <w:rPr>
+                <w:rFonts w:ascii="Arial" w:cs="Arial" w:eastAsia="Arial" w:hAnsi="Arial"/>
+                <w:sz w:val="19"/>
+                <w:szCs w:val="19"/>
+              </w:rPr>
+              <w:t xml:space="preserve">text</w:t>
+            </w:r>
+          </w:p>
+        </w:tc>
+        <w:tc>
+          <w:tcPr>
+            <w:tcW w:type="dxa" w:w="3740"/>
+            <w:tcMar>
+              <w:top w:type="dxa" w:w="60"/>
+              <w:left w:type="dxa" w:w="90"/>
+              <w:bottom w:type="dxa" w:w="60"/>
+              <w:right w:type="dxa" w:w="90"/>
+            </w:tcMar>
+          </w:tcPr>
+          <w:p>
+            <w:r>
+              <w:rPr>
+                <w:rFonts w:ascii="Arial" w:cs="Arial" w:eastAsia="Arial" w:hAnsi="Arial"/>
+                <w:sz w:val="19"/>
+                <w:szCs w:val="19"/>
+              </w:rPr>
+              <w:t xml:space="preserve">A label for operators. The connection itself is server configuration.</w:t>
+            </w:r>
+          </w:p>
+        </w:tc>
+      </w:tr>
+      <w:tr>
+        <w:tc>
+          <w:tcPr>
+            <w:tcW w:type="dxa" w:w="2600"/>
+            <w:tcMar>
+              <w:top w:type="dxa" w:w="60"/>
+              <w:left w:type="dxa" w:w="90"/>
+              <w:bottom w:type="dxa" w:w="60"/>
+              <w:right w:type="dxa" w:w="90"/>
+            </w:tcMar>
+          </w:tcPr>
+          <w:p>
+            <w:r>
+              <w:rPr>
+                <w:rFonts w:ascii="Arial" w:cs="Arial" w:eastAsia="Arial" w:hAnsi="Arial"/>
+                <w:sz w:val="19"/>
+                <w:szCs w:val="19"/>
+              </w:rPr>
+              <w:t xml:space="preserve">Last reconciled</w:t>
+            </w:r>
+          </w:p>
+        </w:tc>
+        <w:tc>
+          <w:tcPr>
+            <w:tcW w:type="dxa" w:w="3740"/>
+            <w:tcMar>
+              <w:top w:type="dxa" w:w="60"/>
+              <w:left w:type="dxa" w:w="90"/>
+              <w:bottom w:type="dxa" w:w="60"/>
+              <w:right w:type="dxa" w:w="90"/>
+            </w:tcMar>
+          </w:tcPr>
+          <w:p>
+            <w:r>
+              <w:rPr>
+                <w:rFonts w:ascii="Arial" w:cs="Arial" w:eastAsia="Arial" w:hAnsi="Arial"/>
+                <w:sz w:val="19"/>
+                <w:szCs w:val="19"/>
+              </w:rPr>
+              <w:t xml:space="preserve">time</w:t>
+            </w:r>
+          </w:p>
+        </w:tc>
+        <w:tc>
+          <w:tcPr>
+            <w:tcW w:type="dxa" w:w="3740"/>
+            <w:tcMar>
+              <w:top w:type="dxa" w:w="60"/>
+              <w:left w:type="dxa" w:w="90"/>
+              <w:bottom w:type="dxa" w:w="60"/>
+              <w:right w:type="dxa" w:w="90"/>
+            </w:tcMar>
+          </w:tcPr>
+          <w:p>
+            <w:r>
+              <w:rPr>
+                <w:rFonts w:ascii="Arial" w:cs="Arial" w:eastAsia="Arial" w:hAnsi="Arial"/>
+                <w:sz w:val="19"/>
+                <w:szCs w:val="19"/>
+              </w:rPr>
+              <w:t xml:space="preserve">Set by Reconcile.</w:t>
+            </w:r>
+          </w:p>
+        </w:tc>
+      </w:tr>
+    </w:tbl>
+    <w:p>
+      <w:pPr>
+        <w:spacing w:after="120"/>
+      </w:pPr>
+    </w:p>
+    <w:p>
+      <w:pPr>
+        <w:pStyle w:val="Heading3"/>
+        <w:spacing w:after="120" w:before="240"/>
+      </w:pPr>
+      <w:r>
+        <w:rPr>
+          <w:rFonts w:ascii="Arial" w:cs="Arial" w:eastAsia="Arial" w:hAnsi="Arial"/>
+        </w:rPr>
+        <w:t xml:space="preserve">What the server needs for ClickHouse</w:t>
+      </w:r>
+    </w:p>
+    <w:p>
+      <w:pPr>
+        <w:spacing w:after="120"/>
+      </w:pPr>
+      <w:r>
+        <w:rPr>
+          <w:rFonts w:ascii="Arial" w:cs="Arial" w:eastAsia="Arial" w:hAnsi="Arial"/>
+          <w:sz w:val="21"/>
+          <w:szCs w:val="21"/>
+        </w:rPr>
+        <w:t xml:space="preserve">Four lines in the backend's environment, set by whoever runs the server, never in the back-office: the URL of the ClickHouse HTTP interface, the user, the password and the database (</w:t>
+      </w:r>
+      <w:r>
+        <w:rPr>
+          <w:rFonts w:ascii="Consolas" w:cs="Consolas" w:eastAsia="Consolas" w:hAnsi="Consolas"/>
+          <w:sz w:val="21"/>
+          <w:szCs w:val="21"/>
+        </w:rPr>
+        <w:t xml:space="preserve">cep_reporting</w:t>
+      </w:r>
+      <w:r>
+        <w:rPr>
+          <w:rFonts w:ascii="Arial" w:cs="Arial" w:eastAsia="Arial" w:hAnsi="Arial"/>
+          <w:sz w:val="21"/>
+          <w:szCs w:val="21"/>
+        </w:rPr>
+        <w:t xml:space="preserve">). An empty URL means no ClickHouse: the buttons below say so and every workspace stays on PostgreSQL. The database patch that adds the ClickHouse sources to the catalogue (0053) must be applied. The operator's guide, with the checks to run from the server, is </w:t>
+      </w:r>
+      <w:r>
+        <w:rPr>
+          <w:rFonts w:ascii="Consolas" w:cs="Consolas" w:eastAsia="Consolas" w:hAnsi="Consolas"/>
+          <w:sz w:val="21"/>
+          <w:szCs w:val="21"/>
+        </w:rPr>
+        <w:t xml:space="preserve">docs/INSIGHTS_ENGINE_SWITCH.md</w:t>
+      </w:r>
+      <w:r>
+        <w:rPr>
+          <w:rFonts w:ascii="Arial" w:cs="Arial" w:eastAsia="Arial" w:hAnsi="Arial"/>
+          <w:sz w:val="21"/>
+          <w:szCs w:val="21"/>
+        </w:rPr>
+        <w:t xml:space="preserve">.</w:t>
+      </w:r>
+    </w:p>
+    <w:p>
+      <w:pPr>
+        <w:pStyle w:val="Heading3"/>
+        <w:spacing w:after="120" w:before="240"/>
+      </w:pPr>
+      <w:r>
+        <w:rPr>
+          <w:rFonts w:ascii="Arial" w:cs="Arial" w:eastAsia="Arial" w:hAnsi="Arial"/>
+        </w:rPr>
+        <w:t xml:space="preserve">Switching a workspace to ClickHouse</w:t>
+      </w:r>
+    </w:p>
+    <w:p>
+      <w:pPr>
+        <w:spacing w:after="120"/>
+      </w:pPr>
+      <w:r>
+        <w:rPr>
+          <w:rFonts w:ascii="Arial" w:cs="Arial" w:eastAsia="Arial" w:hAnsi="Arial"/>
+          <w:sz w:val="21"/>
+          <w:szCs w:val="21"/>
+        </w:rPr>
+        <w:t xml:space="preserve">Open the workspace's row and use the buttons at the top of the page, in this order.</w:t>
+      </w:r>
+    </w:p>
+    <w:p>
+      <w:pPr>
+        <w:pStyle w:val="ListParagraph"/>
+        <w:numPr>
+          <w:ilvl w:val="0"/>
+          <w:numId w:val="3"/>
+        </w:numPr>
+        <w:spacing w:after="60"/>
+      </w:pPr>
+      <w:r>
+        <w:rPr>
+          <w:rFonts w:ascii="Arial" w:cs="Arial" w:eastAsia="Arial" w:hAnsi="Arial"/>
+          <w:b/>
+          <w:bCs/>
+          <w:sz w:val="21"/>
+          <w:szCs w:val="21"/>
+        </w:rPr>
+        <w:t xml:space="preserve">Backfill ClickHouse.</w:t>
+      </w:r>
+      <w:r>
+        <w:rPr>
+          <w:rFonts w:ascii="Arial" w:cs="Arial" w:eastAsia="Arial" w:hAnsi="Arial"/>
+          <w:sz w:val="21"/>
+          <w:szCs w:val="21"/>
+        </w:rPr>
+        <w:t xml:space="preserve"> Creates the ClickHouse database and tables if they are missing, copies every row of the workspace's datasets from the PostgreSQL views, and sets the row to </w:t>
+      </w:r>
+      <w:r>
+        <w:rPr>
+          <w:rFonts w:ascii="Consolas" w:cs="Consolas" w:eastAsia="Consolas" w:hAnsi="Consolas"/>
+          <w:sz w:val="21"/>
+          <w:szCs w:val="21"/>
+        </w:rPr>
+        <w:t xml:space="preserve">clickhouse</w:t>
+      </w:r>
+      <w:r>
+        <w:rPr>
+          <w:rFonts w:ascii="Arial" w:cs="Arial" w:eastAsia="Arial" w:hAnsi="Arial"/>
+          <w:sz w:val="21"/>
+          <w:szCs w:val="21"/>
+        </w:rPr>
+        <w:t xml:space="preserve"> + </w:t>
+      </w:r>
+      <w:r>
+        <w:rPr>
+          <w:rFonts w:ascii="Consolas" w:cs="Consolas" w:eastAsia="Consolas" w:hAnsi="Consolas"/>
+          <w:sz w:val="21"/>
+          <w:szCs w:val="21"/>
+        </w:rPr>
+        <w:t xml:space="preserve">MIGRATING</w:t>
+      </w:r>
+      <w:r>
+        <w:rPr>
+          <w:rFonts w:ascii="Arial" w:cs="Arial" w:eastAsia="Arial" w:hAnsi="Arial"/>
+          <w:sz w:val="21"/>
+          <w:szCs w:val="21"/>
+        </w:rPr>
+        <w:t xml:space="preserve">. The message says how many rows went per dataset. Reports keep running on PostgreSQL. A large workspace takes a few minutes; the page waits.</w:t>
+      </w:r>
+    </w:p>
+    <w:p>
+      <w:pPr>
+        <w:pStyle w:val="ListParagraph"/>
+        <w:numPr>
+          <w:ilvl w:val="0"/>
+          <w:numId w:val="3"/>
+        </w:numPr>
+        <w:spacing w:after="60"/>
+      </w:pPr>
+      <w:r>
+        <w:rPr>
+          <w:rFonts w:ascii="Arial" w:cs="Arial" w:eastAsia="Arial" w:hAnsi="Arial"/>
+          <w:b/>
+          <w:bCs/>
+          <w:sz w:val="21"/>
+          <w:szCs w:val="21"/>
+        </w:rPr>
+        <w:t xml:space="preserve">Reconcile.</w:t>
+      </w:r>
+      <w:r>
+        <w:rPr>
+          <w:rFonts w:ascii="Arial" w:cs="Arial" w:eastAsia="Arial" w:hAnsi="Arial"/>
+          <w:sz w:val="21"/>
+          <w:szCs w:val="21"/>
+        </w:rPr>
+        <w:t xml:space="preserve"> Counts every dataset on both engines and shows them side by side; sets Last reconciled. Green when they agree, amber with the differences when they do not. A difference right after a backfill means rows changed in between: run Backfill again. Rows loaded twice replace themselves.</w:t>
+      </w:r>
+    </w:p>
+    <w:p>
+      <w:pPr>
+        <w:pStyle w:val="ListParagraph"/>
+        <w:numPr>
+          <w:ilvl w:val="0"/>
+          <w:numId w:val="3"/>
+        </w:numPr>
+        <w:spacing w:after="60"/>
+      </w:pPr>
+      <w:r>
+        <w:rPr>
+          <w:rFonts w:ascii="Arial" w:cs="Arial" w:eastAsia="Arial" w:hAnsi="Arial"/>
+          <w:b/>
+          <w:bCs/>
+          <w:sz w:val="21"/>
+          <w:szCs w:val="21"/>
+        </w:rPr>
+        <w:t xml:space="preserve">Activate ClickHouse.</w:t>
+      </w:r>
+      <w:r>
+        <w:rPr>
+          <w:rFonts w:ascii="Arial" w:cs="Arial" w:eastAsia="Arial" w:hAnsi="Arial"/>
+          <w:sz w:val="21"/>
+          <w:szCs w:val="21"/>
+        </w:rPr>
+        <w:t xml:space="preserve"> Sets </w:t>
+      </w:r>
+      <w:r>
+        <w:rPr>
+          <w:rFonts w:ascii="Consolas" w:cs="Consolas" w:eastAsia="Consolas" w:hAnsi="Consolas"/>
+          <w:sz w:val="21"/>
+          <w:szCs w:val="21"/>
+        </w:rPr>
+        <w:t xml:space="preserve">ACTIVE</w:t>
+      </w:r>
+      <w:r>
+        <w:rPr>
+          <w:rFonts w:ascii="Arial" w:cs="Arial" w:eastAsia="Arial" w:hAnsi="Arial"/>
+          <w:sz w:val="21"/>
+          <w:szCs w:val="21"/>
+        </w:rPr>
+        <w:t xml:space="preserve"> and the freshness to a quarter hour. From the next request the workspace's reports, dashboards, exports and scheduled deliveries read ClickHouse. People see the same pages and the same figures; the line under a report's title now says "data as of the last quarter hour".</w:t>
+      </w:r>
+    </w:p>
+    <w:p>
+      <w:pPr>
+        <w:spacing w:after="120"/>
+      </w:pPr>
+      <w:r>
+        <w:rPr>
+          <w:rFonts w:ascii="Arial" w:cs="Arial" w:eastAsia="Arial" w:hAnsi="Arial"/>
+          <w:sz w:val="21"/>
+          <w:szCs w:val="21"/>
+        </w:rPr>
+        <w:t xml:space="preserve">From then on the job </w:t>
+      </w:r>
+      <w:r>
+        <w:rPr>
+          <w:rFonts w:ascii="Arial" w:cs="Arial" w:eastAsia="Arial" w:hAnsi="Arial"/>
+          <w:b/>
+          <w:bCs/>
+          <w:sz w:val="21"/>
+          <w:szCs w:val="21"/>
+        </w:rPr>
+        <w:t xml:space="preserve">refresh-clickhouse-reporting</w:t>
+      </w:r>
+      <w:r>
+        <w:rPr>
+          <w:rFonts w:ascii="Arial" w:cs="Arial" w:eastAsia="Arial" w:hAnsi="Arial"/>
+          <w:sz w:val="21"/>
+          <w:szCs w:val="21"/>
+        </w:rPr>
+        <w:t xml:space="preserve"> (every 15 minutes; see Jobs, Alerts and System Checks) reloads the last seven days of messages, orders and enrolments, and the whole of contacts, for every workspace whose engine is ClickHouse. Reconcile can be run again at any time.</w:t>
+      </w:r>
+    </w:p>
+    <w:p>
+      <w:pPr>
+        <w:pStyle w:val="Heading3"/>
+        <w:spacing w:after="120" w:before="240"/>
+      </w:pPr>
+      <w:r>
+        <w:rPr>
+          <w:rFonts w:ascii="Arial" w:cs="Arial" w:eastAsia="Arial" w:hAnsi="Arial"/>
+        </w:rPr>
+        <w:t xml:space="preserve">Rolling back</w:t>
+      </w:r>
+    </w:p>
+    <w:p>
+      <w:pPr>
+        <w:spacing w:after="120"/>
+      </w:pPr>
+      <w:r>
+        <w:rPr>
+          <w:rFonts w:ascii="Arial" w:cs="Arial" w:eastAsia="Arial" w:hAnsi="Arial"/>
+          <w:b/>
+          <w:bCs/>
+          <w:sz w:val="21"/>
+          <w:szCs w:val="21"/>
+        </w:rPr>
+        <w:t xml:space="preserve">Roll Back to PostgreSQL</w:t>
+      </w:r>
+      <w:r>
+        <w:rPr>
+          <w:rFonts w:ascii="Arial" w:cs="Arial" w:eastAsia="Arial" w:hAnsi="Arial"/>
+          <w:sz w:val="21"/>
+          <w:szCs w:val="21"/>
+        </w:rPr>
+        <w:t xml:space="preserve"> sets </w:t>
+      </w:r>
+      <w:r>
+        <w:rPr>
+          <w:rFonts w:ascii="Consolas" w:cs="Consolas" w:eastAsia="Consolas" w:hAnsi="Consolas"/>
+          <w:sz w:val="21"/>
+          <w:szCs w:val="21"/>
+        </w:rPr>
+        <w:t xml:space="preserve">postgresql</w:t>
+      </w:r>
+      <w:r>
+        <w:rPr>
+          <w:rFonts w:ascii="Arial" w:cs="Arial" w:eastAsia="Arial" w:hAnsi="Arial"/>
+          <w:sz w:val="21"/>
+          <w:szCs w:val="21"/>
+        </w:rPr>
+        <w:t xml:space="preserve"> + </w:t>
+      </w:r>
+      <w:r>
+        <w:rPr>
+          <w:rFonts w:ascii="Consolas" w:cs="Consolas" w:eastAsia="Consolas" w:hAnsi="Consolas"/>
+          <w:sz w:val="21"/>
+          <w:szCs w:val="21"/>
+        </w:rPr>
+        <w:t xml:space="preserve">ACTIVE</w:t>
+      </w:r>
+      <w:r>
+        <w:rPr>
+          <w:rFonts w:ascii="Arial" w:cs="Arial" w:eastAsia="Arial" w:hAnsi="Arial"/>
+          <w:sz w:val="21"/>
+          <w:szCs w:val="21"/>
+        </w:rPr>
+        <w:t xml:space="preserve"> + </w:t>
+      </w:r>
+      <w:r>
+        <w:rPr>
+          <w:rFonts w:ascii="Consolas" w:cs="Consolas" w:eastAsia="Consolas" w:hAnsi="Consolas"/>
+          <w:sz w:val="21"/>
+          <w:szCs w:val="21"/>
+        </w:rPr>
+        <w:t xml:space="preserve">LIVE</w:t>
+      </w:r>
+      <w:r>
+        <w:rPr>
+          <w:rFonts w:ascii="Arial" w:cs="Arial" w:eastAsia="Arial" w:hAnsi="Arial"/>
+          <w:sz w:val="21"/>
+          <w:szCs w:val="21"/>
+        </w:rPr>
+        <w:t xml:space="preserve">. From the next request the workspace reads the live views again. The ClickHouse tables keep their rows, so a later switch is Backfill, Reconcile, Activate once more.</w:t>
+      </w:r>
+    </w:p>
+    <w:p>
+      <w:pPr>
+        <w:pStyle w:val="Heading3"/>
+        <w:spacing w:after="120" w:before="240"/>
+      </w:pPr>
+      <w:r>
+        <w:rPr>
+          <w:rFonts w:ascii="Arial" w:cs="Arial" w:eastAsia="Arial" w:hAnsi="Arial"/>
+        </w:rPr>
+        <w:t xml:space="preserve">What to know about the ClickHouse engine today</w:t>
+      </w:r>
+    </w:p>
+    <w:p>
+      <w:pPr>
+        <w:pStyle w:val="ListParagraph"/>
+        <w:numPr>
+          <w:ilvl w:val="0"/>
+          <w:numId w:val="2"/>
+        </w:numPr>
+        <w:spacing w:after="60"/>
+      </w:pPr>
+      <w:r>
+        <w:rPr>
+          <w:rFonts w:ascii="Arial" w:cs="Arial" w:eastAsia="Arial" w:hAnsi="Arial"/>
+          <w:sz w:val="21"/>
+          <w:szCs w:val="21"/>
+        </w:rPr>
+        <w:t xml:space="preserve">Rows deleted in PostgreSQL stay in ClickHouse until the next Backfill.</w:t>
+      </w:r>
+    </w:p>
+    <w:p>
+      <w:pPr>
+        <w:pStyle w:val="ListParagraph"/>
+        <w:numPr>
+          <w:ilvl w:val="0"/>
+          <w:numId w:val="2"/>
+        </w:numPr>
+        <w:spacing w:after="60"/>
+      </w:pPr>
+      <w:r>
+        <w:rPr>
+          <w:rFonts w:ascii="Arial" w:cs="Arial" w:eastAsia="Arial" w:hAnsi="Arial"/>
+          <w:sz w:val="21"/>
+          <w:szCs w:val="21"/>
+        </w:rPr>
+        <w:t xml:space="preserve">A change to a row older than seven days (a message delivered late, an order re-attributed) reaches ClickHouse at the next Backfill, not at the quarter-hour refresh. After a bulk correction, run Backfill.</w:t>
+      </w:r>
+    </w:p>
+    <w:p>
+      <w:pPr>
+        <w:pStyle w:val="ListParagraph"/>
+        <w:numPr>
+          <w:ilvl w:val="0"/>
+          <w:numId w:val="2"/>
+        </w:numPr>
+        <w:spacing w:after="60"/>
+      </w:pPr>
+      <w:r>
+        <w:rPr>
+          <w:rFonts w:ascii="Arial" w:cs="Arial" w:eastAsia="Arial" w:hAnsi="Arial"/>
+          <w:sz w:val="21"/>
+          <w:szCs w:val="21"/>
+        </w:rPr>
+        <w:t xml:space="preserve">One ClickHouse database holds every workspace's rows, kept apart by the workspace column on every query.</w:t>
+      </w:r>
+    </w:p>
+    <w:p>
+      <w:pPr>
+        <w:pStyle w:val="Heading2"/>
+        <w:spacing w:after="120" w:before="240"/>
+      </w:pPr>
+      <w:r>
+        <w:rPr>
+          <w:rFonts w:ascii="Arial" w:cs="Arial" w:eastAsia="Arial" w:hAnsi="Arial"/>
+        </w:rPr>
+        <w:t xml:space="preserve">When something goes wrong</w:t>
+      </w:r>
+    </w:p>
+    <w:tbl>
+      <w:tblPr>
+        <w:tblW w:type="dxa" w:w="10080"/>
+        <w:tblBorders>
+          <w:top w:val="single" w:color="D9DBE3" w:sz="4"/>
+          <w:left w:val="none"/>
+          <w:bottom w:val="single" w:color="D9DBE3" w:sz="4"/>
+          <w:right w:val="none"/>
+          <w:insideH w:val="single" w:color="E6E8EF" w:sz="4"/>
+          <w:insideV w:val="none"/>
+        </w:tblBorders>
+      </w:tblPr>
+      <w:tblGrid>
+        <w:gridCol w:w="2600"/>
+        <w:gridCol w:w="3740"/>
+        <w:gridCol w:w="3740"/>
+      </w:tblGrid>
+      <w:tr>
+        <w:trPr>
+          <w:tblHeader/>
+        </w:trPr>
+        <w:tc>
+          <w:tcPr>
+            <w:tcW w:type="dxa" w:w="2600"/>
+            <w:shd w:fill="EEEFF5" w:color="auto" w:val="clear"/>
+            <w:tcMar>
+              <w:top w:type="dxa" w:w="60"/>
+              <w:left w:type="dxa" w:w="90"/>
+              <w:bottom w:type="dxa" w:w="60"/>
+              <w:right w:type="dxa" w:w="90"/>
+            </w:tcMar>
+          </w:tcPr>
+          <w:p>
+            <w:r>
+              <w:rPr>
+                <w:rFonts w:ascii="Arial" w:cs="Arial" w:eastAsia="Arial" w:hAnsi="Arial"/>
+                <w:b/>
+                <w:bCs/>
+                <w:sz w:val="18"/>
+                <w:szCs w:val="18"/>
+              </w:rPr>
+              <w:t xml:space="preserve">What people see</w:t>
+            </w:r>
+          </w:p>
+        </w:tc>
+        <w:tc>
+          <w:tcPr>
+            <w:tcW w:type="dxa" w:w="3740"/>
+            <w:shd w:fill="EEEFF5" w:color="auto" w:val="clear"/>
+            <w:tcMar>
+              <w:top w:type="dxa" w:w="60"/>
+              <w:left w:type="dxa" w:w="90"/>
+              <w:bottom w:type="dxa" w:w="60"/>
+              <w:right w:type="dxa" w:w="90"/>
+            </w:tcMar>
+          </w:tcPr>
+          <w:p>
+            <w:r>
+              <w:rPr>
+                <w:rFonts w:ascii="Arial" w:cs="Arial" w:eastAsia="Arial" w:hAnsi="Arial"/>
+                <w:b/>
+                <w:bCs/>
+                <w:sz w:val="18"/>
+                <w:szCs w:val="18"/>
+              </w:rPr>
+              <w:t xml:space="preserve">Where to look</w:t>
+            </w:r>
+          </w:p>
+        </w:tc>
+        <w:tc>
+          <w:tcPr>
+            <w:tcW w:type="dxa" w:w="3740"/>
+            <w:shd w:fill="EEEFF5" w:color="auto" w:val="clear"/>
+            <w:tcMar>
+              <w:top w:type="dxa" w:w="60"/>
+              <w:left w:type="dxa" w:w="90"/>
+              <w:bottom w:type="dxa" w:w="60"/>
+              <w:right w:type="dxa" w:w="90"/>
+            </w:tcMar>
+          </w:tcPr>
+          <w:p>
+            <w:r>
+              <w:rPr>
+                <w:rFonts w:ascii="Arial" w:cs="Arial" w:eastAsia="Arial" w:hAnsi="Arial"/>
+                <w:b/>
+                <w:bCs/>
+                <w:sz w:val="18"/>
+                <w:szCs w:val="18"/>
+              </w:rPr>
+              <w:t xml:space="preserve">What it usually is</w:t>
+            </w:r>
+          </w:p>
+        </w:tc>
+      </w:tr>
+      <w:tr>
+        <w:tc>
+          <w:tcPr>
+            <w:tcW w:type="dxa" w:w="2600"/>
+            <w:tcMar>
+              <w:top w:type="dxa" w:w="60"/>
+              <w:left w:type="dxa" w:w="90"/>
+              <w:bottom w:type="dxa" w:w="60"/>
+              <w:right w:type="dxa" w:w="90"/>
+            </w:tcMar>
+          </w:tcPr>
+          <w:p>
+            <w:r>
+              <w:rPr>
+                <w:rFonts w:ascii="Arial" w:cs="Arial" w:eastAsia="Arial" w:hAnsi="Arial"/>
+                <w:sz w:val="19"/>
+                <w:szCs w:val="19"/>
+              </w:rPr>
+              <w:t xml:space="preserve">"The report took longer than 15 seconds and was stopped"</w:t>
+            </w:r>
+          </w:p>
+        </w:tc>
+        <w:tc>
+          <w:tcPr>
+            <w:tcW w:type="dxa" w:w="3740"/>
+            <w:tcMar>
+              <w:top w:type="dxa" w:w="60"/>
+              <w:left w:type="dxa" w:w="90"/>
+              <w:bottom w:type="dxa" w:w="60"/>
+              <w:right w:type="dxa" w:w="90"/>
+            </w:tcMar>
+          </w:tcPr>
+          <w:p>
+            <w:r>
+              <w:rPr>
+                <w:rFonts w:ascii="Arial" w:cs="Arial" w:eastAsia="Arial" w:hAnsi="Arial"/>
+                <w:sz w:val="19"/>
+                <w:szCs w:val="19"/>
+              </w:rPr>
+              <w:t xml:space="preserve">Run Log, outcome Timed Out</w:t>
+            </w:r>
+          </w:p>
+        </w:tc>
+        <w:tc>
+          <w:tcPr>
+            <w:tcW w:type="dxa" w:w="3740"/>
+            <w:tcMar>
+              <w:top w:type="dxa" w:w="60"/>
+              <w:left w:type="dxa" w:w="90"/>
+              <w:bottom w:type="dxa" w:w="60"/>
+              <w:right w:type="dxa" w:w="90"/>
+            </w:tcMar>
+          </w:tcPr>
+          <w:p>
+            <w:r>
+              <w:rPr>
+                <w:rFonts w:ascii="Arial" w:cs="Arial" w:eastAsia="Arial" w:hAnsi="Arial"/>
+                <w:sz w:val="19"/>
+                <w:szCs w:val="19"/>
+              </w:rPr>
+              <w:t xml:space="preserve">A report over a large dataset without a filter. Suggest a period or a filter; raise </w:t>
+            </w:r>
+            <w:r>
+              <w:rPr>
+                <w:rFonts w:ascii="Consolas" w:cs="Consolas" w:eastAsia="Consolas" w:hAnsi="Consolas"/>
+                <w:sz w:val="19"/>
+                <w:szCs w:val="19"/>
+              </w:rPr>
+              <w:t xml:space="preserve">statement_timeout_ms</w:t>
+            </w:r>
+            <w:r>
+              <w:rPr>
+                <w:rFonts w:ascii="Arial" w:cs="Arial" w:eastAsia="Arial" w:hAnsi="Arial"/>
+                <w:sz w:val="19"/>
+                <w:szCs w:val="19"/>
+              </w:rPr>
+              <w:t xml:space="preserve"> only for that workspace if it is legitimate.</w:t>
+            </w:r>
+          </w:p>
+        </w:tc>
+      </w:tr>
+      <w:tr>
+        <w:tc>
+          <w:tcPr>
+            <w:tcW w:type="dxa" w:w="2600"/>
+            <w:tcMar>
+              <w:top w:type="dxa" w:w="60"/>
+              <w:left w:type="dxa" w:w="90"/>
+              <w:bottom w:type="dxa" w:w="60"/>
+              <w:right w:type="dxa" w:w="90"/>
+            </w:tcMar>
+          </w:tcPr>
+          <w:p>
+            <w:r>
+              <w:rPr>
+                <w:rFonts w:ascii="Arial" w:cs="Arial" w:eastAsia="Arial" w:hAnsi="Arial"/>
+                <w:sz w:val="19"/>
+                <w:szCs w:val="19"/>
+              </w:rPr>
+              <w:t xml:space="preserve">"This workspace's reports are moving to a new engine"</w:t>
+            </w:r>
+          </w:p>
+        </w:tc>
+        <w:tc>
+          <w:tcPr>
+            <w:tcW w:type="dxa" w:w="3740"/>
+            <w:tcMar>
+              <w:top w:type="dxa" w:w="60"/>
+              <w:left w:type="dxa" w:w="90"/>
+              <w:bottom w:type="dxa" w:w="60"/>
+              <w:right w:type="dxa" w:w="90"/>
+            </w:tcMar>
+          </w:tcPr>
+          <w:p>
+            <w:r>
+              <w:rPr>
+                <w:rFonts w:ascii="Arial" w:cs="Arial" w:eastAsia="Arial" w:hAnsi="Arial"/>
+                <w:sz w:val="19"/>
+                <w:szCs w:val="19"/>
+              </w:rPr>
+              <w:t xml:space="preserve">Report Engines, status</w:t>
+            </w:r>
+          </w:p>
+        </w:tc>
+        <w:tc>
+          <w:tcPr>
+            <w:tcW w:type="dxa" w:w="3740"/>
+            <w:tcMar>
+              <w:top w:type="dxa" w:w="60"/>
+              <w:left w:type="dxa" w:w="90"/>
+              <w:bottom w:type="dxa" w:w="60"/>
+              <w:right w:type="dxa" w:w="90"/>
+            </w:tcMar>
+          </w:tcPr>
+          <w:p>
+            <w:r>
+              <w:rPr>
+                <w:rFonts w:ascii="Arial" w:cs="Arial" w:eastAsia="Arial" w:hAnsi="Arial"/>
+                <w:sz w:val="19"/>
+                <w:szCs w:val="19"/>
+              </w:rPr>
+              <w:t xml:space="preserve">The row is </w:t>
+            </w:r>
+            <w:r>
+              <w:rPr>
+                <w:rFonts w:ascii="Consolas" w:cs="Consolas" w:eastAsia="Consolas" w:hAnsi="Consolas"/>
+                <w:sz w:val="19"/>
+                <w:szCs w:val="19"/>
+              </w:rPr>
+              <w:t xml:space="preserve">MIGRATING</w:t>
+            </w:r>
+            <w:r>
+              <w:rPr>
+                <w:rFonts w:ascii="Arial" w:cs="Arial" w:eastAsia="Arial" w:hAnsi="Arial"/>
+                <w:sz w:val="19"/>
+                <w:szCs w:val="19"/>
+              </w:rPr>
+              <w:t xml:space="preserve"> on an engine that is not yet active. Finish the switch or roll back.</w:t>
+            </w:r>
+          </w:p>
+        </w:tc>
+      </w:tr>
+      <w:tr>
+        <w:tc>
+          <w:tcPr>
+            <w:tcW w:type="dxa" w:w="2600"/>
+            <w:tcMar>
+              <w:top w:type="dxa" w:w="60"/>
+              <w:left w:type="dxa" w:w="90"/>
+              <w:bottom w:type="dxa" w:w="60"/>
+              <w:right w:type="dxa" w:w="90"/>
+            </w:tcMar>
+          </w:tcPr>
+          <w:p>
+            <w:r>
+              <w:rPr>
+                <w:rFonts w:ascii="Arial" w:cs="Arial" w:eastAsia="Arial" w:hAnsi="Arial"/>
+                <w:sz w:val="19"/>
+                <w:szCs w:val="19"/>
+              </w:rPr>
+              <w:t xml:space="preserve">"Insights is not part of this workspace"</w:t>
+            </w:r>
+          </w:p>
+        </w:tc>
+        <w:tc>
+          <w:tcPr>
+            <w:tcW w:type="dxa" w:w="3740"/>
+            <w:tcMar>
+              <w:top w:type="dxa" w:w="60"/>
+              <w:left w:type="dxa" w:w="90"/>
+              <w:bottom w:type="dxa" w:w="60"/>
+              <w:right w:type="dxa" w:w="90"/>
+            </w:tcMar>
+          </w:tcPr>
+          <w:p>
+            <w:r>
+              <w:rPr>
+                <w:rFonts w:ascii="Arial" w:cs="Arial" w:eastAsia="Arial" w:hAnsi="Arial"/>
+                <w:sz w:val="19"/>
+                <w:szCs w:val="19"/>
+              </w:rPr>
+              <w:t xml:space="preserve">Tenant → Components</w:t>
+            </w:r>
+          </w:p>
+        </w:tc>
+        <w:tc>
+          <w:tcPr>
+            <w:tcW w:type="dxa" w:w="3740"/>
+            <w:tcMar>
+              <w:top w:type="dxa" w:w="60"/>
+              <w:left w:type="dxa" w:w="90"/>
+              <w:bottom w:type="dxa" w:w="60"/>
+              <w:right w:type="dxa" w:w="90"/>
+            </w:tcMar>
+          </w:tcPr>
+          <w:p>
+            <w:r>
+              <w:rPr>
+                <w:rFonts w:ascii="Arial" w:cs="Arial" w:eastAsia="Arial" w:hAnsi="Arial"/>
+                <w:sz w:val="19"/>
+                <w:szCs w:val="19"/>
+              </w:rPr>
+              <w:t xml:space="preserve">The Insights component is not on for the workspace or its plan.</w:t>
+            </w:r>
+          </w:p>
+        </w:tc>
+      </w:tr>
+      <w:tr>
+        <w:tc>
+          <w:tcPr>
+            <w:tcW w:type="dxa" w:w="2600"/>
+            <w:tcMar>
+              <w:top w:type="dxa" w:w="60"/>
+              <w:left w:type="dxa" w:w="90"/>
+              <w:bottom w:type="dxa" w:w="60"/>
+              <w:right w:type="dxa" w:w="90"/>
+            </w:tcMar>
+          </w:tcPr>
+          <w:p>
+            <w:r>
+              <w:rPr>
+                <w:rFonts w:ascii="Arial" w:cs="Arial" w:eastAsia="Arial" w:hAnsi="Arial"/>
+                <w:sz w:val="19"/>
+                <w:szCs w:val="19"/>
+              </w:rPr>
+              <w:t xml:space="preserve">A dataset missing from New Report</w:t>
+            </w:r>
+          </w:p>
+        </w:tc>
+        <w:tc>
+          <w:tcPr>
+            <w:tcW w:type="dxa" w:w="3740"/>
+            <w:tcMar>
+              <w:top w:type="dxa" w:w="60"/>
+              <w:left w:type="dxa" w:w="90"/>
+              <w:bottom w:type="dxa" w:w="60"/>
+              <w:right w:type="dxa" w:w="90"/>
+            </w:tcMar>
+          </w:tcPr>
+          <w:p>
+            <w:r>
+              <w:rPr>
+                <w:rFonts w:ascii="Arial" w:cs="Arial" w:eastAsia="Arial" w:hAnsi="Arial"/>
+                <w:sz w:val="19"/>
+                <w:szCs w:val="19"/>
+              </w:rPr>
+              <w:t xml:space="preserve">Report Datasets → Sources</w:t>
+            </w:r>
+          </w:p>
+        </w:tc>
+        <w:tc>
+          <w:tcPr>
+            <w:tcW w:type="dxa" w:w="3740"/>
+            <w:tcMar>
+              <w:top w:type="dxa" w:w="60"/>
+              <w:left w:type="dxa" w:w="90"/>
+              <w:bottom w:type="dxa" w:w="60"/>
+              <w:right w:type="dxa" w:w="90"/>
+            </w:tcMar>
+          </w:tcPr>
+          <w:p>
+            <w:r>
+              <w:rPr>
+                <w:rFonts w:ascii="Arial" w:cs="Arial" w:eastAsia="Arial" w:hAnsi="Arial"/>
+                <w:sz w:val="19"/>
+                <w:szCs w:val="19"/>
+              </w:rPr>
+              <w:t xml:space="preserve">No ACTIVE source for the workspace's engine.</w:t>
+            </w:r>
+          </w:p>
+        </w:tc>
+      </w:tr>
+      <w:tr>
+        <w:tc>
+          <w:tcPr>
+            <w:tcW w:type="dxa" w:w="2600"/>
+            <w:tcMar>
+              <w:top w:type="dxa" w:w="60"/>
+              <w:left w:type="dxa" w:w="90"/>
+              <w:bottom w:type="dxa" w:w="60"/>
+              <w:right w:type="dxa" w:w="90"/>
+            </w:tcMar>
+          </w:tcPr>
+          <w:p>
+            <w:r>
+              <w:rPr>
+                <w:rFonts w:ascii="Arial" w:cs="Arial" w:eastAsia="Arial" w:hAnsi="Arial"/>
+                <w:sz w:val="19"/>
+                <w:szCs w:val="19"/>
+              </w:rPr>
+              <w:t xml:space="preserve">A PII field missing for someone</w:t>
+            </w:r>
+          </w:p>
+        </w:tc>
+        <w:tc>
+          <w:tcPr>
+            <w:tcW w:type="dxa" w:w="3740"/>
+            <w:tcMar>
+              <w:top w:type="dxa" w:w="60"/>
+              <w:left w:type="dxa" w:w="90"/>
+              <w:bottom w:type="dxa" w:w="60"/>
+              <w:right w:type="dxa" w:w="90"/>
+            </w:tcMar>
+          </w:tcPr>
+          <w:p>
+            <w:r>
+              <w:rPr>
+                <w:rFonts w:ascii="Arial" w:cs="Arial" w:eastAsia="Arial" w:hAnsi="Arial"/>
+                <w:sz w:val="19"/>
+                <w:szCs w:val="19"/>
+              </w:rPr>
+              <w:t xml:space="preserve">People and Access</w:t>
+            </w:r>
+          </w:p>
+        </w:tc>
+        <w:tc>
+          <w:tcPr>
+            <w:tcW w:type="dxa" w:w="3740"/>
+            <w:tcMar>
+              <w:top w:type="dxa" w:w="60"/>
+              <w:left w:type="dxa" w:w="90"/>
+              <w:bottom w:type="dxa" w:w="60"/>
+              <w:right w:type="dxa" w:w="90"/>
+            </w:tcMar>
+          </w:tcPr>
+          <w:p>
+            <w:r>
+              <w:rPr>
+                <w:rFonts w:ascii="Arial" w:cs="Arial" w:eastAsia="Arial" w:hAnsi="Arial"/>
+                <w:sz w:val="19"/>
+                <w:szCs w:val="19"/>
+              </w:rPr>
+              <w:t xml:space="preserve">They lack Report Admin or User Admin; that is by design.</w:t>
+            </w:r>
+          </w:p>
+        </w:tc>
+      </w:tr>
+      <w:tr>
+        <w:tc>
+          <w:tcPr>
+            <w:tcW w:type="dxa" w:w="2600"/>
+            <w:tcMar>
+              <w:top w:type="dxa" w:w="60"/>
+              <w:left w:type="dxa" w:w="90"/>
+              <w:bottom w:type="dxa" w:w="60"/>
+              <w:right w:type="dxa" w:w="90"/>
+            </w:tcMar>
+          </w:tcPr>
+          <w:p>
+            <w:r>
+              <w:rPr>
+                <w:rFonts w:ascii="Arial" w:cs="Arial" w:eastAsia="Arial" w:hAnsi="Arial"/>
+                <w:sz w:val="19"/>
+                <w:szCs w:val="19"/>
+              </w:rPr>
+              <w:t xml:space="preserve">A figure differs between engines</w:t>
+            </w:r>
+          </w:p>
+        </w:tc>
+        <w:tc>
+          <w:tcPr>
+            <w:tcW w:type="dxa" w:w="3740"/>
+            <w:tcMar>
+              <w:top w:type="dxa" w:w="60"/>
+              <w:left w:type="dxa" w:w="90"/>
+              <w:bottom w:type="dxa" w:w="60"/>
+              <w:right w:type="dxa" w:w="90"/>
+            </w:tcMar>
+          </w:tcPr>
+          <w:p>
+            <w:r>
+              <w:rPr>
+                <w:rFonts w:ascii="Arial" w:cs="Arial" w:eastAsia="Arial" w:hAnsi="Arial"/>
+                <w:sz w:val="19"/>
+                <w:szCs w:val="19"/>
+              </w:rPr>
+              <w:t xml:space="preserve">Report Engines → Reconcile</w:t>
+            </w:r>
+          </w:p>
+        </w:tc>
+        <w:tc>
+          <w:tcPr>
+            <w:tcW w:type="dxa" w:w="3740"/>
+            <w:tcMar>
+              <w:top w:type="dxa" w:w="60"/>
+              <w:left w:type="dxa" w:w="90"/>
+              <w:bottom w:type="dxa" w:w="60"/>
+              <w:right w:type="dxa" w:w="90"/>
+            </w:tcMar>
+          </w:tcPr>
+          <w:p>
+            <w:r>
+              <w:rPr>
+                <w:rFonts w:ascii="Arial" w:cs="Arial" w:eastAsia="Arial" w:hAnsi="Arial"/>
+                <w:sz w:val="19"/>
+                <w:szCs w:val="19"/>
+              </w:rPr>
+              <w:t xml:space="preserve">Rows changed since the last load. Backfill.</w:t>
+            </w:r>
+          </w:p>
+        </w:tc>
+      </w:tr>
+      <w:tr>
+        <w:tc>
+          <w:tcPr>
+            <w:tcW w:type="dxa" w:w="2600"/>
+            <w:tcMar>
+              <w:top w:type="dxa" w:w="60"/>
+              <w:left w:type="dxa" w:w="90"/>
+              <w:bottom w:type="dxa" w:w="60"/>
+              <w:right w:type="dxa" w:w="90"/>
+            </w:tcMar>
+          </w:tcPr>
+          <w:p>
+            <w:r>
+              <w:rPr>
+                <w:rFonts w:ascii="Arial" w:cs="Arial" w:eastAsia="Arial" w:hAnsi="Arial"/>
+                <w:sz w:val="19"/>
+                <w:szCs w:val="19"/>
+              </w:rPr>
+              <w:t xml:space="preserve">Deliveries not arriving</w:t>
+            </w:r>
+          </w:p>
+        </w:tc>
+        <w:tc>
+          <w:tcPr>
+            <w:tcW w:type="dxa" w:w="3740"/>
+            <w:tcMar>
+              <w:top w:type="dxa" w:w="60"/>
+              <w:left w:type="dxa" w:w="90"/>
+              <w:bottom w:type="dxa" w:w="60"/>
+              <w:right w:type="dxa" w:w="90"/>
+            </w:tcMar>
+          </w:tcPr>
+          <w:p>
+            <w:r>
+              <w:rPr>
+                <w:rFonts w:ascii="Arial" w:cs="Arial" w:eastAsia="Arial" w:hAnsi="Arial"/>
+                <w:sz w:val="19"/>
+                <w:szCs w:val="19"/>
+              </w:rPr>
+              <w:t xml:space="preserve">Insights → Scheduled, the run log kind Delivery; the workspace's Mail Server</w:t>
+            </w:r>
+          </w:p>
+        </w:tc>
+        <w:tc>
+          <w:tcPr>
+            <w:tcW w:type="dxa" w:w="3740"/>
+            <w:tcMar>
+              <w:top w:type="dxa" w:w="60"/>
+              <w:left w:type="dxa" w:w="90"/>
+              <w:bottom w:type="dxa" w:w="60"/>
+              <w:right w:type="dxa" w:w="90"/>
+            </w:tcMar>
+          </w:tcPr>
+          <w:p>
+            <w:r>
+              <w:rPr>
+                <w:rFonts w:ascii="Arial" w:cs="Arial" w:eastAsia="Arial" w:hAnsi="Arial"/>
+                <w:sz w:val="19"/>
+                <w:szCs w:val="19"/>
+              </w:rPr>
+              <w:t xml:space="preserve">The schedule is paused after three failures, or the workspace has no mail server.</w:t>
+            </w:r>
+          </w:p>
+        </w:tc>
+      </w:tr>
+      <w:tr>
+        <w:tc>
+          <w:tcPr>
+            <w:tcW w:type="dxa" w:w="2600"/>
+            <w:tcMar>
+              <w:top w:type="dxa" w:w="60"/>
+              <w:left w:type="dxa" w:w="90"/>
+              <w:bottom w:type="dxa" w:w="60"/>
+              <w:right w:type="dxa" w:w="90"/>
+            </w:tcMar>
+          </w:tcPr>
+          <w:p>
+            <w:r>
+              <w:rPr>
+                <w:rFonts w:ascii="Arial" w:cs="Arial" w:eastAsia="Arial" w:hAnsi="Arial"/>
+                <w:sz w:val="19"/>
+                <w:szCs w:val="19"/>
+              </w:rPr>
+              <w:t xml:space="preserve">ClickHouse buttons say it is not configured</w:t>
+            </w:r>
+          </w:p>
+        </w:tc>
+        <w:tc>
+          <w:tcPr>
+            <w:tcW w:type="dxa" w:w="3740"/>
+            <w:tcMar>
+              <w:top w:type="dxa" w:w="60"/>
+              <w:left w:type="dxa" w:w="90"/>
+              <w:bottom w:type="dxa" w:w="60"/>
+              <w:right w:type="dxa" w:w="90"/>
+            </w:tcMar>
+          </w:tcPr>
+          <w:p>
+            <w:r>
+              <w:rPr>
+                <w:rFonts w:ascii="Arial" w:cs="Arial" w:eastAsia="Arial" w:hAnsi="Arial"/>
+                <w:sz w:val="19"/>
+                <w:szCs w:val="19"/>
+              </w:rPr>
+              <w:t xml:space="preserve">the server's environment</w:t>
+            </w:r>
+          </w:p>
+        </w:tc>
+        <w:tc>
+          <w:tcPr>
+            <w:tcW w:type="dxa" w:w="3740"/>
+            <w:tcMar>
+              <w:top w:type="dxa" w:w="60"/>
+              <w:left w:type="dxa" w:w="90"/>
+              <w:bottom w:type="dxa" w:w="60"/>
+              <w:right w:type="dxa" w:w="90"/>
+            </w:tcMar>
+          </w:tcPr>
+          <w:p>
+            <w:r>
+              <w:rPr>
+                <w:rFonts w:ascii="Arial" w:cs="Arial" w:eastAsia="Arial" w:hAnsi="Arial"/>
+                <w:sz w:val="19"/>
+                <w:szCs w:val="19"/>
+              </w:rPr>
+              <w:t xml:space="preserve">The four ClickHouse lines are missing on that server.</w:t>
+            </w:r>
+          </w:p>
+        </w:tc>
+      </w:tr>
+    </w:tbl>
+    <w:p>
+      <w:pPr>
+        <w:spacing w:after="120"/>
+      </w:pPr>
+    </w:p>
+    <w:p>
+      <w:pPr>
+        <w:pStyle w:val="Heading2"/>
+        <w:spacing w:after="120" w:before="240"/>
+      </w:pPr>
+      <w:r>
+        <w:rPr>
+          <w:rFonts w:ascii="Arial" w:cs="Arial" w:eastAsia="Arial" w:hAnsi="Arial"/>
+        </w:rPr>
+        <w:t xml:space="preserve">Related chapters</w:t>
+      </w:r>
+    </w:p>
+    <w:p>
+      <w:pPr>
+        <w:spacing w:after="120"/>
+      </w:pPr>
+      <w:r>
+        <w:rPr>
+          <w:rFonts w:ascii="Arial" w:cs="Arial" w:eastAsia="Arial" w:hAnsi="Arial"/>
+          <w:sz w:val="21"/>
+          <w:szCs w:val="21"/>
+        </w:rPr>
+        <w:t xml:space="preserve">Jobs, Alerts and System Checks (the refresh and delivery jobs on the health page); Tenants (switching the Insights component on for a workspace); People and Access (the Reports · View, Edit and Admin permissions).</w:t>
       </w:r>
     </w:p>
     <w:sectPr>

</xml_diff>

<commit_message>
Insights: Report Engine Connections in the back-office, the ClickHouse a workspace uses chosen by profile (Phase E, fourth slice)
Configuration -> Report Engine Connections: one row per analytics server (profile, engine, HTTP URL, user, password stored
encrypted and never shown, database, status, notes) with Test Connection recording the server's version or the error on the
row. A workspace's Report Engines row picks a profile from the active connections, or the server's CLICKHOUSE_* environment;
reports, backfill, refresh, reconcile and activate resolve the connection per workspace, so workspaces can be spread over
several ClickHouse servers. A server deployed before patch 0054 keeps working from the environment.

Patch 0054 adds report_engine_connection with its grants. Docs: the switch guide, Platform Guide chapter 18, the engine
note and the help panel. Tests: connection resolution, and the back-office page end to end.

Co-Authored-By: Claude Fable 5.1 <noreply@anthropic.com>
</commit_message>
<xml_diff>
--- a/docs/manuals/CEP_Platform_Guide.docx
+++ b/docs/manuals/CEP_Platform_Guide.docx
@@ -28273,28 +28273,28 @@
                 <w:sz w:val="19"/>
                 <w:szCs w:val="19"/>
               </w:rPr>
-              <w:t xml:space="preserve">text</w:t>
-            </w:r>
-          </w:p>
-        </w:tc>
-        <w:tc>
-          <w:tcPr>
-            <w:tcW w:type="dxa" w:w="3740"/>
-            <w:tcMar>
-              <w:top w:type="dxa" w:w="60"/>
-              <w:left w:type="dxa" w:w="90"/>
-              <w:bottom w:type="dxa" w:w="60"/>
-              <w:right w:type="dxa" w:w="90"/>
-            </w:tcMar>
-          </w:tcPr>
-          <w:p>
-            <w:r>
-              <w:rPr>
-                <w:rFonts w:ascii="Arial" w:cs="Arial" w:eastAsia="Arial" w:hAnsi="Arial"/>
-                <w:sz w:val="19"/>
-                <w:szCs w:val="19"/>
-              </w:rPr>
-              <w:t xml:space="preserve">A label for operators. The connection itself is server configuration.</w:t>
+              <w:t xml:space="preserve">a Report Engine Connection, or empty</w:t>
+            </w:r>
+          </w:p>
+        </w:tc>
+        <w:tc>
+          <w:tcPr>
+            <w:tcW w:type="dxa" w:w="3740"/>
+            <w:tcMar>
+              <w:top w:type="dxa" w:w="60"/>
+              <w:left w:type="dxa" w:w="90"/>
+              <w:bottom w:type="dxa" w:w="60"/>
+              <w:right w:type="dxa" w:w="90"/>
+            </w:tcMar>
+          </w:tcPr>
+          <w:p>
+            <w:r>
+              <w:rPr>
+                <w:rFonts w:ascii="Arial" w:cs="Arial" w:eastAsia="Arial" w:hAnsi="Arial"/>
+                <w:sz w:val="19"/>
+                <w:szCs w:val="19"/>
+              </w:rPr>
+              <w:t xml:space="preserve">The ClickHouse this workspace loads into and reads from. Empty: the server's environment.</w:t>
             </w:r>
           </w:p>
         </w:tc>
@@ -28379,7 +28379,7 @@
         <w:rPr>
           <w:rFonts w:ascii="Arial" w:cs="Arial" w:eastAsia="Arial" w:hAnsi="Arial"/>
         </w:rPr>
-        <w:t xml:space="preserve">What the server needs for ClickHouse</w:t>
+        <w:t xml:space="preserve">Where the ClickHouse connection comes from</w:t>
       </w:r>
     </w:p>
     <w:p>
@@ -28389,10 +28389,20 @@
       <w:r>
         <w:rPr>
           <w:rFonts w:ascii="Arial" w:cs="Arial" w:eastAsia="Arial" w:hAnsi="Arial"/>
-          <w:sz w:val="21"/>
-          <w:szCs w:val="21"/>
-        </w:rPr>
-        <w:t xml:space="preserve">Four lines in the backend's environment, set by whoever runs the server, never in the back-office: the URL of the ClickHouse HTTP interface, the user, the password and the database (</w:t>
+          <w:b/>
+          <w:bCs/>
+          <w:sz w:val="21"/>
+          <w:szCs w:val="21"/>
+        </w:rPr>
+        <w:t xml:space="preserve">Configuration → Report Engine Connections</w:t>
+      </w:r>
+      <w:r>
+        <w:rPr>
+          <w:rFonts w:ascii="Arial" w:cs="Arial" w:eastAsia="Arial" w:hAnsi="Arial"/>
+          <w:sz w:val="21"/>
+          <w:szCs w:val="21"/>
+        </w:rPr>
+        <w:t xml:space="preserve"> holds the servers the platform can point a workspace at. One row per connection: a profile name, the engine, the URL of ClickHouse's HTTP interface, the user, the password (typed to set or change it, stored encrypted, never shown again), the database (</w:t>
       </w:r>
       <w:r>
         <w:rPr>
@@ -28408,7 +28418,59 @@
           <w:sz w:val="21"/>
           <w:szCs w:val="21"/>
         </w:rPr>
-        <w:t xml:space="preserve">). An empty URL means no ClickHouse: the buttons below say so and every workspace stays on PostgreSQL. The database patch that adds the ClickHouse sources to the catalogue (0053) must be applied. The operator's guide, with the checks to run from the server, is </w:t>
+        <w:t xml:space="preserve">), a status and notes. </w:t>
+      </w:r>
+      <w:r>
+        <w:rPr>
+          <w:rFonts w:ascii="Arial" w:cs="Arial" w:eastAsia="Arial" w:hAnsi="Arial"/>
+          <w:b/>
+          <w:bCs/>
+          <w:sz w:val="21"/>
+          <w:szCs w:val="21"/>
+        </w:rPr>
+        <w:t xml:space="preserve">Test Connection</w:t>
+      </w:r>
+      <w:r>
+        <w:rPr>
+          <w:rFonts w:ascii="Arial" w:cs="Arial" w:eastAsia="Arial" w:hAnsi="Arial"/>
+          <w:sz w:val="21"/>
+          <w:szCs w:val="21"/>
+        </w:rPr>
+        <w:t xml:space="preserve"> reaches the server and shows its version; the result stays on the row. A workspace's Report Engines row chooses one of these in </w:t>
+      </w:r>
+      <w:r>
+        <w:rPr>
+          <w:rFonts w:ascii="Arial" w:cs="Arial" w:eastAsia="Arial" w:hAnsi="Arial"/>
+          <w:b/>
+          <w:bCs/>
+          <w:sz w:val="21"/>
+          <w:szCs w:val="21"/>
+        </w:rPr>
+        <w:t xml:space="preserve">Connection profile</w:t>
+      </w:r>
+      <w:r>
+        <w:rPr>
+          <w:rFonts w:ascii="Arial" w:cs="Arial" w:eastAsia="Arial" w:hAnsi="Arial"/>
+          <w:sz w:val="21"/>
+          <w:szCs w:val="21"/>
+        </w:rPr>
+        <w:t xml:space="preserve">; from then on its backfill, refresh, reconcile and reports use that server, so workspaces can be spread over several ClickHouse servers. A row with no profile uses the server's environment (</w:t>
+      </w:r>
+      <w:r>
+        <w:rPr>
+          <w:rFonts w:ascii="Consolas" w:cs="Consolas" w:eastAsia="Consolas" w:hAnsi="Consolas"/>
+          <w:sz w:val="21"/>
+          <w:szCs w:val="21"/>
+        </w:rPr>
+        <w:t xml:space="preserve">CLICKHOUSE_URL</w:t>
+      </w:r>
+      <w:r>
+        <w:rPr>
+          <w:rFonts w:ascii="Arial" w:cs="Arial" w:eastAsia="Arial" w:hAnsi="Arial"/>
+          <w:sz w:val="21"/>
+          <w:szCs w:val="21"/>
+        </w:rPr>
+        <w:t xml:space="preserve">, user, password, database), set by whoever runs the server; with neither, the buttons say so and the workspace stays on PostgreSQL. The database patches 0053 (the catalogue's ClickHouse sources) and 0054 (the connections table) must be applied. The operator's guide, with the checks to run from the server, is </w:t>
       </w:r>
       <w:r>
         <w:rPr>

</xml_diff>

<commit_message>
AI assistant: a workspace's own Claude and OpenAI keys, winning over the platform's and not limited by the plan
Settings -> AI Assistant shows each provider as provided by the platform, on the workspace's own key, or not offered, with
Use Your Own Key / Add Your Own Key (API key write-only and encrypted, the two models), Edit Key, Check Connection, and a way
back to the platform's key. The own rows live in ai_provider with the workspace's tenant_id under row-level security; prompts
on an own key are recorded with account OWN, not counted against the plan and not shown in the back-office table. Still
patch 0055. Guides updated.

Co-Authored-By: Claude Fable 5.1 <noreply@anthropic.com>
</commit_message>
<xml_diff>
--- a/docs/manuals/CEP_Platform_Guide.docx
+++ b/docs/manuals/CEP_Platform_Guide.docx
@@ -2058,6 +2058,20 @@
           <w:szCs w:val="20"/>
         </w:rPr>
         <w:t xml:space="preserve">The providers</w:t>
+      </w:r>
+    </w:p>
+    <w:p>
+      <w:pPr>
+        <w:spacing w:after="40"/>
+        <w:ind w:left="400"/>
+      </w:pPr>
+      <w:r>
+        <w:rPr>
+          <w:rFonts w:ascii="Arial" w:cs="Arial" w:eastAsia="Arial" w:hAnsi="Arial"/>
+          <w:sz w:val="20"/>
+          <w:szCs w:val="20"/>
+        </w:rPr>
+        <w:t xml:space="preserve">A workspace's own key</w:t>
       </w:r>
     </w:p>
     <w:p>
@@ -30083,6 +30097,47 @@
           <w:szCs w:val="21"/>
         </w:rPr>
         <w:t xml:space="preserve">Model names are settings, not code: a newer model is a change on this page, not a release.</w:t>
+      </w:r>
+    </w:p>
+    <w:p>
+      <w:pPr>
+        <w:pStyle w:val="Heading2"/>
+        <w:spacing w:after="120" w:before="240"/>
+      </w:pPr>
+      <w:r>
+        <w:rPr>
+          <w:rFonts w:ascii="Arial" w:cs="Arial" w:eastAsia="Arial" w:hAnsi="Arial"/>
+        </w:rPr>
+        <w:t xml:space="preserve">A workspace's own key</w:t>
+      </w:r>
+    </w:p>
+    <w:p>
+      <w:pPr>
+        <w:spacing w:after="120"/>
+      </w:pPr>
+      <w:r>
+        <w:rPr>
+          <w:rFonts w:ascii="Arial" w:cs="Arial" w:eastAsia="Arial" w:hAnsi="Arial"/>
+          <w:sz w:val="21"/>
+          <w:szCs w:val="21"/>
+        </w:rPr>
+        <w:t xml:space="preserve">A workspace may enter its own key for either provider under Settings → AI Assistant, with the two models to offer. Its own key wins over the platform's for that provider, so a workspace can use a provider the platform does not offer, or keep its prompts on its own account. Prompts on a workspace's own key are not counted against its plan and do not appear in the table below; the row is the workspace's, in </w:t>
+      </w:r>
+      <w:r>
+        <w:rPr>
+          <w:rFonts w:ascii="Consolas" w:cs="Consolas" w:eastAsia="Consolas" w:hAnsi="Consolas"/>
+          <w:sz w:val="21"/>
+          <w:szCs w:val="21"/>
+        </w:rPr>
+        <w:t xml:space="preserve">ai_provider</w:t>
+      </w:r>
+      <w:r>
+        <w:rPr>
+          <w:rFonts w:ascii="Arial" w:cs="Arial" w:eastAsia="Arial" w:hAnsi="Arial"/>
+          <w:sz w:val="21"/>
+          <w:szCs w:val="21"/>
+        </w:rPr>
+        <w:t xml:space="preserve"> with its tenant id, and never shown here.</w:t>
       </w:r>
     </w:p>
     <w:p>

</xml_diff>

<commit_message>
Help: step-by-step guides for the AI assistant, Report Databases, joins and the query window, at the top of their chapters
The Insights chapter opens with Ask for a Report and Use AI in your workspace; the Report Databases chapter with Connect a
database, Map a dataset, Join tables and Build a report from a query; the Platform Guide's AI Assistant with switching AI on.
The explanations that were there follow the steps. Manuals rebuilt.

Co-Authored-By: Claude Fable 5.1 <noreply@anthropic.com>
</commit_message>
<xml_diff>
--- a/docs/manuals/CEP_Platform_Guide.docx
+++ b/docs/manuals/CEP_Platform_Guide.docx
@@ -39,7 +39,7 @@
           <w:sz w:val="20"/>
           <w:szCs w:val="20"/>
         </w:rPr>
-        <w:t xml:space="preserve">Built 2026-10-16 from docs/manuals/platform-guide</w:t>
+        <w:t xml:space="preserve">Built 2026-10-17 from docs/manuals/platform-guide</w:t>
       </w:r>
     </w:p>
     <w:p>
@@ -2030,6 +2030,20 @@
           <w:szCs w:val="22"/>
         </w:rPr>
         <w:t xml:space="preserve">AI Assistant</w:t>
+      </w:r>
+    </w:p>
+    <w:p>
+      <w:pPr>
+        <w:spacing w:after="40"/>
+        <w:ind w:left="400"/>
+      </w:pPr>
+      <w:r>
+        <w:rPr>
+          <w:rFonts w:ascii="Arial" w:cs="Arial" w:eastAsia="Arial" w:hAnsi="Arial"/>
+          <w:sz w:val="20"/>
+          <w:szCs w:val="20"/>
+        </w:rPr>
+        <w:t xml:space="preserve">Step by step: switching AI on</w:t>
       </w:r>
     </w:p>
     <w:p>
@@ -29665,6 +29679,216 @@
           <w:szCs w:val="21"/>
         </w:rPr>
         <w:t xml:space="preserve"> Configuration → AI Assistant.</w:t>
+      </w:r>
+    </w:p>
+    <w:p>
+      <w:pPr>
+        <w:pStyle w:val="Heading2"/>
+        <w:spacing w:after="120" w:before="240"/>
+      </w:pPr>
+      <w:r>
+        <w:rPr>
+          <w:rFonts w:ascii="Arial" w:cs="Arial" w:eastAsia="Arial" w:hAnsi="Arial"/>
+        </w:rPr>
+        <w:t xml:space="preserve">Step by step: switching AI on</w:t>
+      </w:r>
+    </w:p>
+    <w:p>
+      <w:pPr>
+        <w:pStyle w:val="ListParagraph"/>
+        <w:numPr>
+          <w:ilvl w:val="0"/>
+          <w:numId w:val="3"/>
+        </w:numPr>
+        <w:spacing w:after="60"/>
+      </w:pPr>
+      <w:r>
+        <w:rPr>
+          <w:rFonts w:ascii="Arial" w:cs="Arial" w:eastAsia="Arial" w:hAnsi="Arial"/>
+          <w:sz w:val="21"/>
+          <w:szCs w:val="21"/>
+        </w:rPr>
+        <w:t xml:space="preserve">Open Configuration → AI Assistant in the back-office.</w:t>
+      </w:r>
+    </w:p>
+    <w:p>
+      <w:pPr>
+        <w:pStyle w:val="ListParagraph"/>
+        <w:numPr>
+          <w:ilvl w:val="0"/>
+          <w:numId w:val="3"/>
+        </w:numPr>
+        <w:spacing w:after="60"/>
+      </w:pPr>
+      <w:r>
+        <w:rPr>
+          <w:rFonts w:ascii="Arial" w:cs="Arial" w:eastAsia="Arial" w:hAnsi="Arial"/>
+          <w:sz w:val="21"/>
+          <w:szCs w:val="21"/>
+        </w:rPr>
+        <w:t xml:space="preserve">On the Claude (Anthropic) or OpenAI card, paste the API key from the provider's console, keep or change the two model names, leave </w:t>
+      </w:r>
+      <w:r>
+        <w:rPr>
+          <w:rFonts w:ascii="Arial" w:cs="Arial" w:eastAsia="Arial" w:hAnsi="Arial"/>
+          <w:b/>
+          <w:bCs/>
+          <w:sz w:val="21"/>
+          <w:szCs w:val="21"/>
+        </w:rPr>
+        <w:t xml:space="preserve">Workspaces May Use This Provider</w:t>
+      </w:r>
+      <w:r>
+        <w:rPr>
+          <w:rFonts w:ascii="Arial" w:cs="Arial" w:eastAsia="Arial" w:hAnsi="Arial"/>
+          <w:sz w:val="21"/>
+          <w:szCs w:val="21"/>
+        </w:rPr>
+        <w:t xml:space="preserve"> on, and press </w:t>
+      </w:r>
+      <w:r>
+        <w:rPr>
+          <w:rFonts w:ascii="Arial" w:cs="Arial" w:eastAsia="Arial" w:hAnsi="Arial"/>
+          <w:b/>
+          <w:bCs/>
+          <w:sz w:val="21"/>
+          <w:szCs w:val="21"/>
+        </w:rPr>
+        <w:t xml:space="preserve">Save</w:t>
+      </w:r>
+      <w:r>
+        <w:rPr>
+          <w:rFonts w:ascii="Arial" w:cs="Arial" w:eastAsia="Arial" w:hAnsi="Arial"/>
+          <w:sz w:val="21"/>
+          <w:szCs w:val="21"/>
+        </w:rPr>
+        <w:t xml:space="preserve">.</w:t>
+      </w:r>
+    </w:p>
+    <w:p>
+      <w:pPr>
+        <w:pStyle w:val="ListParagraph"/>
+        <w:numPr>
+          <w:ilvl w:val="0"/>
+          <w:numId w:val="3"/>
+        </w:numPr>
+        <w:spacing w:after="60"/>
+      </w:pPr>
+      <w:r>
+        <w:rPr>
+          <w:rFonts w:ascii="Arial" w:cs="Arial" w:eastAsia="Arial" w:hAnsi="Arial"/>
+          <w:sz w:val="21"/>
+          <w:szCs w:val="21"/>
+        </w:rPr>
+        <w:t xml:space="preserve">Press </w:t>
+      </w:r>
+      <w:r>
+        <w:rPr>
+          <w:rFonts w:ascii="Arial" w:cs="Arial" w:eastAsia="Arial" w:hAnsi="Arial"/>
+          <w:b/>
+          <w:bCs/>
+          <w:sz w:val="21"/>
+          <w:szCs w:val="21"/>
+        </w:rPr>
+        <w:t xml:space="preserve">Check Connection</w:t>
+      </w:r>
+      <w:r>
+        <w:rPr>
+          <w:rFonts w:ascii="Arial" w:cs="Arial" w:eastAsia="Arial" w:hAnsi="Arial"/>
+          <w:sz w:val="21"/>
+          <w:szCs w:val="21"/>
+        </w:rPr>
+        <w:t xml:space="preserve">. The card shows Connected with the time, or Failed with the provider's reason; the check also says when a model name is not in the account's list.</w:t>
+      </w:r>
+    </w:p>
+    <w:p>
+      <w:pPr>
+        <w:pStyle w:val="ListParagraph"/>
+        <w:numPr>
+          <w:ilvl w:val="0"/>
+          <w:numId w:val="3"/>
+        </w:numPr>
+        <w:spacing w:after="60"/>
+      </w:pPr>
+      <w:r>
+        <w:rPr>
+          <w:rFonts w:ascii="Arial" w:cs="Arial" w:eastAsia="Arial" w:hAnsi="Arial"/>
+          <w:sz w:val="21"/>
+          <w:szCs w:val="21"/>
+        </w:rPr>
+        <w:t xml:space="preserve">Under the cards, choose the </w:t>
+      </w:r>
+      <w:r>
+        <w:rPr>
+          <w:rFonts w:ascii="Arial" w:cs="Arial" w:eastAsia="Arial" w:hAnsi="Arial"/>
+          <w:b/>
+          <w:bCs/>
+          <w:sz w:val="21"/>
+          <w:szCs w:val="21"/>
+        </w:rPr>
+        <w:t xml:space="preserve">Default Model</w:t>
+      </w:r>
+      <w:r>
+        <w:rPr>
+          <w:rFonts w:ascii="Arial" w:cs="Arial" w:eastAsia="Arial" w:hAnsi="Arial"/>
+          <w:sz w:val="21"/>
+          <w:szCs w:val="21"/>
+        </w:rPr>
+        <w:t xml:space="preserve"> and whether </w:t>
+      </w:r>
+      <w:r>
+        <w:rPr>
+          <w:rFonts w:ascii="Arial" w:cs="Arial" w:eastAsia="Arial" w:hAnsi="Arial"/>
+          <w:b/>
+          <w:bCs/>
+          <w:sz w:val="21"/>
+          <w:szCs w:val="21"/>
+        </w:rPr>
+        <w:t xml:space="preserve">Explain This Report May Send Totals</w:t>
+      </w:r>
+      <w:r>
+        <w:rPr>
+          <w:rFonts w:ascii="Arial" w:cs="Arial" w:eastAsia="Arial" w:hAnsi="Arial"/>
+          <w:sz w:val="21"/>
+          <w:szCs w:val="21"/>
+        </w:rPr>
+        <w:t xml:space="preserve">, then </w:t>
+      </w:r>
+      <w:r>
+        <w:rPr>
+          <w:rFonts w:ascii="Arial" w:cs="Arial" w:eastAsia="Arial" w:hAnsi="Arial"/>
+          <w:b/>
+          <w:bCs/>
+          <w:sz w:val="21"/>
+          <w:szCs w:val="21"/>
+        </w:rPr>
+        <w:t xml:space="preserve">Save</w:t>
+      </w:r>
+      <w:r>
+        <w:rPr>
+          <w:rFonts w:ascii="Arial" w:cs="Arial" w:eastAsia="Arial" w:hAnsi="Arial"/>
+          <w:sz w:val="21"/>
+          <w:szCs w:val="21"/>
+        </w:rPr>
+        <w:t xml:space="preserve">. The plans' prompts a month are set on each plan.</w:t>
+      </w:r>
+    </w:p>
+    <w:p>
+      <w:pPr>
+        <w:pStyle w:val="ListParagraph"/>
+        <w:numPr>
+          <w:ilvl w:val="0"/>
+          <w:numId w:val="3"/>
+        </w:numPr>
+        <w:spacing w:after="60"/>
+      </w:pPr>
+      <w:r>
+        <w:rPr>
+          <w:rFonts w:ascii="Arial" w:cs="Arial" w:eastAsia="Arial" w:hAnsi="Arial"/>
+          <w:sz w:val="21"/>
+          <w:szCs w:val="21"/>
+        </w:rPr>
+        <w:t xml:space="preserve">From then on every workspace on a plan with prompts sees Ask for a Report above its report list, unless its administrator switches AI off under Settings → AI Assistant. The table at the bottom counts this month's drafts by workspace.</w:t>
       </w:r>
     </w:p>
     <w:p>

</xml_diff>

<commit_message>
Help: step-by-step guides for calculated measures, pie and funnel, dashboard slicers and cross-filtering
At the top of their chapters: the Insights chapter (using a calculated measure, pie and
funnel, adding and using slicers, cross-filtering by clicking), the Report Databases chapter
(adding a calculated measure to a mapped dataset) and the Platform Guide's Report Datasets
chapter (a formula on a platform field). Both manuals rebuilt.

Co-Authored-By: Claude Opus 5.5 <noreply@anthropic.com>
</commit_message>
<xml_diff>
--- a/docs/manuals/CEP_Platform_Guide.docx
+++ b/docs/manuals/CEP_Platform_Guide.docx
@@ -1932,6 +1932,20 @@
           <w:szCs w:val="22"/>
         </w:rPr>
         <w:t xml:space="preserve">Report Datasets and Report Engines</w:t>
+      </w:r>
+    </w:p>
+    <w:p>
+      <w:pPr>
+        <w:spacing w:after="40"/>
+        <w:ind w:left="400"/>
+      </w:pPr>
+      <w:r>
+        <w:rPr>
+          <w:rFonts w:ascii="Arial" w:cs="Arial" w:eastAsia="Arial" w:hAnsi="Arial"/>
+          <w:sz w:val="20"/>
+          <w:szCs w:val="20"/>
+        </w:rPr>
+        <w:t xml:space="preserve">Step by step: a calculated measure</w:t>
       </w:r>
     </w:p>
     <w:p>
@@ -27038,6 +27052,314 @@
           <w:szCs w:val="21"/>
         </w:rPr>
         <w:t xml:space="preserve"> Configuration → Report Datasets, and Configuration → Report Engines.</w:t>
+      </w:r>
+    </w:p>
+    <w:p>
+      <w:pPr>
+        <w:pStyle w:val="Heading2"/>
+        <w:spacing w:after="120" w:before="240"/>
+      </w:pPr>
+      <w:r>
+        <w:rPr>
+          <w:rFonts w:ascii="Arial" w:cs="Arial" w:eastAsia="Arial" w:hAnsi="Arial"/>
+        </w:rPr>
+        <w:t xml:space="preserve">Step by step: a calculated measure</w:t>
+      </w:r>
+    </w:p>
+    <w:p>
+      <w:pPr>
+        <w:pStyle w:val="ListParagraph"/>
+        <w:numPr>
+          <w:ilvl w:val="0"/>
+          <w:numId w:val="3"/>
+        </w:numPr>
+        <w:spacing w:after="60"/>
+      </w:pPr>
+      <w:r>
+        <w:rPr>
+          <w:rFonts w:ascii="Arial" w:cs="Arial" w:eastAsia="Arial" w:hAnsi="Arial"/>
+          <w:sz w:val="21"/>
+          <w:szCs w:val="21"/>
+        </w:rPr>
+        <w:t xml:space="preserve">Open Configuration → Report Datasets and open the dataset, such as Messages.</w:t>
+      </w:r>
+    </w:p>
+    <w:p>
+      <w:pPr>
+        <w:pStyle w:val="ListParagraph"/>
+        <w:numPr>
+          <w:ilvl w:val="0"/>
+          <w:numId w:val="3"/>
+        </w:numPr>
+        <w:spacing w:after="60"/>
+      </w:pPr>
+      <w:r>
+        <w:rPr>
+          <w:rFonts w:ascii="Arial" w:cs="Arial" w:eastAsia="Arial" w:hAnsi="Arial"/>
+          <w:sz w:val="21"/>
+          <w:szCs w:val="21"/>
+        </w:rPr>
+        <w:t xml:space="preserve">On a new field row, give the key (delivered_rate) and the label (Delivered Rate), put the key in </w:t>
+      </w:r>
+      <w:r>
+        <w:rPr>
+          <w:rFonts w:ascii="Arial" w:cs="Arial" w:eastAsia="Arial" w:hAnsi="Arial"/>
+          <w:b/>
+          <w:bCs/>
+          <w:sz w:val="21"/>
+          <w:szCs w:val="21"/>
+        </w:rPr>
+        <w:t xml:space="preserve">Column name</w:t>
+      </w:r>
+      <w:r>
+        <w:rPr>
+          <w:rFonts w:ascii="Arial" w:cs="Arial" w:eastAsia="Arial" w:hAnsi="Arial"/>
+          <w:sz w:val="21"/>
+          <w:szCs w:val="21"/>
+        </w:rPr>
+        <w:t xml:space="preserve"> too (a formula reads no column), set </w:t>
+      </w:r>
+      <w:r>
+        <w:rPr>
+          <w:rFonts w:ascii="Arial" w:cs="Arial" w:eastAsia="Arial" w:hAnsi="Arial"/>
+          <w:b/>
+          <w:bCs/>
+          <w:sz w:val="21"/>
+          <w:szCs w:val="21"/>
+        </w:rPr>
+        <w:t xml:space="preserve">Type</w:t>
+      </w:r>
+      <w:r>
+        <w:rPr>
+          <w:rFonts w:ascii="Arial" w:cs="Arial" w:eastAsia="Arial" w:hAnsi="Arial"/>
+          <w:sz w:val="21"/>
+          <w:szCs w:val="21"/>
+        </w:rPr>
+        <w:t xml:space="preserve"> to number, </w:t>
+      </w:r>
+      <w:r>
+        <w:rPr>
+          <w:rFonts w:ascii="Arial" w:cs="Arial" w:eastAsia="Arial" w:hAnsi="Arial"/>
+          <w:b/>
+          <w:bCs/>
+          <w:sz w:val="21"/>
+          <w:szCs w:val="21"/>
+        </w:rPr>
+        <w:t xml:space="preserve">Role</w:t>
+      </w:r>
+      <w:r>
+        <w:rPr>
+          <w:rFonts w:ascii="Arial" w:cs="Arial" w:eastAsia="Arial" w:hAnsi="Arial"/>
+          <w:sz w:val="21"/>
+          <w:szCs w:val="21"/>
+        </w:rPr>
+        <w:t xml:space="preserve"> to measure and the </w:t>
+      </w:r>
+      <w:r>
+        <w:rPr>
+          <w:rFonts w:ascii="Arial" w:cs="Arial" w:eastAsia="Arial" w:hAnsi="Arial"/>
+          <w:b/>
+          <w:bCs/>
+          <w:sz w:val="21"/>
+          <w:szCs w:val="21"/>
+        </w:rPr>
+        <w:t xml:space="preserve">Display format</w:t>
+      </w:r>
+      <w:r>
+        <w:rPr>
+          <w:rFonts w:ascii="Arial" w:cs="Arial" w:eastAsia="Arial" w:hAnsi="Arial"/>
+          <w:sz w:val="21"/>
+          <w:szCs w:val="21"/>
+        </w:rPr>
+        <w:t xml:space="preserve"> (percent for a rate).</w:t>
+      </w:r>
+    </w:p>
+    <w:p>
+      <w:pPr>
+        <w:pStyle w:val="ListParagraph"/>
+        <w:numPr>
+          <w:ilvl w:val="0"/>
+          <w:numId w:val="3"/>
+        </w:numPr>
+        <w:spacing w:after="60"/>
+      </w:pPr>
+      <w:r>
+        <w:rPr>
+          <w:rFonts w:ascii="Arial" w:cs="Arial" w:eastAsia="Arial" w:hAnsi="Arial"/>
+          <w:sz w:val="21"/>
+          <w:szCs w:val="21"/>
+        </w:rPr>
+        <w:t xml:space="preserve">Fill in </w:t>
+      </w:r>
+      <w:r>
+        <w:rPr>
+          <w:rFonts w:ascii="Arial" w:cs="Arial" w:eastAsia="Arial" w:hAnsi="Arial"/>
+          <w:b/>
+          <w:bCs/>
+          <w:sz w:val="21"/>
+          <w:szCs w:val="21"/>
+        </w:rPr>
+        <w:t xml:space="preserve">Formula</w:t>
+      </w:r>
+      <w:r>
+        <w:rPr>
+          <w:rFonts w:ascii="Arial" w:cs="Arial" w:eastAsia="Arial" w:hAnsi="Arial"/>
+          <w:sz w:val="21"/>
+          <w:szCs w:val="21"/>
+        </w:rPr>
+        <w:t xml:space="preserve">, for example: </w:t>
+      </w:r>
+      <w:r>
+        <w:rPr>
+          <w:rFonts w:ascii="Consolas" w:cs="Consolas" w:eastAsia="Consolas" w:hAnsi="Consolas"/>
+          <w:sz w:val="21"/>
+          <w:szCs w:val="21"/>
+        </w:rPr>
+        <w:t xml:space="preserve">{"op": "ratio", "left": {"field": "delivered", "aggregate": "sum"}, "right": {"field": "sent", "aggregate": "sum"}, "scale": 100}</w:t>
+      </w:r>
+      <w:r>
+        <w:rPr>
+          <w:rFonts w:ascii="Arial" w:cs="Arial" w:eastAsia="Arial" w:hAnsi="Arial"/>
+          <w:sz w:val="21"/>
+          <w:szCs w:val="21"/>
+        </w:rPr>
+        <w:t xml:space="preserve">. </w:t>
+      </w:r>
+      <w:r>
+        <w:rPr>
+          <w:rFonts w:ascii="Consolas" w:cs="Consolas" w:eastAsia="Consolas" w:hAnsi="Consolas"/>
+          <w:sz w:val="21"/>
+          <w:szCs w:val="21"/>
+        </w:rPr>
+        <w:t xml:space="preserve">op</w:t>
+      </w:r>
+      <w:r>
+        <w:rPr>
+          <w:rFonts w:ascii="Arial" w:cs="Arial" w:eastAsia="Arial" w:hAnsi="Arial"/>
+          <w:sz w:val="21"/>
+          <w:szCs w:val="21"/>
+        </w:rPr>
+        <w:t xml:space="preserve"> is ratio, difference, sum or product; a side is a measure of the same dataset with one of its aggregates, or </w:t>
+      </w:r>
+      <w:r>
+        <w:rPr>
+          <w:rFonts w:ascii="Consolas" w:cs="Consolas" w:eastAsia="Consolas" w:hAnsi="Consolas"/>
+          <w:sz w:val="21"/>
+          <w:szCs w:val="21"/>
+        </w:rPr>
+        <w:t xml:space="preserve">{"value": 2}</w:t>
+      </w:r>
+      <w:r>
+        <w:rPr>
+          <w:rFonts w:ascii="Arial" w:cs="Arial" w:eastAsia="Arial" w:hAnsi="Arial"/>
+          <w:sz w:val="21"/>
+          <w:szCs w:val="21"/>
+        </w:rPr>
+        <w:t xml:space="preserve">; </w:t>
+      </w:r>
+      <w:r>
+        <w:rPr>
+          <w:rFonts w:ascii="Consolas" w:cs="Consolas" w:eastAsia="Consolas" w:hAnsi="Consolas"/>
+          <w:sz w:val="21"/>
+          <w:szCs w:val="21"/>
+        </w:rPr>
+        <w:t xml:space="preserve">scale</w:t>
+      </w:r>
+      <w:r>
+        <w:rPr>
+          <w:rFonts w:ascii="Arial" w:cs="Arial" w:eastAsia="Arial" w:hAnsi="Arial"/>
+          <w:sz w:val="21"/>
+          <w:szCs w:val="21"/>
+        </w:rPr>
+        <w:t xml:space="preserve"> multiplies the result.</w:t>
+      </w:r>
+    </w:p>
+    <w:p>
+      <w:pPr>
+        <w:pStyle w:val="ListParagraph"/>
+        <w:numPr>
+          <w:ilvl w:val="0"/>
+          <w:numId w:val="3"/>
+        </w:numPr>
+        <w:spacing w:after="60"/>
+      </w:pPr>
+      <w:r>
+        <w:rPr>
+          <w:rFonts w:ascii="Arial" w:cs="Arial" w:eastAsia="Arial" w:hAnsi="Arial"/>
+          <w:sz w:val="21"/>
+          <w:szCs w:val="21"/>
+        </w:rPr>
+        <w:t xml:space="preserve">Press </w:t>
+      </w:r>
+      <w:r>
+        <w:rPr>
+          <w:rFonts w:ascii="Arial" w:cs="Arial" w:eastAsia="Arial" w:hAnsi="Arial"/>
+          <w:b/>
+          <w:bCs/>
+          <w:sz w:val="21"/>
+          <w:szCs w:val="21"/>
+        </w:rPr>
+        <w:t xml:space="preserve">Save</w:t>
+      </w:r>
+      <w:r>
+        <w:rPr>
+          <w:rFonts w:ascii="Arial" w:cs="Arial" w:eastAsia="Arial" w:hAnsi="Arial"/>
+          <w:sz w:val="21"/>
+          <w:szCs w:val="21"/>
+        </w:rPr>
+        <w:t xml:space="preserve">. The form refuses a formula that does not fit the dataset's fields, and sets the row's aggregates to </w:t>
+      </w:r>
+      <w:r>
+        <w:rPr>
+          <w:rFonts w:ascii="Consolas" w:cs="Consolas" w:eastAsia="Consolas" w:hAnsi="Consolas"/>
+          <w:sz w:val="21"/>
+          <w:szCs w:val="21"/>
+        </w:rPr>
+        <w:t xml:space="preserve">calc</w:t>
+      </w:r>
+      <w:r>
+        <w:rPr>
+          <w:rFonts w:ascii="Arial" w:cs="Arial" w:eastAsia="Arial" w:hAnsi="Arial"/>
+          <w:sz w:val="21"/>
+          <w:szCs w:val="21"/>
+        </w:rPr>
+        <w:t xml:space="preserve"> itself.</w:t>
+      </w:r>
+    </w:p>
+    <w:p>
+      <w:pPr>
+        <w:pStyle w:val="ListParagraph"/>
+        <w:numPr>
+          <w:ilvl w:val="0"/>
+          <w:numId w:val="3"/>
+        </w:numPr>
+        <w:spacing w:after="60"/>
+      </w:pPr>
+      <w:r>
+        <w:rPr>
+          <w:rFonts w:ascii="Arial" w:cs="Arial" w:eastAsia="Arial" w:hAnsi="Arial"/>
+          <w:sz w:val="21"/>
+          <w:szCs w:val="21"/>
+        </w:rPr>
+        <w:t xml:space="preserve">Within a minute every workspace on the dataset finds it among the measures, with the calculation </w:t>
+      </w:r>
+      <w:r>
+        <w:rPr>
+          <w:rFonts w:ascii="Arial" w:cs="Arial" w:eastAsia="Arial" w:hAnsi="Arial"/>
+          <w:b/>
+          <w:bCs/>
+          <w:sz w:val="21"/>
+          <w:szCs w:val="21"/>
+        </w:rPr>
+        <w:t xml:space="preserve">Calculated</w:t>
+      </w:r>
+      <w:r>
+        <w:rPr>
+          <w:rFonts w:ascii="Arial" w:cs="Arial" w:eastAsia="Arial" w:hAnsi="Arial"/>
+          <w:sz w:val="21"/>
+          <w:szCs w:val="21"/>
+        </w:rPr>
+        <w:t xml:space="preserve">. Delivered, Open, Click and Bounce Rate, Average Order Value and Conversion Rate are already there.</w:t>
       </w:r>
     </w:p>
     <w:p>

</xml_diff>

<commit_message>
Back-office Security page: package advisories and server settings, checked daily
Overview → Security lists what needs updating on this server, worst first:
every installed Python package and every npm package in the deployed
frontend looked up in OSV.dev, Django's deployment security checks, whether
the development web server is serving, and the headers the site really sends
(security.site_address). Check Now and a daily check-security job; findings
kept across checks (open, fixed, accepted); Accept the Risk with a reason and
a review date (platform admins), reopened on the date or by a new advisory;
folded Accepted, Passed and 30-day check history. A red menu badge counts
open Critical and High items; the back-office Home shows a card. Nothing is
installed or changed.

Tables security_check and security_finding with the security.site_address
setting (patch 0066). Platform Guide chapter "Security".

Co-Authored-By: Claude Opus 5.5 <noreply@anthropic.com>
</commit_message>
<xml_diff>
--- a/docs/manuals/CEP_Platform_Guide.docx
+++ b/docs/manuals/CEP_Platform_Guide.docx
@@ -39,7 +39,7 @@
           <w:sz w:val="20"/>
           <w:szCs w:val="20"/>
         </w:rPr>
-        <w:t xml:space="preserve">Built 2026-10-19 from docs/manuals/platform-guide</w:t>
+        <w:t xml:space="preserve">Built 2026-10-20 from docs/manuals/platform-guide</w:t>
       </w:r>
     </w:p>
     <w:p>
@@ -1792,6 +1792,90 @@
           <w:szCs w:val="20"/>
         </w:rPr>
         <w:t xml:space="preserve">Things to know</w:t>
+      </w:r>
+    </w:p>
+    <w:p>
+      <w:pPr>
+        <w:spacing w:after="40"/>
+        <w:ind w:left="0"/>
+      </w:pPr>
+      <w:r>
+        <w:rPr>
+          <w:rFonts w:ascii="Arial" w:cs="Arial" w:eastAsia="Arial" w:hAnsi="Arial"/>
+          <w:sz w:val="22"/>
+          <w:szCs w:val="22"/>
+        </w:rPr>
+        <w:t xml:space="preserve">Security</w:t>
+      </w:r>
+    </w:p>
+    <w:p>
+      <w:pPr>
+        <w:spacing w:after="40"/>
+        <w:ind w:left="400"/>
+      </w:pPr>
+      <w:r>
+        <w:rPr>
+          <w:rFonts w:ascii="Arial" w:cs="Arial" w:eastAsia="Arial" w:hAnsi="Arial"/>
+          <w:sz w:val="20"/>
+          <w:szCs w:val="20"/>
+        </w:rPr>
+        <w:t xml:space="preserve">What this is for</w:t>
+      </w:r>
+    </w:p>
+    <w:p>
+      <w:pPr>
+        <w:spacing w:after="40"/>
+        <w:ind w:left="400"/>
+      </w:pPr>
+      <w:r>
+        <w:rPr>
+          <w:rFonts w:ascii="Arial" w:cs="Arial" w:eastAsia="Arial" w:hAnsi="Arial"/>
+          <w:sz w:val="20"/>
+          <w:szCs w:val="20"/>
+        </w:rPr>
+        <w:t xml:space="preserve">Who can use it</w:t>
+      </w:r>
+    </w:p>
+    <w:p>
+      <w:pPr>
+        <w:spacing w:after="40"/>
+        <w:ind w:left="400"/>
+      </w:pPr>
+      <w:r>
+        <w:rPr>
+          <w:rFonts w:ascii="Arial" w:cs="Arial" w:eastAsia="Arial" w:hAnsi="Arial"/>
+          <w:sz w:val="20"/>
+          <w:szCs w:val="20"/>
+        </w:rPr>
+        <w:t xml:space="preserve">Step by step</w:t>
+      </w:r>
+    </w:p>
+    <w:p>
+      <w:pPr>
+        <w:spacing w:after="40"/>
+        <w:ind w:left="400"/>
+      </w:pPr>
+      <w:r>
+        <w:rPr>
+          <w:rFonts w:ascii="Arial" w:cs="Arial" w:eastAsia="Arial" w:hAnsi="Arial"/>
+          <w:sz w:val="20"/>
+          <w:szCs w:val="20"/>
+        </w:rPr>
+        <w:t xml:space="preserve">Severity</w:t>
+      </w:r>
+    </w:p>
+    <w:p>
+      <w:pPr>
+        <w:spacing w:after="40"/>
+        <w:ind w:left="400"/>
+      </w:pPr>
+      <w:r>
+        <w:rPr>
+          <w:rFonts w:ascii="Arial" w:cs="Arial" w:eastAsia="Arial" w:hAnsi="Arial"/>
+          <w:sz w:val="20"/>
+          <w:szCs w:val="20"/>
+        </w:rPr>
+        <w:t xml:space="preserve">When something does not work</w:t>
       </w:r>
     </w:p>
     <w:p>
@@ -24581,6 +24665,1338 @@
         </w:rPr>
         <w:t xml:space="preserve"> when set.</w:t>
       </w:r>
+    </w:p>
+    <w:p>
+      <w:r>
+        <w:br w:type="page"/>
+      </w:r>
+    </w:p>
+    <w:p>
+      <w:pPr>
+        <w:pStyle w:val="Heading1"/>
+        <w:spacing w:after="120" w:before="0"/>
+      </w:pPr>
+      <w:r>
+        <w:rPr>
+          <w:rFonts w:ascii="Arial" w:cs="Arial" w:eastAsia="Arial" w:hAnsi="Arial"/>
+        </w:rPr>
+        <w:t xml:space="preserve">Security</w:t>
+      </w:r>
+    </w:p>
+    <w:p>
+      <w:pPr>
+        <w:spacing w:after="120"/>
+      </w:pPr>
+      <w:r>
+        <w:rPr>
+          <w:rFonts w:ascii="Arial" w:cs="Arial" w:eastAsia="Arial" w:hAnsi="Arial"/>
+          <w:b/>
+          <w:bCs/>
+          <w:sz w:val="21"/>
+          <w:szCs w:val="21"/>
+        </w:rPr>
+        <w:t xml:space="preserve">Where:</w:t>
+      </w:r>
+      <w:r>
+        <w:rPr>
+          <w:rFonts w:ascii="Arial" w:cs="Arial" w:eastAsia="Arial" w:hAnsi="Arial"/>
+          <w:sz w:val="21"/>
+          <w:szCs w:val="21"/>
+        </w:rPr>
+        <w:t xml:space="preserve"> Overview → Security. The number on the menu item counts the open Critical and High items on this server; the back-office Home shows a card while one is open (a warning card when the worst is Medium).</w:t>
+      </w:r>
+    </w:p>
+    <w:p>
+      <w:pPr>
+        <w:pStyle w:val="Heading2"/>
+        <w:spacing w:after="120" w:before="240"/>
+      </w:pPr>
+      <w:r>
+        <w:rPr>
+          <w:rFonts w:ascii="Arial" w:cs="Arial" w:eastAsia="Arial" w:hAnsi="Arial"/>
+        </w:rPr>
+        <w:t xml:space="preserve">What this is for</w:t>
+      </w:r>
+    </w:p>
+    <w:p>
+      <w:pPr>
+        <w:spacing w:after="120"/>
+      </w:pPr>
+      <w:r>
+        <w:rPr>
+          <w:rFonts w:ascii="Arial" w:cs="Arial" w:eastAsia="Arial" w:hAnsi="Arial"/>
+          <w:sz w:val="21"/>
+          <w:szCs w:val="21"/>
+        </w:rPr>
+        <w:t xml:space="preserve">Knowing which updates and settings this server needs before someone else finds out. Each server checks itself once a day (the check-security job) and whenever someone presses </w:t>
+      </w:r>
+      <w:r>
+        <w:rPr>
+          <w:rFonts w:ascii="Arial" w:cs="Arial" w:eastAsia="Arial" w:hAnsi="Arial"/>
+          <w:b/>
+          <w:bCs/>
+          <w:sz w:val="21"/>
+          <w:szCs w:val="21"/>
+        </w:rPr>
+        <w:t xml:space="preserve">Check Now</w:t>
+      </w:r>
+      <w:r>
+        <w:rPr>
+          <w:rFonts w:ascii="Arial" w:cs="Arial" w:eastAsia="Arial" w:hAnsi="Arial"/>
+          <w:sz w:val="21"/>
+          <w:szCs w:val="21"/>
+        </w:rPr>
+        <w:t xml:space="preserve">:</w:t>
+      </w:r>
+    </w:p>
+    <w:p>
+      <w:pPr>
+        <w:pStyle w:val="ListParagraph"/>
+        <w:numPr>
+          <w:ilvl w:val="0"/>
+          <w:numId w:val="2"/>
+        </w:numPr>
+        <w:spacing w:after="60"/>
+      </w:pPr>
+      <w:r>
+        <w:rPr>
+          <w:rFonts w:ascii="Arial" w:cs="Arial" w:eastAsia="Arial" w:hAnsi="Arial"/>
+          <w:b/>
+          <w:bCs/>
+          <w:sz w:val="21"/>
+          <w:szCs w:val="21"/>
+        </w:rPr>
+        <w:t xml:space="preserve">Packages:</w:t>
+      </w:r>
+      <w:r>
+        <w:rPr>
+          <w:rFonts w:ascii="Arial" w:cs="Arial" w:eastAsia="Arial" w:hAnsi="Arial"/>
+          <w:sz w:val="21"/>
+          <w:szCs w:val="21"/>
+        </w:rPr>
+        <w:t xml:space="preserve"> every Python package installed for the backend and every npm package in the deployed frontend (its package-lock.json) is looked up in OSV.dev, the open vulnerability database behind the GitHub, PyPI and npm advisories.</w:t>
+      </w:r>
+    </w:p>
+    <w:p>
+      <w:pPr>
+        <w:pStyle w:val="ListParagraph"/>
+        <w:numPr>
+          <w:ilvl w:val="0"/>
+          <w:numId w:val="2"/>
+        </w:numPr>
+        <w:spacing w:after="60"/>
+      </w:pPr>
+      <w:r>
+        <w:rPr>
+          <w:rFonts w:ascii="Arial" w:cs="Arial" w:eastAsia="Arial" w:hAnsi="Arial"/>
+          <w:b/>
+          <w:bCs/>
+          <w:sz w:val="21"/>
+          <w:szCs w:val="21"/>
+        </w:rPr>
+        <w:t xml:space="preserve">Server settings:</w:t>
+      </w:r>
+      <w:r>
+        <w:rPr>
+          <w:rFonts w:ascii="Arial" w:cs="Arial" w:eastAsia="Arial" w:hAnsi="Arial"/>
+          <w:sz w:val="21"/>
+          <w:szCs w:val="21"/>
+        </w:rPr>
+        <w:t xml:space="preserve"> Django's own deployment checks (debug mode, the signing key, allowed hosts, HTTPS-only cookies, HSTS, the HTTPS redirect) and whether the development web server (</w:t>
+      </w:r>
+      <w:r>
+        <w:rPr>
+          <w:rFonts w:ascii="Consolas" w:cs="Consolas" w:eastAsia="Consolas" w:hAnsi="Consolas"/>
+          <w:sz w:val="21"/>
+          <w:szCs w:val="21"/>
+        </w:rPr>
+        <w:t xml:space="preserve">manage.py runserver</w:t>
+      </w:r>
+      <w:r>
+        <w:rPr>
+          <w:rFonts w:ascii="Arial" w:cs="Arial" w:eastAsia="Arial" w:hAnsi="Arial"/>
+          <w:sz w:val="21"/>
+          <w:szCs w:val="21"/>
+        </w:rPr>
+        <w:t xml:space="preserve">) is serving the app.</w:t>
+      </w:r>
+    </w:p>
+    <w:p>
+      <w:pPr>
+        <w:pStyle w:val="ListParagraph"/>
+        <w:numPr>
+          <w:ilvl w:val="0"/>
+          <w:numId w:val="2"/>
+        </w:numPr>
+        <w:spacing w:after="60"/>
+      </w:pPr>
+      <w:r>
+        <w:rPr>
+          <w:rFonts w:ascii="Arial" w:cs="Arial" w:eastAsia="Arial" w:hAnsi="Arial"/>
+          <w:b/>
+          <w:bCs/>
+          <w:sz w:val="21"/>
+          <w:szCs w:val="21"/>
+        </w:rPr>
+        <w:t xml:space="preserve">Site headers:</w:t>
+      </w:r>
+      <w:r>
+        <w:rPr>
+          <w:rFonts w:ascii="Arial" w:cs="Arial" w:eastAsia="Arial" w:hAnsi="Arial"/>
+          <w:sz w:val="21"/>
+          <w:szCs w:val="21"/>
+        </w:rPr>
+        <w:t xml:space="preserve"> the headers the app's public address really sends: HSTS, Content-Security-Policy, nosniff, and whether other sites may frame it. Set the address in Global Parameters → </w:t>
+      </w:r>
+      <w:r>
+        <w:rPr>
+          <w:rFonts w:ascii="Consolas" w:cs="Consolas" w:eastAsia="Consolas" w:hAnsi="Consolas"/>
+          <w:sz w:val="21"/>
+          <w:szCs w:val="21"/>
+        </w:rPr>
+        <w:t xml:space="preserve">security.site_address</w:t>
+      </w:r>
+      <w:r>
+        <w:rPr>
+          <w:rFonts w:ascii="Arial" w:cs="Arial" w:eastAsia="Arial" w:hAnsi="Arial"/>
+          <w:sz w:val="21"/>
+          <w:szCs w:val="21"/>
+        </w:rPr>
+        <w:t xml:space="preserve"> (for example </w:t>
+      </w:r>
+      <w:r>
+        <w:rPr>
+          <w:rFonts w:ascii="Consolas" w:cs="Consolas" w:eastAsia="Consolas" w:hAnsi="Consolas"/>
+          <w:sz w:val="21"/>
+          <w:szCs w:val="21"/>
+        </w:rPr>
+        <w:t xml:space="preserve">https://cepdev.aiintelekt.com</w:t>
+      </w:r>
+      <w:r>
+        <w:rPr>
+          <w:rFonts w:ascii="Arial" w:cs="Arial" w:eastAsia="Arial" w:hAnsi="Arial"/>
+          <w:sz w:val="21"/>
+          <w:szCs w:val="21"/>
+        </w:rPr>
+        <w:t xml:space="preserve">); while it is empty the headers are not checked.</w:t>
+      </w:r>
+    </w:p>
+    <w:p>
+      <w:pPr>
+        <w:spacing w:after="120"/>
+      </w:pPr>
+      <w:r>
+        <w:rPr>
+          <w:rFonts w:ascii="Arial" w:cs="Arial" w:eastAsia="Arial" w:hAnsi="Arial"/>
+          <w:sz w:val="21"/>
+          <w:szCs w:val="21"/>
+        </w:rPr>
+        <w:t xml:space="preserve">The page never installs or changes anything. A package is updated with a deploy and a setting on the server; the next check marks the item </w:t>
+      </w:r>
+      <w:r>
+        <w:rPr>
+          <w:rFonts w:ascii="Arial" w:cs="Arial" w:eastAsia="Arial" w:hAnsi="Arial"/>
+          <w:b/>
+          <w:bCs/>
+          <w:sz w:val="21"/>
+          <w:szCs w:val="21"/>
+        </w:rPr>
+        <w:t xml:space="preserve">Fixed</w:t>
+      </w:r>
+      <w:r>
+        <w:rPr>
+          <w:rFonts w:ascii="Arial" w:cs="Arial" w:eastAsia="Arial" w:hAnsi="Arial"/>
+          <w:sz w:val="21"/>
+          <w:szCs w:val="21"/>
+        </w:rPr>
+        <w:t xml:space="preserve"> and the check history says so.</w:t>
+      </w:r>
+    </w:p>
+    <w:p>
+      <w:pPr>
+        <w:pStyle w:val="Heading2"/>
+        <w:spacing w:after="120" w:before="240"/>
+      </w:pPr>
+      <w:r>
+        <w:rPr>
+          <w:rFonts w:ascii="Arial" w:cs="Arial" w:eastAsia="Arial" w:hAnsi="Arial"/>
+        </w:rPr>
+        <w:t xml:space="preserve">Who can use it</w:t>
+      </w:r>
+    </w:p>
+    <w:p>
+      <w:pPr>
+        <w:spacing w:after="120"/>
+      </w:pPr>
+      <w:r>
+        <w:rPr>
+          <w:rFonts w:ascii="Arial" w:cs="Arial" w:eastAsia="Arial" w:hAnsi="Arial"/>
+          <w:sz w:val="21"/>
+          <w:szCs w:val="21"/>
+        </w:rPr>
+        <w:t xml:space="preserve">Platform staff see the page. Accepting a risk and reopening an accepted item need a platform administrator.</w:t>
+      </w:r>
+    </w:p>
+    <w:p>
+      <w:pPr>
+        <w:pStyle w:val="Heading2"/>
+        <w:spacing w:after="120" w:before="240"/>
+      </w:pPr>
+      <w:r>
+        <w:rPr>
+          <w:rFonts w:ascii="Arial" w:cs="Arial" w:eastAsia="Arial" w:hAnsi="Arial"/>
+        </w:rPr>
+        <w:t xml:space="preserve">Step by step</w:t>
+      </w:r>
+    </w:p>
+    <w:p>
+      <w:pPr>
+        <w:spacing w:after="120"/>
+      </w:pPr>
+      <w:r>
+        <w:rPr>
+          <w:rFonts w:ascii="Arial" w:cs="Arial" w:eastAsia="Arial" w:hAnsi="Arial"/>
+          <w:b/>
+          <w:bCs/>
+          <w:sz w:val="21"/>
+          <w:szCs w:val="21"/>
+        </w:rPr>
+        <w:t xml:space="preserve">See what needs updating</w:t>
+      </w:r>
+    </w:p>
+    <w:p>
+      <w:pPr>
+        <w:pStyle w:val="ListParagraph"/>
+        <w:numPr>
+          <w:ilvl w:val="0"/>
+          <w:numId w:val="3"/>
+        </w:numPr>
+        <w:spacing w:after="60"/>
+      </w:pPr>
+      <w:r>
+        <w:rPr>
+          <w:rFonts w:ascii="Arial" w:cs="Arial" w:eastAsia="Arial" w:hAnsi="Arial"/>
+          <w:sz w:val="21"/>
+          <w:szCs w:val="21"/>
+        </w:rPr>
+        <w:t xml:space="preserve">Open </w:t>
+      </w:r>
+      <w:r>
+        <w:rPr>
+          <w:rFonts w:ascii="Arial" w:cs="Arial" w:eastAsia="Arial" w:hAnsi="Arial"/>
+          <w:b/>
+          <w:bCs/>
+          <w:sz w:val="21"/>
+          <w:szCs w:val="21"/>
+        </w:rPr>
+        <w:t xml:space="preserve">Overview → Security</w:t>
+      </w:r>
+      <w:r>
+        <w:rPr>
+          <w:rFonts w:ascii="Arial" w:cs="Arial" w:eastAsia="Arial" w:hAnsi="Arial"/>
+          <w:sz w:val="21"/>
+          <w:szCs w:val="21"/>
+        </w:rPr>
+        <w:t xml:space="preserve">. The figures say how many items are open (Critical and High, Medium and Low), how many are accepted, and how many packages were checked.</w:t>
+      </w:r>
+    </w:p>
+    <w:p>
+      <w:pPr>
+        <w:pStyle w:val="ListParagraph"/>
+        <w:numPr>
+          <w:ilvl w:val="0"/>
+          <w:numId w:val="3"/>
+        </w:numPr>
+        <w:spacing w:after="60"/>
+      </w:pPr>
+      <w:r>
+        <w:rPr>
+          <w:rFonts w:ascii="Arial" w:cs="Arial" w:eastAsia="Arial" w:hAnsi="Arial"/>
+          <w:b/>
+          <w:bCs/>
+          <w:sz w:val="21"/>
+          <w:szCs w:val="21"/>
+        </w:rPr>
+        <w:t xml:space="preserve">Needs Attention</w:t>
+      </w:r>
+      <w:r>
+        <w:rPr>
+          <w:rFonts w:ascii="Arial" w:cs="Arial" w:eastAsia="Arial" w:hAnsi="Arial"/>
+          <w:sz w:val="21"/>
+          <w:szCs w:val="21"/>
+        </w:rPr>
+        <w:t xml:space="preserve"> lists every open item, worst first, packages and settings together: the severity, the item and why it matters, where it is (Backend · Python, Frontend · npm, Server setting, Site header), what is installed and what fixes it, the advisory, and when it was first seen.</w:t>
+      </w:r>
+    </w:p>
+    <w:p>
+      <w:pPr>
+        <w:pStyle w:val="ListParagraph"/>
+        <w:numPr>
+          <w:ilvl w:val="0"/>
+          <w:numId w:val="3"/>
+        </w:numPr>
+        <w:spacing w:after="60"/>
+      </w:pPr>
+      <w:r>
+        <w:rPr>
+          <w:rFonts w:ascii="Arial" w:cs="Arial" w:eastAsia="Arial" w:hAnsi="Arial"/>
+          <w:sz w:val="21"/>
+          <w:szCs w:val="21"/>
+        </w:rPr>
+        <w:t xml:space="preserve">Press the advisory to read it (GitHub or OSV.dev for a package, Django's documentation for a setting).</w:t>
+      </w:r>
+    </w:p>
+    <w:p>
+      <w:pPr>
+        <w:pStyle w:val="ListParagraph"/>
+        <w:numPr>
+          <w:ilvl w:val="0"/>
+          <w:numId w:val="3"/>
+        </w:numPr>
+        <w:spacing w:after="60"/>
+      </w:pPr>
+      <w:r>
+        <w:rPr>
+          <w:rFonts w:ascii="Arial" w:cs="Arial" w:eastAsia="Arial" w:hAnsi="Arial"/>
+          <w:sz w:val="21"/>
+          <w:szCs w:val="21"/>
+        </w:rPr>
+        <w:t xml:space="preserve">An npm package marked </w:t>
+      </w:r>
+      <w:r>
+        <w:rPr>
+          <w:rFonts w:ascii="Arial" w:cs="Arial" w:eastAsia="Arial" w:hAnsi="Arial"/>
+          <w:b/>
+          <w:bCs/>
+          <w:sz w:val="21"/>
+          <w:szCs w:val="21"/>
+        </w:rPr>
+        <w:t xml:space="preserve">Build-time only</w:t>
+      </w:r>
+      <w:r>
+        <w:rPr>
+          <w:rFonts w:ascii="Arial" w:cs="Arial" w:eastAsia="Arial" w:hAnsi="Arial"/>
+          <w:sz w:val="21"/>
+          <w:szCs w:val="21"/>
+        </w:rPr>
+        <w:t xml:space="preserve"> is used while the frontend is built and never reaches a browser.</w:t>
+      </w:r>
+    </w:p>
+    <w:p>
+      <w:pPr>
+        <w:spacing w:after="120"/>
+      </w:pPr>
+      <w:r>
+        <w:rPr>
+          <w:rFonts w:ascii="Arial" w:cs="Arial" w:eastAsia="Arial" w:hAnsi="Arial"/>
+          <w:b/>
+          <w:bCs/>
+          <w:sz w:val="21"/>
+          <w:szCs w:val="21"/>
+        </w:rPr>
+        <w:t xml:space="preserve">Check now</w:t>
+      </w:r>
+    </w:p>
+    <w:p>
+      <w:pPr>
+        <w:pStyle w:val="ListParagraph"/>
+        <w:numPr>
+          <w:ilvl w:val="0"/>
+          <w:numId w:val="3"/>
+        </w:numPr>
+        <w:spacing w:after="60"/>
+      </w:pPr>
+      <w:r>
+        <w:rPr>
+          <w:rFonts w:ascii="Arial" w:cs="Arial" w:eastAsia="Arial" w:hAnsi="Arial"/>
+          <w:sz w:val="21"/>
+          <w:szCs w:val="21"/>
+        </w:rPr>
+        <w:t xml:space="preserve">Press </w:t>
+      </w:r>
+      <w:r>
+        <w:rPr>
+          <w:rFonts w:ascii="Arial" w:cs="Arial" w:eastAsia="Arial" w:hAnsi="Arial"/>
+          <w:b/>
+          <w:bCs/>
+          <w:sz w:val="21"/>
+          <w:szCs w:val="21"/>
+        </w:rPr>
+        <w:t xml:space="preserve">Check Now</w:t>
+      </w:r>
+      <w:r>
+        <w:rPr>
+          <w:rFonts w:ascii="Arial" w:cs="Arial" w:eastAsia="Arial" w:hAnsi="Arial"/>
+          <w:sz w:val="21"/>
+          <w:szCs w:val="21"/>
+        </w:rPr>
+        <w:t xml:space="preserve"> at the top right. The check takes a few seconds; the message says how many items are open and how many were fixed since the check before.</w:t>
+      </w:r>
+    </w:p>
+    <w:p>
+      <w:pPr>
+        <w:pStyle w:val="ListParagraph"/>
+        <w:numPr>
+          <w:ilvl w:val="0"/>
+          <w:numId w:val="3"/>
+        </w:numPr>
+        <w:spacing w:after="60"/>
+      </w:pPr>
+      <w:r>
+        <w:rPr>
+          <w:rFonts w:ascii="Arial" w:cs="Arial" w:eastAsia="Arial" w:hAnsi="Arial"/>
+          <w:sz w:val="21"/>
+          <w:szCs w:val="21"/>
+        </w:rPr>
+        <w:t xml:space="preserve">If OSV.dev cannot be reached, the settings are still checked; the packages keep their earlier findings and the page says so.</w:t>
+      </w:r>
+    </w:p>
+    <w:p>
+      <w:pPr>
+        <w:spacing w:after="120"/>
+      </w:pPr>
+      <w:r>
+        <w:rPr>
+          <w:rFonts w:ascii="Arial" w:cs="Arial" w:eastAsia="Arial" w:hAnsi="Arial"/>
+          <w:b/>
+          <w:bCs/>
+          <w:sz w:val="21"/>
+          <w:szCs w:val="21"/>
+        </w:rPr>
+        <w:t xml:space="preserve">Accept the risk</w:t>
+      </w:r>
+    </w:p>
+    <w:p>
+      <w:pPr>
+        <w:pStyle w:val="ListParagraph"/>
+        <w:numPr>
+          <w:ilvl w:val="0"/>
+          <w:numId w:val="3"/>
+        </w:numPr>
+        <w:spacing w:after="60"/>
+      </w:pPr>
+      <w:r>
+        <w:rPr>
+          <w:rFonts w:ascii="Arial" w:cs="Arial" w:eastAsia="Arial" w:hAnsi="Arial"/>
+          <w:sz w:val="21"/>
+          <w:szCs w:val="21"/>
+        </w:rPr>
+        <w:t xml:space="preserve">On an open item, press </w:t>
+      </w:r>
+      <w:r>
+        <w:rPr>
+          <w:rFonts w:ascii="Arial" w:cs="Arial" w:eastAsia="Arial" w:hAnsi="Arial"/>
+          <w:b/>
+          <w:bCs/>
+          <w:sz w:val="21"/>
+          <w:szCs w:val="21"/>
+        </w:rPr>
+        <w:t xml:space="preserve">Accept…</w:t>
+      </w:r>
+      <w:r>
+        <w:rPr>
+          <w:rFonts w:ascii="Arial" w:cs="Arial" w:eastAsia="Arial" w:hAnsi="Arial"/>
+          <w:sz w:val="21"/>
+          <w:szCs w:val="21"/>
+        </w:rPr>
+        <w:t xml:space="preserve">.</w:t>
+      </w:r>
+    </w:p>
+    <w:p>
+      <w:pPr>
+        <w:pStyle w:val="ListParagraph"/>
+        <w:numPr>
+          <w:ilvl w:val="0"/>
+          <w:numId w:val="3"/>
+        </w:numPr>
+        <w:spacing w:after="60"/>
+      </w:pPr>
+      <w:r>
+        <w:rPr>
+          <w:rFonts w:ascii="Arial" w:cs="Arial" w:eastAsia="Arial" w:hAnsi="Arial"/>
+          <w:sz w:val="21"/>
+          <w:szCs w:val="21"/>
+        </w:rPr>
+        <w:t xml:space="preserve">Write why the risk is acceptable in a sentence (for example, a build-time package, or a setting the proxy in front already covers), and choose a </w:t>
+      </w:r>
+      <w:r>
+        <w:rPr>
+          <w:rFonts w:ascii="Arial" w:cs="Arial" w:eastAsia="Arial" w:hAnsi="Arial"/>
+          <w:b/>
+          <w:bCs/>
+          <w:sz w:val="21"/>
+          <w:szCs w:val="21"/>
+        </w:rPr>
+        <w:t xml:space="preserve">Review On</w:t>
+      </w:r>
+      <w:r>
+        <w:rPr>
+          <w:rFonts w:ascii="Arial" w:cs="Arial" w:eastAsia="Arial" w:hAnsi="Arial"/>
+          <w:sz w:val="21"/>
+          <w:szCs w:val="21"/>
+        </w:rPr>
+        <w:t xml:space="preserve"> date within a year.</w:t>
+      </w:r>
+    </w:p>
+    <w:p>
+      <w:pPr>
+        <w:pStyle w:val="ListParagraph"/>
+        <w:numPr>
+          <w:ilvl w:val="0"/>
+          <w:numId w:val="3"/>
+        </w:numPr>
+        <w:spacing w:after="60"/>
+      </w:pPr>
+      <w:r>
+        <w:rPr>
+          <w:rFonts w:ascii="Arial" w:cs="Arial" w:eastAsia="Arial" w:hAnsi="Arial"/>
+          <w:sz w:val="21"/>
+          <w:szCs w:val="21"/>
+        </w:rPr>
+        <w:t xml:space="preserve">Press </w:t>
+      </w:r>
+      <w:r>
+        <w:rPr>
+          <w:rFonts w:ascii="Arial" w:cs="Arial" w:eastAsia="Arial" w:hAnsi="Arial"/>
+          <w:b/>
+          <w:bCs/>
+          <w:sz w:val="21"/>
+          <w:szCs w:val="21"/>
+        </w:rPr>
+        <w:t xml:space="preserve">Accept the Risk</w:t>
+      </w:r>
+      <w:r>
+        <w:rPr>
+          <w:rFonts w:ascii="Arial" w:cs="Arial" w:eastAsia="Arial" w:hAnsi="Arial"/>
+          <w:sz w:val="21"/>
+          <w:szCs w:val="21"/>
+        </w:rPr>
+        <w:t xml:space="preserve">. The item leaves the count and shows under </w:t>
+      </w:r>
+      <w:r>
+        <w:rPr>
+          <w:rFonts w:ascii="Arial" w:cs="Arial" w:eastAsia="Arial" w:hAnsi="Arial"/>
+          <w:b/>
+          <w:bCs/>
+          <w:sz w:val="21"/>
+          <w:szCs w:val="21"/>
+        </w:rPr>
+        <w:t xml:space="preserve">Accepted</w:t>
+      </w:r>
+      <w:r>
+        <w:rPr>
+          <w:rFonts w:ascii="Arial" w:cs="Arial" w:eastAsia="Arial" w:hAnsi="Arial"/>
+          <w:sz w:val="21"/>
+          <w:szCs w:val="21"/>
+        </w:rPr>
+        <w:t xml:space="preserve">, with who accepted it, why and until when.</w:t>
+      </w:r>
+    </w:p>
+    <w:p>
+      <w:pPr>
+        <w:pStyle w:val="ListParagraph"/>
+        <w:numPr>
+          <w:ilvl w:val="0"/>
+          <w:numId w:val="3"/>
+        </w:numPr>
+        <w:spacing w:after="60"/>
+      </w:pPr>
+      <w:r>
+        <w:rPr>
+          <w:rFonts w:ascii="Arial" w:cs="Arial" w:eastAsia="Arial" w:hAnsi="Arial"/>
+          <w:sz w:val="21"/>
+          <w:szCs w:val="21"/>
+        </w:rPr>
+        <w:t xml:space="preserve">It opens again on its review date, or as soon as an advisory appears that was not there when it was accepted. Press </w:t>
+      </w:r>
+      <w:r>
+        <w:rPr>
+          <w:rFonts w:ascii="Arial" w:cs="Arial" w:eastAsia="Arial" w:hAnsi="Arial"/>
+          <w:b/>
+          <w:bCs/>
+          <w:sz w:val="21"/>
+          <w:szCs w:val="21"/>
+        </w:rPr>
+        <w:t xml:space="preserve">Reopen</w:t>
+      </w:r>
+      <w:r>
+        <w:rPr>
+          <w:rFonts w:ascii="Arial" w:cs="Arial" w:eastAsia="Arial" w:hAnsi="Arial"/>
+          <w:sz w:val="21"/>
+          <w:szCs w:val="21"/>
+        </w:rPr>
+        <w:t xml:space="preserve"> under Accepted to open it earlier.</w:t>
+      </w:r>
+    </w:p>
+    <w:p>
+      <w:pPr>
+        <w:spacing w:after="120"/>
+      </w:pPr>
+      <w:r>
+        <w:rPr>
+          <w:rFonts w:ascii="Arial" w:cs="Arial" w:eastAsia="Arial" w:hAnsi="Arial"/>
+          <w:b/>
+          <w:bCs/>
+          <w:sz w:val="21"/>
+          <w:szCs w:val="21"/>
+        </w:rPr>
+        <w:t xml:space="preserve">See what passed and the history</w:t>
+      </w:r>
+    </w:p>
+    <w:p>
+      <w:pPr>
+        <w:pStyle w:val="ListParagraph"/>
+        <w:numPr>
+          <w:ilvl w:val="0"/>
+          <w:numId w:val="3"/>
+        </w:numPr>
+        <w:spacing w:after="60"/>
+      </w:pPr>
+      <w:r>
+        <w:rPr>
+          <w:rFonts w:ascii="Arial" w:cs="Arial" w:eastAsia="Arial" w:hAnsi="Arial"/>
+          <w:b/>
+          <w:bCs/>
+          <w:sz w:val="21"/>
+          <w:szCs w:val="21"/>
+        </w:rPr>
+        <w:t xml:space="preserve">Passed</w:t>
+      </w:r>
+      <w:r>
+        <w:rPr>
+          <w:rFonts w:ascii="Arial" w:cs="Arial" w:eastAsia="Arial" w:hAnsi="Arial"/>
+          <w:sz w:val="21"/>
+          <w:szCs w:val="21"/>
+        </w:rPr>
+        <w:t xml:space="preserve"> lists the packages with no known advisories (Python and npm) and every setting and header that passes.</w:t>
+      </w:r>
+    </w:p>
+    <w:p>
+      <w:pPr>
+        <w:pStyle w:val="ListParagraph"/>
+        <w:numPr>
+          <w:ilvl w:val="0"/>
+          <w:numId w:val="3"/>
+        </w:numPr>
+        <w:spacing w:after="60"/>
+      </w:pPr>
+      <w:r>
+        <w:rPr>
+          <w:rFonts w:ascii="Arial" w:cs="Arial" w:eastAsia="Arial" w:hAnsi="Arial"/>
+          <w:b/>
+          <w:bCs/>
+          <w:sz w:val="21"/>
+          <w:szCs w:val="21"/>
+        </w:rPr>
+        <w:t xml:space="preserve">Checks · last 30 days</w:t>
+      </w:r>
+      <w:r>
+        <w:rPr>
+          <w:rFonts w:ascii="Arial" w:cs="Arial" w:eastAsia="Arial" w:hAnsi="Arial"/>
+          <w:sz w:val="21"/>
+          <w:szCs w:val="21"/>
+        </w:rPr>
+        <w:t xml:space="preserve"> lists every check: when, by the daily job or by whom, how many packages, what was open after it, and what it found fixed.</w:t>
+      </w:r>
+    </w:p>
+    <w:p>
+      <w:pPr>
+        <w:pStyle w:val="Heading2"/>
+        <w:spacing w:after="120" w:before="240"/>
+      </w:pPr>
+      <w:r>
+        <w:rPr>
+          <w:rFonts w:ascii="Arial" w:cs="Arial" w:eastAsia="Arial" w:hAnsi="Arial"/>
+        </w:rPr>
+        <w:t xml:space="preserve">Severity</w:t>
+      </w:r>
+    </w:p>
+    <w:tbl>
+      <w:tblPr>
+        <w:tblW w:type="dxa" w:w="10080"/>
+        <w:tblBorders>
+          <w:top w:val="single" w:color="D9DBE3" w:sz="4"/>
+          <w:left w:val="none"/>
+          <w:bottom w:val="single" w:color="D9DBE3" w:sz="4"/>
+          <w:right w:val="none"/>
+          <w:insideH w:val="single" w:color="E6E8EF" w:sz="4"/>
+          <w:insideV w:val="none"/>
+        </w:tblBorders>
+      </w:tblPr>
+      <w:tblGrid>
+        <w:gridCol w:w="2600"/>
+        <w:gridCol w:w="7480"/>
+      </w:tblGrid>
+      <w:tr>
+        <w:trPr>
+          <w:tblHeader/>
+        </w:trPr>
+        <w:tc>
+          <w:tcPr>
+            <w:tcW w:type="dxa" w:w="2600"/>
+            <w:shd w:fill="EEEFF5" w:color="auto" w:val="clear"/>
+            <w:tcMar>
+              <w:top w:type="dxa" w:w="60"/>
+              <w:left w:type="dxa" w:w="90"/>
+              <w:bottom w:type="dxa" w:w="60"/>
+              <w:right w:type="dxa" w:w="90"/>
+            </w:tcMar>
+          </w:tcPr>
+          <w:p>
+            <w:r>
+              <w:rPr>
+                <w:rFonts w:ascii="Arial" w:cs="Arial" w:eastAsia="Arial" w:hAnsi="Arial"/>
+                <w:b/>
+                <w:bCs/>
+                <w:sz w:val="18"/>
+                <w:szCs w:val="18"/>
+              </w:rPr>
+              <w:t xml:space="preserve">Severity</w:t>
+            </w:r>
+          </w:p>
+        </w:tc>
+        <w:tc>
+          <w:tcPr>
+            <w:tcW w:type="dxa" w:w="7480"/>
+            <w:shd w:fill="EEEFF5" w:color="auto" w:val="clear"/>
+            <w:tcMar>
+              <w:top w:type="dxa" w:w="60"/>
+              <w:left w:type="dxa" w:w="90"/>
+              <w:bottom w:type="dxa" w:w="60"/>
+              <w:right w:type="dxa" w:w="90"/>
+            </w:tcMar>
+          </w:tcPr>
+          <w:p>
+            <w:r>
+              <w:rPr>
+                <w:rFonts w:ascii="Arial" w:cs="Arial" w:eastAsia="Arial" w:hAnsi="Arial"/>
+                <w:b/>
+                <w:bCs/>
+                <w:sz w:val="18"/>
+                <w:szCs w:val="18"/>
+              </w:rPr>
+              <w:t xml:space="preserve">Meaning</w:t>
+            </w:r>
+          </w:p>
+        </w:tc>
+      </w:tr>
+      <w:tr>
+        <w:tc>
+          <w:tcPr>
+            <w:tcW w:type="dxa" w:w="2600"/>
+            <w:tcMar>
+              <w:top w:type="dxa" w:w="60"/>
+              <w:left w:type="dxa" w:w="90"/>
+              <w:bottom w:type="dxa" w:w="60"/>
+              <w:right w:type="dxa" w:w="90"/>
+            </w:tcMar>
+          </w:tcPr>
+          <w:p>
+            <w:r>
+              <w:rPr>
+                <w:rFonts w:ascii="Arial" w:cs="Arial" w:eastAsia="Arial" w:hAnsi="Arial"/>
+                <w:sz w:val="19"/>
+                <w:szCs w:val="19"/>
+              </w:rPr>
+              <w:t xml:space="preserve">Critical</w:t>
+            </w:r>
+          </w:p>
+        </w:tc>
+        <w:tc>
+          <w:tcPr>
+            <w:tcW w:type="dxa" w:w="7480"/>
+            <w:tcMar>
+              <w:top w:type="dxa" w:w="60"/>
+              <w:left w:type="dxa" w:w="90"/>
+              <w:bottom w:type="dxa" w:w="60"/>
+              <w:right w:type="dxa" w:w="90"/>
+            </w:tcMar>
+          </w:tcPr>
+          <w:p>
+            <w:r>
+              <w:rPr>
+                <w:rFonts w:ascii="Arial" w:cs="Arial" w:eastAsia="Arial" w:hAnsi="Arial"/>
+                <w:sz w:val="19"/>
+                <w:szCs w:val="19"/>
+              </w:rPr>
+              <w:t xml:space="preserve">Fix now: for example a weak signing key, or a package advisory rated critical.</w:t>
+            </w:r>
+          </w:p>
+        </w:tc>
+      </w:tr>
+      <w:tr>
+        <w:tc>
+          <w:tcPr>
+            <w:tcW w:type="dxa" w:w="2600"/>
+            <w:tcMar>
+              <w:top w:type="dxa" w:w="60"/>
+              <w:left w:type="dxa" w:w="90"/>
+              <w:bottom w:type="dxa" w:w="60"/>
+              <w:right w:type="dxa" w:w="90"/>
+            </w:tcMar>
+          </w:tcPr>
+          <w:p>
+            <w:r>
+              <w:rPr>
+                <w:rFonts w:ascii="Arial" w:cs="Arial" w:eastAsia="Arial" w:hAnsi="Arial"/>
+                <w:sz w:val="19"/>
+                <w:szCs w:val="19"/>
+              </w:rPr>
+              <w:t xml:space="preserve">High</w:t>
+            </w:r>
+          </w:p>
+        </w:tc>
+        <w:tc>
+          <w:tcPr>
+            <w:tcW w:type="dxa" w:w="7480"/>
+            <w:tcMar>
+              <w:top w:type="dxa" w:w="60"/>
+              <w:left w:type="dxa" w:w="90"/>
+              <w:bottom w:type="dxa" w:w="60"/>
+              <w:right w:type="dxa" w:w="90"/>
+            </w:tcMar>
+          </w:tcPr>
+          <w:p>
+            <w:r>
+              <w:rPr>
+                <w:rFonts w:ascii="Arial" w:cs="Arial" w:eastAsia="Arial" w:hAnsi="Arial"/>
+                <w:sz w:val="19"/>
+                <w:szCs w:val="19"/>
+              </w:rPr>
+              <w:t xml:space="preserve">Fix soon: debug mode on, the development web server serving, a session cookie sent over HTTP, a high-rated advisory.</w:t>
+            </w:r>
+          </w:p>
+        </w:tc>
+      </w:tr>
+      <w:tr>
+        <w:tc>
+          <w:tcPr>
+            <w:tcW w:type="dxa" w:w="2600"/>
+            <w:tcMar>
+              <w:top w:type="dxa" w:w="60"/>
+              <w:left w:type="dxa" w:w="90"/>
+              <w:bottom w:type="dxa" w:w="60"/>
+              <w:right w:type="dxa" w:w="90"/>
+            </w:tcMar>
+          </w:tcPr>
+          <w:p>
+            <w:r>
+              <w:rPr>
+                <w:rFonts w:ascii="Arial" w:cs="Arial" w:eastAsia="Arial" w:hAnsi="Arial"/>
+                <w:sz w:val="19"/>
+                <w:szCs w:val="19"/>
+              </w:rPr>
+              <w:t xml:space="preserve">Medium</w:t>
+            </w:r>
+          </w:p>
+        </w:tc>
+        <w:tc>
+          <w:tcPr>
+            <w:tcW w:type="dxa" w:w="7480"/>
+            <w:tcMar>
+              <w:top w:type="dxa" w:w="60"/>
+              <w:left w:type="dxa" w:w="90"/>
+              <w:bottom w:type="dxa" w:w="60"/>
+              <w:right w:type="dxa" w:w="90"/>
+            </w:tcMar>
+          </w:tcPr>
+          <w:p>
+            <w:r>
+              <w:rPr>
+                <w:rFonts w:ascii="Arial" w:cs="Arial" w:eastAsia="Arial" w:hAnsi="Arial"/>
+                <w:sz w:val="19"/>
+                <w:szCs w:val="19"/>
+              </w:rPr>
+              <w:t xml:space="preserve">Plan the fix: missing HSTS or Content-Security-Policy, a moderate advisory, an advisory its database did not rate.</w:t>
+            </w:r>
+          </w:p>
+        </w:tc>
+      </w:tr>
+      <w:tr>
+        <w:tc>
+          <w:tcPr>
+            <w:tcW w:type="dxa" w:w="2600"/>
+            <w:tcMar>
+              <w:top w:type="dxa" w:w="60"/>
+              <w:left w:type="dxa" w:w="90"/>
+              <w:bottom w:type="dxa" w:w="60"/>
+              <w:right w:type="dxa" w:w="90"/>
+            </w:tcMar>
+          </w:tcPr>
+          <w:p>
+            <w:r>
+              <w:rPr>
+                <w:rFonts w:ascii="Arial" w:cs="Arial" w:eastAsia="Arial" w:hAnsi="Arial"/>
+                <w:sz w:val="19"/>
+                <w:szCs w:val="19"/>
+              </w:rPr>
+              <w:t xml:space="preserve">Low</w:t>
+            </w:r>
+          </w:p>
+        </w:tc>
+        <w:tc>
+          <w:tcPr>
+            <w:tcW w:type="dxa" w:w="7480"/>
+            <w:tcMar>
+              <w:top w:type="dxa" w:w="60"/>
+              <w:left w:type="dxa" w:w="90"/>
+              <w:bottom w:type="dxa" w:w="60"/>
+              <w:right w:type="dxa" w:w="90"/>
+            </w:tcMar>
+          </w:tcPr>
+          <w:p>
+            <w:r>
+              <w:rPr>
+                <w:rFonts w:ascii="Arial" w:cs="Arial" w:eastAsia="Arial" w:hAnsi="Arial"/>
+                <w:sz w:val="19"/>
+                <w:szCs w:val="19"/>
+              </w:rPr>
+              <w:t xml:space="preserve">Note it: a low-rated advisory, nosniff missing, the HTTPS redirect left to the proxy.</w:t>
+            </w:r>
+          </w:p>
+        </w:tc>
+      </w:tr>
+    </w:tbl>
+    <w:p>
+      <w:pPr>
+        <w:spacing w:after="120"/>
+      </w:pPr>
+    </w:p>
+    <w:p>
+      <w:pPr>
+        <w:spacing w:after="120"/>
+      </w:pPr>
+      <w:r>
+        <w:rPr>
+          <w:rFonts w:ascii="Arial" w:cs="Arial" w:eastAsia="Arial" w:hAnsi="Arial"/>
+          <w:sz w:val="21"/>
+          <w:szCs w:val="21"/>
+        </w:rPr>
+        <w:t xml:space="preserve">Package severities come from the advisory (GitHub's rating, or the rating of the GitHub twin of a PyPI advisory).</w:t>
+      </w:r>
+    </w:p>
+    <w:p>
+      <w:pPr>
+        <w:pStyle w:val="Heading2"/>
+        <w:spacing w:after="120" w:before="240"/>
+      </w:pPr>
+      <w:r>
+        <w:rPr>
+          <w:rFonts w:ascii="Arial" w:cs="Arial" w:eastAsia="Arial" w:hAnsi="Arial"/>
+        </w:rPr>
+        <w:t xml:space="preserve">When something does not work</w:t>
+      </w:r>
+    </w:p>
+    <w:tbl>
+      <w:tblPr>
+        <w:tblW w:type="dxa" w:w="10080"/>
+        <w:tblBorders>
+          <w:top w:val="single" w:color="D9DBE3" w:sz="4"/>
+          <w:left w:val="none"/>
+          <w:bottom w:val="single" w:color="D9DBE3" w:sz="4"/>
+          <w:right w:val="none"/>
+          <w:insideH w:val="single" w:color="E6E8EF" w:sz="4"/>
+          <w:insideV w:val="none"/>
+        </w:tblBorders>
+      </w:tblPr>
+      <w:tblGrid>
+        <w:gridCol w:w="2600"/>
+        <w:gridCol w:w="7480"/>
+      </w:tblGrid>
+      <w:tr>
+        <w:trPr>
+          <w:tblHeader/>
+        </w:trPr>
+        <w:tc>
+          <w:tcPr>
+            <w:tcW w:type="dxa" w:w="2600"/>
+            <w:shd w:fill="EEEFF5" w:color="auto" w:val="clear"/>
+            <w:tcMar>
+              <w:top w:type="dxa" w:w="60"/>
+              <w:left w:type="dxa" w:w="90"/>
+              <w:bottom w:type="dxa" w:w="60"/>
+              <w:right w:type="dxa" w:w="90"/>
+            </w:tcMar>
+          </w:tcPr>
+          <w:p>
+            <w:r>
+              <w:rPr>
+                <w:rFonts w:ascii="Arial" w:cs="Arial" w:eastAsia="Arial" w:hAnsi="Arial"/>
+                <w:b/>
+                <w:bCs/>
+                <w:sz w:val="18"/>
+                <w:szCs w:val="18"/>
+              </w:rPr>
+              <w:t xml:space="preserve">What you see</w:t>
+            </w:r>
+          </w:p>
+        </w:tc>
+        <w:tc>
+          <w:tcPr>
+            <w:tcW w:type="dxa" w:w="7480"/>
+            <w:shd w:fill="EEEFF5" w:color="auto" w:val="clear"/>
+            <w:tcMar>
+              <w:top w:type="dxa" w:w="60"/>
+              <w:left w:type="dxa" w:w="90"/>
+              <w:bottom w:type="dxa" w:w="60"/>
+              <w:right w:type="dxa" w:w="90"/>
+            </w:tcMar>
+          </w:tcPr>
+          <w:p>
+            <w:r>
+              <w:rPr>
+                <w:rFonts w:ascii="Arial" w:cs="Arial" w:eastAsia="Arial" w:hAnsi="Arial"/>
+                <w:b/>
+                <w:bCs/>
+                <w:sz w:val="18"/>
+                <w:szCs w:val="18"/>
+              </w:rPr>
+              <w:t xml:space="preserve">What it means</w:t>
+            </w:r>
+          </w:p>
+        </w:tc>
+      </w:tr>
+      <w:tr>
+        <w:tc>
+          <w:tcPr>
+            <w:tcW w:type="dxa" w:w="2600"/>
+            <w:tcMar>
+              <w:top w:type="dxa" w:w="60"/>
+              <w:left w:type="dxa" w:w="90"/>
+              <w:bottom w:type="dxa" w:w="60"/>
+              <w:right w:type="dxa" w:w="90"/>
+            </w:tcMar>
+          </w:tcPr>
+          <w:p>
+            <w:r>
+              <w:rPr>
+                <w:rFonts w:ascii="Arial" w:cs="Arial" w:eastAsia="Arial" w:hAnsi="Arial"/>
+                <w:sz w:val="19"/>
+                <w:szCs w:val="19"/>
+              </w:rPr>
+              <w:t xml:space="preserve">The page says it needs a database update</w:t>
+            </w:r>
+          </w:p>
+        </w:tc>
+        <w:tc>
+          <w:tcPr>
+            <w:tcW w:type="dxa" w:w="7480"/>
+            <w:tcMar>
+              <w:top w:type="dxa" w:w="60"/>
+              <w:left w:type="dxa" w:w="90"/>
+              <w:bottom w:type="dxa" w:w="60"/>
+              <w:right w:type="dxa" w:w="90"/>
+            </w:tcMar>
+          </w:tcPr>
+          <w:p>
+            <w:r>
+              <w:rPr>
+                <w:rFonts w:ascii="Arial" w:cs="Arial" w:eastAsia="Arial" w:hAnsi="Arial"/>
+                <w:sz w:val="19"/>
+                <w:szCs w:val="19"/>
+              </w:rPr>
+              <w:t xml:space="preserve">Patch 0066 has not been applied on this server.</w:t>
+            </w:r>
+          </w:p>
+        </w:tc>
+      </w:tr>
+      <w:tr>
+        <w:tc>
+          <w:tcPr>
+            <w:tcW w:type="dxa" w:w="2600"/>
+            <w:tcMar>
+              <w:top w:type="dxa" w:w="60"/>
+              <w:left w:type="dxa" w:w="90"/>
+              <w:bottom w:type="dxa" w:w="60"/>
+              <w:right w:type="dxa" w:w="90"/>
+            </w:tcMar>
+          </w:tcPr>
+          <w:p>
+            <w:r>
+              <w:rPr>
+                <w:rFonts w:ascii="Arial" w:cs="Arial" w:eastAsia="Arial" w:hAnsi="Arial"/>
+                <w:sz w:val="19"/>
+                <w:szCs w:val="19"/>
+              </w:rPr>
+              <w:t xml:space="preserve">Not checked yet</w:t>
+            </w:r>
+          </w:p>
+        </w:tc>
+        <w:tc>
+          <w:tcPr>
+            <w:tcW w:type="dxa" w:w="7480"/>
+            <w:tcMar>
+              <w:top w:type="dxa" w:w="60"/>
+              <w:left w:type="dxa" w:w="90"/>
+              <w:bottom w:type="dxa" w:w="60"/>
+              <w:right w:type="dxa" w:w="90"/>
+            </w:tcMar>
+          </w:tcPr>
+          <w:p>
+            <w:r>
+              <w:rPr>
+                <w:rFonts w:ascii="Arial" w:cs="Arial" w:eastAsia="Arial" w:hAnsi="Arial"/>
+                <w:sz w:val="19"/>
+                <w:szCs w:val="19"/>
+              </w:rPr>
+              <w:t xml:space="preserve">No check has run: press Check Now, or wait for the daily job.</w:t>
+            </w:r>
+          </w:p>
+        </w:tc>
+      </w:tr>
+      <w:tr>
+        <w:tc>
+          <w:tcPr>
+            <w:tcW w:type="dxa" w:w="2600"/>
+            <w:tcMar>
+              <w:top w:type="dxa" w:w="60"/>
+              <w:left w:type="dxa" w:w="90"/>
+              <w:bottom w:type="dxa" w:w="60"/>
+              <w:right w:type="dxa" w:w="90"/>
+            </w:tcMar>
+          </w:tcPr>
+          <w:p>
+            <w:r>
+              <w:rPr>
+                <w:rFonts w:ascii="Arial" w:cs="Arial" w:eastAsia="Arial" w:hAnsi="Arial"/>
+                <w:sz w:val="19"/>
+                <w:szCs w:val="19"/>
+              </w:rPr>
+              <w:t xml:space="preserve">"OSV.dev could not be reached"</w:t>
+            </w:r>
+          </w:p>
+        </w:tc>
+        <w:tc>
+          <w:tcPr>
+            <w:tcW w:type="dxa" w:w="7480"/>
+            <w:tcMar>
+              <w:top w:type="dxa" w:w="60"/>
+              <w:left w:type="dxa" w:w="90"/>
+              <w:bottom w:type="dxa" w:w="60"/>
+              <w:right w:type="dxa" w:w="90"/>
+            </w:tcMar>
+          </w:tcPr>
+          <w:p>
+            <w:r>
+              <w:rPr>
+                <w:rFonts w:ascii="Arial" w:cs="Arial" w:eastAsia="Arial" w:hAnsi="Arial"/>
+                <w:sz w:val="19"/>
+                <w:szCs w:val="19"/>
+              </w:rPr>
+              <w:t xml:space="preserve">The server cannot reach api.osv.dev over HTTPS; allow it in the firewall.</w:t>
+            </w:r>
+          </w:p>
+        </w:tc>
+      </w:tr>
+      <w:tr>
+        <w:tc>
+          <w:tcPr>
+            <w:tcW w:type="dxa" w:w="2600"/>
+            <w:tcMar>
+              <w:top w:type="dxa" w:w="60"/>
+              <w:left w:type="dxa" w:w="90"/>
+              <w:bottom w:type="dxa" w:w="60"/>
+              <w:right w:type="dxa" w:w="90"/>
+            </w:tcMar>
+          </w:tcPr>
+          <w:p>
+            <w:r>
+              <w:rPr>
+                <w:rFonts w:ascii="Arial" w:cs="Arial" w:eastAsia="Arial" w:hAnsi="Arial"/>
+                <w:sz w:val="19"/>
+                <w:szCs w:val="19"/>
+              </w:rPr>
+              <w:t xml:space="preserve">The site could not be read</w:t>
+            </w:r>
+          </w:p>
+        </w:tc>
+        <w:tc>
+          <w:tcPr>
+            <w:tcW w:type="dxa" w:w="7480"/>
+            <w:tcMar>
+              <w:top w:type="dxa" w:w="60"/>
+              <w:left w:type="dxa" w:w="90"/>
+              <w:bottom w:type="dxa" w:w="60"/>
+              <w:right w:type="dxa" w:w="90"/>
+            </w:tcMar>
+          </w:tcPr>
+          <w:p>
+            <w:r>
+              <w:rPr>
+                <w:rFonts w:ascii="Arial" w:cs="Arial" w:eastAsia="Arial" w:hAnsi="Arial"/>
+                <w:sz w:val="19"/>
+                <w:szCs w:val="19"/>
+              </w:rPr>
+              <w:t xml:space="preserve">The address in </w:t>
+            </w:r>
+            <w:r>
+              <w:rPr>
+                <w:rFonts w:ascii="Consolas" w:cs="Consolas" w:eastAsia="Consolas" w:hAnsi="Consolas"/>
+                <w:sz w:val="19"/>
+                <w:szCs w:val="19"/>
+              </w:rPr>
+              <w:t xml:space="preserve">security.site_address</w:t>
+            </w:r>
+            <w:r>
+              <w:rPr>
+                <w:rFonts w:ascii="Arial" w:cs="Arial" w:eastAsia="Arial" w:hAnsi="Arial"/>
+                <w:sz w:val="19"/>
+                <w:szCs w:val="19"/>
+              </w:rPr>
+              <w:t xml:space="preserve"> does not answer from the server itself.</w:t>
+            </w:r>
+          </w:p>
+        </w:tc>
+      </w:tr>
+      <w:tr>
+        <w:tc>
+          <w:tcPr>
+            <w:tcW w:type="dxa" w:w="2600"/>
+            <w:tcMar>
+              <w:top w:type="dxa" w:w="60"/>
+              <w:left w:type="dxa" w:w="90"/>
+              <w:bottom w:type="dxa" w:w="60"/>
+              <w:right w:type="dxa" w:w="90"/>
+            </w:tcMar>
+          </w:tcPr>
+          <w:p>
+            <w:r>
+              <w:rPr>
+                <w:rFonts w:ascii="Arial" w:cs="Arial" w:eastAsia="Arial" w:hAnsi="Arial"/>
+                <w:sz w:val="19"/>
+                <w:szCs w:val="19"/>
+              </w:rPr>
+              <w:t xml:space="preserve">The development web server item does not appear on Windows</w:t>
+            </w:r>
+          </w:p>
+        </w:tc>
+        <w:tc>
+          <w:tcPr>
+            <w:tcW w:type="dxa" w:w="7480"/>
+            <w:tcMar>
+              <w:top w:type="dxa" w:w="60"/>
+              <w:left w:type="dxa" w:w="90"/>
+              <w:bottom w:type="dxa" w:w="60"/>
+              <w:right w:type="dxa" w:w="90"/>
+            </w:tcMar>
+          </w:tcPr>
+          <w:p>
+            <w:r>
+              <w:rPr>
+                <w:rFonts w:ascii="Arial" w:cs="Arial" w:eastAsia="Arial" w:hAnsi="Arial"/>
+                <w:sz w:val="19"/>
+                <w:szCs w:val="19"/>
+              </w:rPr>
+              <w:t xml:space="preserve">Running processes are read on Linux only.</w:t>
+            </w:r>
+          </w:p>
+        </w:tc>
+      </w:tr>
+    </w:tbl>
+    <w:p>
+      <w:pPr>
+        <w:spacing w:after="120"/>
+      </w:pPr>
     </w:p>
     <w:p>
       <w:r>

</xml_diff>

<commit_message>
Security page: workspace isolation, accounts and keys, and sending-domain checks
- Workspace isolation: a table holding workspace rows that the app's login reads
  without forced row-level security (platform tables exempt, partitions grouped by
  their parent); an app login that skips row-level security or can create tables.
- Accounts and keys: platform accounts unused for 90 days, staff allowed in with a
  password alone, active test-looking accounts, workspace accounts unused for 90
  days, API keys over a year old or unused, Postal engines with unsigned callbacks.
- Sending domains: SPF and DMARC from DNS (dnspython 2.8.0); DKIM needs the engine's
  selector, which C360 does not hold.
- Patch 0067 widens security_finding.kind; until it is applied the page says so and
  the other checks run as before. Platform Guide chapter updated.

Co-Authored-By: Claude Opus 5.5 <noreply@anthropic.com>
</commit_message>
<xml_diff>
--- a/docs/manuals/CEP_Platform_Guide.docx
+++ b/docs/manuals/CEP_Platform_Guide.docx
@@ -24883,6 +24883,135 @@
     </w:p>
     <w:p>
       <w:pPr>
+        <w:pStyle w:val="ListParagraph"/>
+        <w:numPr>
+          <w:ilvl w:val="0"/>
+          <w:numId w:val="2"/>
+        </w:numPr>
+        <w:spacing w:after="60"/>
+      </w:pPr>
+      <w:r>
+        <w:rPr>
+          <w:rFonts w:ascii="Arial" w:cs="Arial" w:eastAsia="Arial" w:hAnsi="Arial"/>
+          <w:b/>
+          <w:bCs/>
+          <w:sz w:val="21"/>
+          <w:szCs w:val="21"/>
+        </w:rPr>
+        <w:t xml:space="preserve">Workspace isolation:</w:t>
+      </w:r>
+      <w:r>
+        <w:rPr>
+          <w:rFonts w:ascii="Arial" w:cs="Arial" w:eastAsia="Arial" w:hAnsi="Arial"/>
+          <w:sz w:val="21"/>
+          <w:szCs w:val="21"/>
+        </w:rPr>
+        <w:t xml:space="preserve"> every table holding workspace rows that the app's login can read keeps each workspace's rows apart (forced row-level security), unless it is one of the platform's own tables; and the app's login can neither skip row-level security nor change the schema.</w:t>
+      </w:r>
+    </w:p>
+    <w:p>
+      <w:pPr>
+        <w:pStyle w:val="ListParagraph"/>
+        <w:numPr>
+          <w:ilvl w:val="0"/>
+          <w:numId w:val="2"/>
+        </w:numPr>
+        <w:spacing w:after="60"/>
+      </w:pPr>
+      <w:r>
+        <w:rPr>
+          <w:rFonts w:ascii="Arial" w:cs="Arial" w:eastAsia="Arial" w:hAnsi="Arial"/>
+          <w:b/>
+          <w:bCs/>
+          <w:sz w:val="21"/>
+          <w:szCs w:val="21"/>
+        </w:rPr>
+        <w:t xml:space="preserve">Accounts and keys:</w:t>
+      </w:r>
+      <w:r>
+        <w:rPr>
+          <w:rFonts w:ascii="Arial" w:cs="Arial" w:eastAsia="Arial" w:hAnsi="Arial"/>
+          <w:sz w:val="21"/>
+          <w:szCs w:val="21"/>
+        </w:rPr>
+        <w:t xml:space="preserve"> platform accounts that have not signed in for 90 days, platform staff allowed to sign in without a second factor, active accounts with a test address (example.com, .test and the like), workspace accounts unused for 90 days, workspace API keys over a year old or unused for 90 days, and Postal engines whose callbacks are not signed.</w:t>
+      </w:r>
+    </w:p>
+    <w:p>
+      <w:pPr>
+        <w:pStyle w:val="ListParagraph"/>
+        <w:numPr>
+          <w:ilvl w:val="0"/>
+          <w:numId w:val="2"/>
+        </w:numPr>
+        <w:spacing w:after="60"/>
+      </w:pPr>
+      <w:r>
+        <w:rPr>
+          <w:rFonts w:ascii="Arial" w:cs="Arial" w:eastAsia="Arial" w:hAnsi="Arial"/>
+          <w:b/>
+          <w:bCs/>
+          <w:sz w:val="21"/>
+          <w:szCs w:val="21"/>
+        </w:rPr>
+        <w:t xml:space="preserve">Sending domains:</w:t>
+      </w:r>
+      <w:r>
+        <w:rPr>
+          <w:rFonts w:ascii="Arial" w:cs="Arial" w:eastAsia="Arial" w:hAnsi="Arial"/>
+          <w:sz w:val="21"/>
+          <w:szCs w:val="21"/>
+        </w:rPr>
+        <w:t xml:space="preserve"> the SPF and DMARC records of every domain a workspace sends email from, read from DNS by this server. Domains reserved for examples (</w:t>
+      </w:r>
+      <w:r>
+        <w:rPr>
+          <w:rFonts w:ascii="Consolas" w:cs="Consolas" w:eastAsia="Consolas" w:hAnsi="Consolas"/>
+          <w:sz w:val="21"/>
+          <w:szCs w:val="21"/>
+        </w:rPr>
+        <w:t xml:space="preserve">.example</w:t>
+      </w:r>
+      <w:r>
+        <w:rPr>
+          <w:rFonts w:ascii="Arial" w:cs="Arial" w:eastAsia="Arial" w:hAnsi="Arial"/>
+          <w:sz w:val="21"/>
+          <w:szCs w:val="21"/>
+        </w:rPr>
+        <w:t xml:space="preserve">, </w:t>
+      </w:r>
+      <w:r>
+        <w:rPr>
+          <w:rFonts w:ascii="Consolas" w:cs="Consolas" w:eastAsia="Consolas" w:hAnsi="Consolas"/>
+          <w:sz w:val="21"/>
+          <w:szCs w:val="21"/>
+        </w:rPr>
+        <w:t xml:space="preserve">.test</w:t>
+      </w:r>
+      <w:r>
+        <w:rPr>
+          <w:rFonts w:ascii="Arial" w:cs="Arial" w:eastAsia="Arial" w:hAnsi="Arial"/>
+          <w:sz w:val="21"/>
+          <w:szCs w:val="21"/>
+        </w:rPr>
+        <w:t xml:space="preserve">) are not looked up. DKIM is not checked: its record name depends on the mail engine's selector, which C360 does not hold.</w:t>
+      </w:r>
+    </w:p>
+    <w:p>
+      <w:pPr>
+        <w:spacing w:after="120"/>
+      </w:pPr>
+      <w:r>
+        <w:rPr>
+          <w:rFonts w:ascii="Arial" w:cs="Arial" w:eastAsia="Arial" w:hAnsi="Arial"/>
+          <w:sz w:val="21"/>
+          <w:szCs w:val="21"/>
+        </w:rPr>
+        <w:t xml:space="preserve">The last three need patch 0067; until it is applied the page says so under Passed and the other checks run as before.</w:t>
+      </w:r>
+    </w:p>
+    <w:p>
+      <w:pPr>
         <w:spacing w:after="120"/>
       </w:pPr>
       <w:r>
@@ -25025,7 +25154,7 @@
           <w:sz w:val="21"/>
           <w:szCs w:val="21"/>
         </w:rPr>
-        <w:t xml:space="preserve"> lists every open item, worst first, packages and settings together: the severity, the item and why it matters, where it is (Backend · Python, Frontend · npm, Server setting, Site header), what is installed and what fixes it, the advisory, and when it was first seen.</w:t>
+        <w:t xml:space="preserve"> lists every open item, worst first, packages, settings and data checks together: the severity, the item and why it matters, where it is (Backend · Python, Frontend · npm, Server setting, Site header, Workspace isolation, Account or key, Sending domain), what is there now and what fixes it, the reference, and when it was first seen.</w:t>
       </w:r>
     </w:p>
     <w:p>
@@ -25368,7 +25497,7 @@
           <w:sz w:val="21"/>
           <w:szCs w:val="21"/>
         </w:rPr>
-        <w:t xml:space="preserve"> lists the packages with no known advisories (Python and npm) and every setting and header that passes.</w:t>
+        <w:t xml:space="preserve"> lists the packages with no known advisories (Python and npm), every setting and header that passes, and, below them, what passed in Workspace Isolation, Accounts and Keys and Sending Domains.</w:t>
       </w:r>
     </w:p>
     <w:p>
@@ -25519,7 +25648,7 @@
                 <w:sz w:val="19"/>
                 <w:szCs w:val="19"/>
               </w:rPr>
-              <w:t xml:space="preserve">Fix now: for example a weak signing key, or a package advisory rated critical.</w:t>
+              <w:t xml:space="preserve">Fix now: for example a weak signing key, a package advisory rated critical, or the app's login skipping row-level security.</w:t>
             </w:r>
           </w:p>
         </w:tc>
@@ -25563,7 +25692,7 @@
                 <w:sz w:val="19"/>
                 <w:szCs w:val="19"/>
               </w:rPr>
-              <w:t xml:space="preserve">Fix soon: debug mode on, the development web server serving, a session cookie sent over HTTP, a high-rated advisory.</w:t>
+              <w:t xml:space="preserve">Fix soon: debug mode on, the development web server serving, a session cookie sent over HTTP, a high-rated advisory, a workspace table that does not keep workspaces apart, an unused platform administrator, staff signing in with a password alone, a sending domain without SPF.</w:t>
             </w:r>
           </w:p>
         </w:tc>
@@ -25607,7 +25736,7 @@
                 <w:sz w:val="19"/>
                 <w:szCs w:val="19"/>
               </w:rPr>
-              <w:t xml:space="preserve">Plan the fix: missing HSTS or Content-Security-Policy, a moderate advisory, an advisory its database did not rate.</w:t>
+              <w:t xml:space="preserve">Plan the fix: missing HSTS or Content-Security-Policy, a moderate advisory, an advisory its database did not rate, an API key over a year old, unsigned engine callbacks, a sending domain without DMARC.</w:t>
             </w:r>
           </w:p>
         </w:tc>
@@ -25651,7 +25780,7 @@
                 <w:sz w:val="19"/>
                 <w:szCs w:val="19"/>
               </w:rPr>
-              <w:t xml:space="preserve">Note it: a low-rated advisory, nosniff missing, the HTTPS redirect left to the proxy.</w:t>
+              <w:t xml:space="preserve">Note it: a low-rated advisory, nosniff missing, the HTTPS redirect left to the proxy, unused workspace accounts or API keys, DMARC that only monitors.</w:t>
             </w:r>
           </w:p>
         </w:tc>
@@ -25988,6 +26117,138 @@
                 <w:szCs w:val="19"/>
               </w:rPr>
               <w:t xml:space="preserve">Running processes are read on Linux only.</w:t>
+            </w:r>
+          </w:p>
+        </w:tc>
+      </w:tr>
+      <w:tr>
+        <w:tc>
+          <w:tcPr>
+            <w:tcW w:type="dxa" w:w="2600"/>
+            <w:tcMar>
+              <w:top w:type="dxa" w:w="60"/>
+              <w:left w:type="dxa" w:w="90"/>
+              <w:bottom w:type="dxa" w:w="60"/>
+              <w:right w:type="dxa" w:w="90"/>
+            </w:tcMar>
+          </w:tcPr>
+          <w:p>
+            <w:r>
+              <w:rPr>
+                <w:rFonts w:ascii="Arial" w:cs="Arial" w:eastAsia="Arial" w:hAnsi="Arial"/>
+                <w:sz w:val="19"/>
+                <w:szCs w:val="19"/>
+              </w:rPr>
+              <w:t xml:space="preserve">Passed says the data checks wait for patch 0067</w:t>
+            </w:r>
+          </w:p>
+        </w:tc>
+        <w:tc>
+          <w:tcPr>
+            <w:tcW w:type="dxa" w:w="7480"/>
+            <w:tcMar>
+              <w:top w:type="dxa" w:w="60"/>
+              <w:left w:type="dxa" w:w="90"/>
+              <w:bottom w:type="dxa" w:w="60"/>
+              <w:right w:type="dxa" w:w="90"/>
+            </w:tcMar>
+          </w:tcPr>
+          <w:p>
+            <w:r>
+              <w:rPr>
+                <w:rFonts w:ascii="Arial" w:cs="Arial" w:eastAsia="Arial" w:hAnsi="Arial"/>
+                <w:sz w:val="19"/>
+                <w:szCs w:val="19"/>
+              </w:rPr>
+              <w:t xml:space="preserve">Patch 0067 has not been applied on this server.</w:t>
+            </w:r>
+          </w:p>
+        </w:tc>
+      </w:tr>
+      <w:tr>
+        <w:tc>
+          <w:tcPr>
+            <w:tcW w:type="dxa" w:w="2600"/>
+            <w:tcMar>
+              <w:top w:type="dxa" w:w="60"/>
+              <w:left w:type="dxa" w:w="90"/>
+              <w:bottom w:type="dxa" w:w="60"/>
+              <w:right w:type="dxa" w:w="90"/>
+            </w:tcMar>
+          </w:tcPr>
+          <w:p>
+            <w:r>
+              <w:rPr>
+                <w:rFonts w:ascii="Arial" w:cs="Arial" w:eastAsia="Arial" w:hAnsi="Arial"/>
+                <w:sz w:val="19"/>
+                <w:szCs w:val="19"/>
+              </w:rPr>
+              <w:t xml:space="preserve">"A sending domain could not be looked up"</w:t>
+            </w:r>
+          </w:p>
+        </w:tc>
+        <w:tc>
+          <w:tcPr>
+            <w:tcW w:type="dxa" w:w="7480"/>
+            <w:tcMar>
+              <w:top w:type="dxa" w:w="60"/>
+              <w:left w:type="dxa" w:w="90"/>
+              <w:bottom w:type="dxa" w:w="60"/>
+              <w:right w:type="dxa" w:w="90"/>
+            </w:tcMar>
+          </w:tcPr>
+          <w:p>
+            <w:r>
+              <w:rPr>
+                <w:rFonts w:ascii="Arial" w:cs="Arial" w:eastAsia="Arial" w:hAnsi="Arial"/>
+                <w:sz w:val="19"/>
+                <w:szCs w:val="19"/>
+              </w:rPr>
+              <w:t xml:space="preserve">This server's DNS did not answer for it; check the server's resolver.</w:t>
+            </w:r>
+          </w:p>
+        </w:tc>
+      </w:tr>
+      <w:tr>
+        <w:tc>
+          <w:tcPr>
+            <w:tcW w:type="dxa" w:w="2600"/>
+            <w:tcMar>
+              <w:top w:type="dxa" w:w="60"/>
+              <w:left w:type="dxa" w:w="90"/>
+              <w:bottom w:type="dxa" w:w="60"/>
+              <w:right w:type="dxa" w:w="90"/>
+            </w:tcMar>
+          </w:tcPr>
+          <w:p>
+            <w:r>
+              <w:rPr>
+                <w:rFonts w:ascii="Arial" w:cs="Arial" w:eastAsia="Arial" w:hAnsi="Arial"/>
+                <w:sz w:val="19"/>
+                <w:szCs w:val="19"/>
+              </w:rPr>
+              <w:t xml:space="preserve">"Workspace Isolation was not checked" (or another group)</w:t>
+            </w:r>
+          </w:p>
+        </w:tc>
+        <w:tc>
+          <w:tcPr>
+            <w:tcW w:type="dxa" w:w="7480"/>
+            <w:tcMar>
+              <w:top w:type="dxa" w:w="60"/>
+              <w:left w:type="dxa" w:w="90"/>
+              <w:bottom w:type="dxa" w:w="60"/>
+              <w:right w:type="dxa" w:w="90"/>
+            </w:tcMar>
+          </w:tcPr>
+          <w:p>
+            <w:r>
+              <w:rPr>
+                <w:rFonts w:ascii="Arial" w:cs="Arial" w:eastAsia="Arial" w:hAnsi="Arial"/>
+                <w:sz w:val="19"/>
+                <w:szCs w:val="19"/>
+              </w:rPr>
+              <w:t xml:space="preserve">That group failed to read the database; the check's history shows the error, and the group's earlier findings stand.</w:t>
             </w:r>
           </w:p>
         </w:tc>

</xml_diff>

<commit_message>
Docs: Engine Health in the engineering docs; Quiet rates show their counts
DELIVERY_PROVIDERS.md gains §6.2 Engine Health (the checks and their windows, thresholds,
the standing No Receipts Yet warning, alerts, the daily Check), the two jobs, the API's
health field and the Digivize receipts note; INTEGRATIONS.md points at it. The
capabilities overview's counts were stale (28 jobs, 15 checks, now with Engine Health).
User guide 40 and platform guide 16b say a rate below the minimum sample reads Quiet
with its counts (#173). Manuals rebuilt.

Co-Authored-By: Claude Opus 5.5 <noreply@anthropic.com>
</commit_message>
<xml_diff>
--- a/docs/manuals/CEP_Platform_Guide.docx
+++ b/docs/manuals/CEP_Platform_Guide.docx
@@ -27965,7 +27965,43 @@
           <w:sz w:val="21"/>
           <w:szCs w:val="21"/>
         </w:rPr>
-        <w:t xml:space="preserve">, as is an engine that sent nothing in a day. All the lines are Global Parameters (category </w:t>
+        <w:t xml:space="preserve"> and shows the counts (</w:t>
+      </w:r>
+      <w:r>
+        <w:rPr>
+          <w:rFonts w:ascii="Arial" w:cs="Arial" w:eastAsia="Arial" w:hAnsi="Arial"/>
+          <w:i/>
+          <w:iCs/>
+          <w:sz w:val="21"/>
+          <w:szCs w:val="21"/>
+        </w:rPr>
+        <w:t xml:space="preserve">1 of 1</w:t>
+      </w:r>
+      <w:r>
+        <w:rPr>
+          <w:rFonts w:ascii="Arial" w:cs="Arial" w:eastAsia="Arial" w:hAnsi="Arial"/>
+          <w:sz w:val="21"/>
+          <w:szCs w:val="21"/>
+        </w:rPr>
+        <w:t xml:space="preserve">) instead of a share, as an engine's own Check probe would otherwise read </w:t>
+      </w:r>
+      <w:r>
+        <w:rPr>
+          <w:rFonts w:ascii="Arial" w:cs="Arial" w:eastAsia="Arial" w:hAnsi="Arial"/>
+          <w:i/>
+          <w:iCs/>
+          <w:sz w:val="21"/>
+          <w:szCs w:val="21"/>
+        </w:rPr>
+        <w:t xml:space="preserve">100%</w:t>
+      </w:r>
+      <w:r>
+        <w:rPr>
+          <w:rFonts w:ascii="Arial" w:cs="Arial" w:eastAsia="Arial" w:hAnsi="Arial"/>
+          <w:sz w:val="21"/>
+          <w:szCs w:val="21"/>
+        </w:rPr>
+        <w:t xml:space="preserve">. An engine that sent nothing in a day is Quiet overall. All the lines are Global Parameters (category </w:t>
       </w:r>
       <w:r>
         <w:rPr>

</xml_diff>

<commit_message>
Back-office: staff without an authenticator are sent to set one up while two-factor is required
The back-office asked for a code only from staff who had already enrolled, so with
security.mfa_required_for_staff on, an unenrolled staff member still got in with the
password alone. Every back-office page now sends them to Set Up Two-Step Verification
(the steps and a link to the app's Account Security, where enrolment happens) until
they enrol; enrolled staff are asked for the code as before. An unreadable parameter
counts as off, its seeded value. Platform guide 01 says so; manuals rebuilt.

Co-Authored-By: Claude Opus 5.5 <noreply@anthropic.com>
</commit_message>
<xml_diff>
--- a/docs/manuals/CEP_Platform_Guide.docx
+++ b/docs/manuals/CEP_Platform_Guide.docx
@@ -3959,7 +3959,25 @@
           <w:sz w:val="21"/>
           <w:szCs w:val="21"/>
         </w:rPr>
-        <w:t xml:space="preserve"> → yes. A staff member without an enrolled authenticator is asked to enrol in the app first.</w:t>
+        <w:t xml:space="preserve"> → yes. A staff member without an enrolled authenticator is asked to enrol in the app first: the app asks at the next sign-in, and every back-office page sends them to </w:t>
+      </w:r>
+      <w:r>
+        <w:rPr>
+          <w:rFonts w:ascii="Arial" w:cs="Arial" w:eastAsia="Arial" w:hAnsi="Arial"/>
+          <w:b/>
+          <w:bCs/>
+          <w:sz w:val="21"/>
+          <w:szCs w:val="21"/>
+        </w:rPr>
+        <w:t xml:space="preserve">Set Up Two-Step Verification</w:t>
+      </w:r>
+      <w:r>
+        <w:rPr>
+          <w:rFonts w:ascii="Arial" w:cs="Arial" w:eastAsia="Arial" w:hAnsi="Arial"/>
+          <w:sz w:val="21"/>
+          <w:szCs w:val="21"/>
+        </w:rPr>
+        <w:t xml:space="preserve">, with a link to the app's Account Security, until they have.</w:t>
       </w:r>
     </w:p>
     <w:p>

</xml_diff>

<commit_message>
Docs: Platform Guide chapter for the ClickHouse demo workspace (City HT)
What the dev server's CITYHT workspace holds (25M messages, 3M orders, 2M
contacts, 0.5M journey enrolments in ClickHouse; a small PostgreSQL sample with
the Demo reports and dashboards), and the demo step by step: open it with Sign
In As, show the engine, run the saved reports in a suggested order with their
measured times, build one live, the dashboards, the Run Log, comparing with
PostgreSQL, ending the session. Things to know, and the server scripts that
rebuild or remove it. Platform Guide Word copy rebuilt.

Co-Authored-By: Claude Opus 5.5 <noreply@anthropic.com>
</commit_message>
<xml_diff>
--- a/docs/manuals/CEP_Platform_Guide.docx
+++ b/docs/manuals/CEP_Platform_Guide.docx
@@ -2240,6 +2240,118 @@
           <w:szCs w:val="20"/>
         </w:rPr>
         <w:t xml:space="preserve">Dataset Links</w:t>
+      </w:r>
+    </w:p>
+    <w:p>
+      <w:pPr>
+        <w:spacing w:after="40"/>
+        <w:ind w:left="0"/>
+      </w:pPr>
+      <w:r>
+        <w:rPr>
+          <w:rFonts w:ascii="Arial" w:cs="Arial" w:eastAsia="Arial" w:hAnsi="Arial"/>
+          <w:sz w:val="22"/>
+          <w:szCs w:val="22"/>
+        </w:rPr>
+        <w:t xml:space="preserve">ClickHouse Demo Workspace (City HT)</w:t>
+      </w:r>
+    </w:p>
+    <w:p>
+      <w:pPr>
+        <w:spacing w:after="40"/>
+        <w:ind w:left="400"/>
+      </w:pPr>
+      <w:r>
+        <w:rPr>
+          <w:rFonts w:ascii="Arial" w:cs="Arial" w:eastAsia="Arial" w:hAnsi="Arial"/>
+          <w:sz w:val="20"/>
+          <w:szCs w:val="20"/>
+        </w:rPr>
+        <w:t xml:space="preserve">What this is for</w:t>
+      </w:r>
+    </w:p>
+    <w:p>
+      <w:pPr>
+        <w:spacing w:after="40"/>
+        <w:ind w:left="400"/>
+      </w:pPr>
+      <w:r>
+        <w:rPr>
+          <w:rFonts w:ascii="Arial" w:cs="Arial" w:eastAsia="Arial" w:hAnsi="Arial"/>
+          <w:sz w:val="20"/>
+          <w:szCs w:val="20"/>
+        </w:rPr>
+        <w:t xml:space="preserve">What is in it</w:t>
+      </w:r>
+    </w:p>
+    <w:p>
+      <w:pPr>
+        <w:spacing w:after="40"/>
+        <w:ind w:left="400"/>
+      </w:pPr>
+      <w:r>
+        <w:rPr>
+          <w:rFonts w:ascii="Arial" w:cs="Arial" w:eastAsia="Arial" w:hAnsi="Arial"/>
+          <w:sz w:val="20"/>
+          <w:szCs w:val="20"/>
+        </w:rPr>
+        <w:t xml:space="preserve">Who can use it</w:t>
+      </w:r>
+    </w:p>
+    <w:p>
+      <w:pPr>
+        <w:spacing w:after="40"/>
+        <w:ind w:left="400"/>
+      </w:pPr>
+      <w:r>
+        <w:rPr>
+          <w:rFonts w:ascii="Arial" w:cs="Arial" w:eastAsia="Arial" w:hAnsi="Arial"/>
+          <w:sz w:val="20"/>
+          <w:szCs w:val="20"/>
+        </w:rPr>
+        <w:t xml:space="preserve">Step by step</w:t>
+      </w:r>
+    </w:p>
+    <w:p>
+      <w:pPr>
+        <w:spacing w:after="40"/>
+        <w:ind w:left="400"/>
+      </w:pPr>
+      <w:r>
+        <w:rPr>
+          <w:rFonts w:ascii="Arial" w:cs="Arial" w:eastAsia="Arial" w:hAnsi="Arial"/>
+          <w:sz w:val="20"/>
+          <w:szCs w:val="20"/>
+        </w:rPr>
+        <w:t xml:space="preserve">Things to know</w:t>
+      </w:r>
+    </w:p>
+    <w:p>
+      <w:pPr>
+        <w:spacing w:after="40"/>
+        <w:ind w:left="400"/>
+      </w:pPr>
+      <w:r>
+        <w:rPr>
+          <w:rFonts w:ascii="Arial" w:cs="Arial" w:eastAsia="Arial" w:hAnsi="Arial"/>
+          <w:sz w:val="20"/>
+          <w:szCs w:val="20"/>
+        </w:rPr>
+        <w:t xml:space="preserve">Rebuilding or removing the demo</w:t>
+      </w:r>
+    </w:p>
+    <w:p>
+      <w:pPr>
+        <w:spacing w:after="40"/>
+        <w:ind w:left="400"/>
+      </w:pPr>
+      <w:r>
+        <w:rPr>
+          <w:rFonts w:ascii="Arial" w:cs="Arial" w:eastAsia="Arial" w:hAnsi="Arial"/>
+          <w:sz w:val="20"/>
+          <w:szCs w:val="20"/>
+        </w:rPr>
+        <w:t xml:space="preserve">Related chapters</w:t>
       </w:r>
     </w:p>
     <w:p>
@@ -34767,6 +34879,2910 @@
           <w:szCs w:val="21"/>
         </w:rPr>
         <w:t xml:space="preserve">Each pair must name dimensions of one type; the time pair two dates. Personal and confidential measures of the second dataset are never offered. A change shows in the editor within a minute.</w:t>
+      </w:r>
+    </w:p>
+    <w:p>
+      <w:r>
+        <w:br w:type="page"/>
+      </w:r>
+    </w:p>
+    <w:p>
+      <w:pPr>
+        <w:pStyle w:val="Heading1"/>
+        <w:spacing w:after="120" w:before="0"/>
+      </w:pPr>
+      <w:r>
+        <w:rPr>
+          <w:rFonts w:ascii="Arial" w:cs="Arial" w:eastAsia="Arial" w:hAnsi="Arial"/>
+        </w:rPr>
+        <w:t xml:space="preserve">ClickHouse Demo Workspace (City HT)</w:t>
+      </w:r>
+    </w:p>
+    <w:p>
+      <w:pPr>
+        <w:spacing w:after="120"/>
+      </w:pPr>
+      <w:r>
+        <w:rPr>
+          <w:rFonts w:ascii="Arial" w:cs="Arial" w:eastAsia="Arial" w:hAnsi="Arial"/>
+          <w:b/>
+          <w:bCs/>
+          <w:sz w:val="21"/>
+          <w:szCs w:val="21"/>
+        </w:rPr>
+        <w:t xml:space="preserve">Where:</w:t>
+      </w:r>
+      <w:r>
+        <w:rPr>
+          <w:rFonts w:ascii="Arial" w:cs="Arial" w:eastAsia="Arial" w:hAnsi="Arial"/>
+          <w:sz w:val="21"/>
+          <w:szCs w:val="21"/>
+        </w:rPr>
+        <w:t xml:space="preserve"> the dev server (</w:t>
+      </w:r>
+      <w:r>
+        <w:rPr>
+          <w:rFonts w:ascii="Consolas" w:cs="Consolas" w:eastAsia="Consolas" w:hAnsi="Consolas"/>
+          <w:sz w:val="21"/>
+          <w:szCs w:val="21"/>
+        </w:rPr>
+        <w:t xml:space="preserve">cepdev.aiintelekt.com</w:t>
+      </w:r>
+      <w:r>
+        <w:rPr>
+          <w:rFonts w:ascii="Arial" w:cs="Arial" w:eastAsia="Arial" w:hAnsi="Arial"/>
+          <w:sz w:val="21"/>
+          <w:szCs w:val="21"/>
+        </w:rPr>
+        <w:t xml:space="preserve">): the workspace </w:t>
+      </w:r>
+      <w:r>
+        <w:rPr>
+          <w:rFonts w:ascii="Arial" w:cs="Arial" w:eastAsia="Arial" w:hAnsi="Arial"/>
+          <w:b/>
+          <w:bCs/>
+          <w:sz w:val="21"/>
+          <w:szCs w:val="21"/>
+        </w:rPr>
+        <w:t xml:space="preserve">CITYHT</w:t>
+      </w:r>
+      <w:r>
+        <w:rPr>
+          <w:rFonts w:ascii="Arial" w:cs="Arial" w:eastAsia="Arial" w:hAnsi="Arial"/>
+          <w:sz w:val="21"/>
+          <w:szCs w:val="21"/>
+        </w:rPr>
+        <w:t xml:space="preserve">, opened from People and Access → Users; its engine under Configuration → Report Engines.</w:t>
+      </w:r>
+    </w:p>
+    <w:p>
+      <w:pPr>
+        <w:pStyle w:val="Heading2"/>
+        <w:spacing w:after="120" w:before="240"/>
+      </w:pPr>
+      <w:r>
+        <w:rPr>
+          <w:rFonts w:ascii="Arial" w:cs="Arial" w:eastAsia="Arial" w:hAnsi="Arial"/>
+        </w:rPr>
+        <w:t xml:space="preserve">What this is for</w:t>
+      </w:r>
+    </w:p>
+    <w:p>
+      <w:pPr>
+        <w:spacing w:after="120"/>
+      </w:pPr>
+      <w:r>
+        <w:rPr>
+          <w:rFonts w:ascii="Arial" w:cs="Arial" w:eastAsia="Arial" w:hAnsi="Arial"/>
+          <w:sz w:val="21"/>
+          <w:szCs w:val="21"/>
+        </w:rPr>
+        <w:t xml:space="preserve">Showing how fast Insights stays on a large workspace once its reports run on ClickHouse. City HT carries 25 million messages, 3 million orders, 2 million contacts and half a million journey enrolments; its saved reports over the 25 million messages answer in well under a second.</w:t>
+      </w:r>
+    </w:p>
+    <w:p>
+      <w:pPr>
+        <w:spacing w:after="120"/>
+      </w:pPr>
+      <w:r>
+        <w:rPr>
+          <w:rFonts w:ascii="Arial" w:cs="Arial" w:eastAsia="Arial" w:hAnsi="Arial"/>
+          <w:sz w:val="21"/>
+          <w:szCs w:val="21"/>
+        </w:rPr>
+        <w:t xml:space="preserve">It is a demo workspace on the dev server only: nothing in it is real, and it is not on the release-test or production servers.</w:t>
+      </w:r>
+    </w:p>
+    <w:p>
+      <w:pPr>
+        <w:pStyle w:val="Heading2"/>
+        <w:spacing w:after="120" w:before="240"/>
+      </w:pPr>
+      <w:r>
+        <w:rPr>
+          <w:rFonts w:ascii="Arial" w:cs="Arial" w:eastAsia="Arial" w:hAnsi="Arial"/>
+        </w:rPr>
+        <w:t xml:space="preserve">What is in it</w:t>
+      </w:r>
+    </w:p>
+    <w:tbl>
+      <w:tblPr>
+        <w:tblW w:type="dxa" w:w="10080"/>
+        <w:tblBorders>
+          <w:top w:val="single" w:color="D9DBE3" w:sz="4"/>
+          <w:left w:val="none"/>
+          <w:bottom w:val="single" w:color="D9DBE3" w:sz="4"/>
+          <w:right w:val="none"/>
+          <w:insideH w:val="single" w:color="E6E8EF" w:sz="4"/>
+          <w:insideV w:val="none"/>
+        </w:tblBorders>
+      </w:tblPr>
+      <w:tblGrid>
+        <w:gridCol w:w="2600"/>
+        <w:gridCol w:w="3740"/>
+        <w:gridCol w:w="3740"/>
+      </w:tblGrid>
+      <w:tr>
+        <w:trPr>
+          <w:tblHeader/>
+        </w:trPr>
+        <w:tc>
+          <w:tcPr>
+            <w:tcW w:type="dxa" w:w="2600"/>
+            <w:shd w:fill="EEEFF5" w:color="auto" w:val="clear"/>
+            <w:tcMar>
+              <w:top w:type="dxa" w:w="60"/>
+              <w:left w:type="dxa" w:w="90"/>
+              <w:bottom w:type="dxa" w:w="60"/>
+              <w:right w:type="dxa" w:w="90"/>
+            </w:tcMar>
+          </w:tcPr>
+          <w:p>
+            <w:r>
+              <w:rPr>
+                <w:rFonts w:ascii="Arial" w:cs="Arial" w:eastAsia="Arial" w:hAnsi="Arial"/>
+                <w:b/>
+                <w:bCs/>
+                <w:sz w:val="18"/>
+                <w:szCs w:val="18"/>
+              </w:rPr>
+              <w:t xml:space="preserve">Data</w:t>
+            </w:r>
+          </w:p>
+        </w:tc>
+        <w:tc>
+          <w:tcPr>
+            <w:tcW w:type="dxa" w:w="3740"/>
+            <w:shd w:fill="EEEFF5" w:color="auto" w:val="clear"/>
+            <w:tcMar>
+              <w:top w:type="dxa" w:w="60"/>
+              <w:left w:type="dxa" w:w="90"/>
+              <w:bottom w:type="dxa" w:w="60"/>
+              <w:right w:type="dxa" w:w="90"/>
+            </w:tcMar>
+          </w:tcPr>
+          <w:p>
+            <w:r>
+              <w:rPr>
+                <w:rFonts w:ascii="Arial" w:cs="Arial" w:eastAsia="Arial" w:hAnsi="Arial"/>
+                <w:b/>
+                <w:bCs/>
+                <w:sz w:val="18"/>
+                <w:szCs w:val="18"/>
+              </w:rPr>
+              <w:t xml:space="preserve">Rows</w:t>
+            </w:r>
+          </w:p>
+        </w:tc>
+        <w:tc>
+          <w:tcPr>
+            <w:tcW w:type="dxa" w:w="3740"/>
+            <w:shd w:fill="EEEFF5" w:color="auto" w:val="clear"/>
+            <w:tcMar>
+              <w:top w:type="dxa" w:w="60"/>
+              <w:left w:type="dxa" w:w="90"/>
+              <w:bottom w:type="dxa" w:w="60"/>
+              <w:right w:type="dxa" w:w="90"/>
+            </w:tcMar>
+          </w:tcPr>
+          <w:p>
+            <w:r>
+              <w:rPr>
+                <w:rFonts w:ascii="Arial" w:cs="Arial" w:eastAsia="Arial" w:hAnsi="Arial"/>
+                <w:b/>
+                <w:bCs/>
+                <w:sz w:val="18"/>
+                <w:szCs w:val="18"/>
+              </w:rPr>
+              <w:t xml:space="preserve">Where it lives</w:t>
+            </w:r>
+          </w:p>
+        </w:tc>
+      </w:tr>
+      <w:tr>
+        <w:tc>
+          <w:tcPr>
+            <w:tcW w:type="dxa" w:w="2600"/>
+            <w:tcMar>
+              <w:top w:type="dxa" w:w="60"/>
+              <w:left w:type="dxa" w:w="90"/>
+              <w:bottom w:type="dxa" w:w="60"/>
+              <w:right w:type="dxa" w:w="90"/>
+            </w:tcMar>
+          </w:tcPr>
+          <w:p>
+            <w:r>
+              <w:rPr>
+                <w:rFonts w:ascii="Arial" w:cs="Arial" w:eastAsia="Arial" w:hAnsi="Arial"/>
+                <w:sz w:val="19"/>
+                <w:szCs w:val="19"/>
+              </w:rPr>
+              <w:t xml:space="preserve">Messages (email and texts)</w:t>
+            </w:r>
+          </w:p>
+        </w:tc>
+        <w:tc>
+          <w:tcPr>
+            <w:tcW w:type="dxa" w:w="3740"/>
+            <w:tcMar>
+              <w:top w:type="dxa" w:w="60"/>
+              <w:left w:type="dxa" w:w="90"/>
+              <w:bottom w:type="dxa" w:w="60"/>
+              <w:right w:type="dxa" w:w="90"/>
+            </w:tcMar>
+          </w:tcPr>
+          <w:p>
+            <w:r>
+              <w:rPr>
+                <w:rFonts w:ascii="Arial" w:cs="Arial" w:eastAsia="Arial" w:hAnsi="Arial"/>
+                <w:sz w:val="19"/>
+                <w:szCs w:val="19"/>
+              </w:rPr>
+              <w:t xml:space="preserve">25,012,727</w:t>
+            </w:r>
+          </w:p>
+        </w:tc>
+        <w:tc>
+          <w:tcPr>
+            <w:tcW w:type="dxa" w:w="3740"/>
+            <w:tcMar>
+              <w:top w:type="dxa" w:w="60"/>
+              <w:left w:type="dxa" w:w="90"/>
+              <w:bottom w:type="dxa" w:w="60"/>
+              <w:right w:type="dxa" w:w="90"/>
+            </w:tcMar>
+          </w:tcPr>
+          <w:p>
+            <w:r>
+              <w:rPr>
+                <w:rFonts w:ascii="Arial" w:cs="Arial" w:eastAsia="Arial" w:hAnsi="Arial"/>
+                <w:sz w:val="19"/>
+                <w:szCs w:val="19"/>
+              </w:rPr>
+              <w:t xml:space="preserve">ClickHouse</w:t>
+            </w:r>
+          </w:p>
+        </w:tc>
+      </w:tr>
+      <w:tr>
+        <w:tc>
+          <w:tcPr>
+            <w:tcW w:type="dxa" w:w="2600"/>
+            <w:tcMar>
+              <w:top w:type="dxa" w:w="60"/>
+              <w:left w:type="dxa" w:w="90"/>
+              <w:bottom w:type="dxa" w:w="60"/>
+              <w:right w:type="dxa" w:w="90"/>
+            </w:tcMar>
+          </w:tcPr>
+          <w:p>
+            <w:r>
+              <w:rPr>
+                <w:rFonts w:ascii="Arial" w:cs="Arial" w:eastAsia="Arial" w:hAnsi="Arial"/>
+                <w:sz w:val="19"/>
+                <w:szCs w:val="19"/>
+              </w:rPr>
+              <w:t xml:space="preserve">Attributed orders and refunds</w:t>
+            </w:r>
+          </w:p>
+        </w:tc>
+        <w:tc>
+          <w:tcPr>
+            <w:tcW w:type="dxa" w:w="3740"/>
+            <w:tcMar>
+              <w:top w:type="dxa" w:w="60"/>
+              <w:left w:type="dxa" w:w="90"/>
+              <w:bottom w:type="dxa" w:w="60"/>
+              <w:right w:type="dxa" w:w="90"/>
+            </w:tcMar>
+          </w:tcPr>
+          <w:p>
+            <w:r>
+              <w:rPr>
+                <w:rFonts w:ascii="Arial" w:cs="Arial" w:eastAsia="Arial" w:hAnsi="Arial"/>
+                <w:sz w:val="19"/>
+                <w:szCs w:val="19"/>
+              </w:rPr>
+              <w:t xml:space="preserve">3,002,188</w:t>
+            </w:r>
+          </w:p>
+        </w:tc>
+        <w:tc>
+          <w:tcPr>
+            <w:tcW w:type="dxa" w:w="3740"/>
+            <w:tcMar>
+              <w:top w:type="dxa" w:w="60"/>
+              <w:left w:type="dxa" w:w="90"/>
+              <w:bottom w:type="dxa" w:w="60"/>
+              <w:right w:type="dxa" w:w="90"/>
+            </w:tcMar>
+          </w:tcPr>
+          <w:p>
+            <w:r>
+              <w:rPr>
+                <w:rFonts w:ascii="Arial" w:cs="Arial" w:eastAsia="Arial" w:hAnsi="Arial"/>
+                <w:sz w:val="19"/>
+                <w:szCs w:val="19"/>
+              </w:rPr>
+              <w:t xml:space="preserve">ClickHouse</w:t>
+            </w:r>
+          </w:p>
+        </w:tc>
+      </w:tr>
+      <w:tr>
+        <w:tc>
+          <w:tcPr>
+            <w:tcW w:type="dxa" w:w="2600"/>
+            <w:tcMar>
+              <w:top w:type="dxa" w:w="60"/>
+              <w:left w:type="dxa" w:w="90"/>
+              <w:bottom w:type="dxa" w:w="60"/>
+              <w:right w:type="dxa" w:w="90"/>
+            </w:tcMar>
+          </w:tcPr>
+          <w:p>
+            <w:r>
+              <w:rPr>
+                <w:rFonts w:ascii="Arial" w:cs="Arial" w:eastAsia="Arial" w:hAnsi="Arial"/>
+                <w:sz w:val="19"/>
+                <w:szCs w:val="19"/>
+              </w:rPr>
+              <w:t xml:space="preserve">Contacts</w:t>
+            </w:r>
+          </w:p>
+        </w:tc>
+        <w:tc>
+          <w:tcPr>
+            <w:tcW w:type="dxa" w:w="3740"/>
+            <w:tcMar>
+              <w:top w:type="dxa" w:w="60"/>
+              <w:left w:type="dxa" w:w="90"/>
+              <w:bottom w:type="dxa" w:w="60"/>
+              <w:right w:type="dxa" w:w="90"/>
+            </w:tcMar>
+          </w:tcPr>
+          <w:p>
+            <w:r>
+              <w:rPr>
+                <w:rFonts w:ascii="Arial" w:cs="Arial" w:eastAsia="Arial" w:hAnsi="Arial"/>
+                <w:sz w:val="19"/>
+                <w:szCs w:val="19"/>
+              </w:rPr>
+              <w:t xml:space="preserve">2,001,500</w:t>
+            </w:r>
+          </w:p>
+        </w:tc>
+        <w:tc>
+          <w:tcPr>
+            <w:tcW w:type="dxa" w:w="3740"/>
+            <w:tcMar>
+              <w:top w:type="dxa" w:w="60"/>
+              <w:left w:type="dxa" w:w="90"/>
+              <w:bottom w:type="dxa" w:w="60"/>
+              <w:right w:type="dxa" w:w="90"/>
+            </w:tcMar>
+          </w:tcPr>
+          <w:p>
+            <w:r>
+              <w:rPr>
+                <w:rFonts w:ascii="Arial" w:cs="Arial" w:eastAsia="Arial" w:hAnsi="Arial"/>
+                <w:sz w:val="19"/>
+                <w:szCs w:val="19"/>
+              </w:rPr>
+              <w:t xml:space="preserve">ClickHouse</w:t>
+            </w:r>
+          </w:p>
+        </w:tc>
+      </w:tr>
+      <w:tr>
+        <w:tc>
+          <w:tcPr>
+            <w:tcW w:type="dxa" w:w="2600"/>
+            <w:tcMar>
+              <w:top w:type="dxa" w:w="60"/>
+              <w:left w:type="dxa" w:w="90"/>
+              <w:bottom w:type="dxa" w:w="60"/>
+              <w:right w:type="dxa" w:w="90"/>
+            </w:tcMar>
+          </w:tcPr>
+          <w:p>
+            <w:r>
+              <w:rPr>
+                <w:rFonts w:ascii="Arial" w:cs="Arial" w:eastAsia="Arial" w:hAnsi="Arial"/>
+                <w:sz w:val="19"/>
+                <w:szCs w:val="19"/>
+              </w:rPr>
+              <w:t xml:space="preserve">Journey enrolments</w:t>
+            </w:r>
+          </w:p>
+        </w:tc>
+        <w:tc>
+          <w:tcPr>
+            <w:tcW w:type="dxa" w:w="3740"/>
+            <w:tcMar>
+              <w:top w:type="dxa" w:w="60"/>
+              <w:left w:type="dxa" w:w="90"/>
+              <w:bottom w:type="dxa" w:w="60"/>
+              <w:right w:type="dxa" w:w="90"/>
+            </w:tcMar>
+          </w:tcPr>
+          <w:p>
+            <w:r>
+              <w:rPr>
+                <w:rFonts w:ascii="Arial" w:cs="Arial" w:eastAsia="Arial" w:hAnsi="Arial"/>
+                <w:sz w:val="19"/>
+                <w:szCs w:val="19"/>
+              </w:rPr>
+              <w:t xml:space="preserve">501,220</w:t>
+            </w:r>
+          </w:p>
+        </w:tc>
+        <w:tc>
+          <w:tcPr>
+            <w:tcW w:type="dxa" w:w="3740"/>
+            <w:tcMar>
+              <w:top w:type="dxa" w:w="60"/>
+              <w:left w:type="dxa" w:w="90"/>
+              <w:bottom w:type="dxa" w:w="60"/>
+              <w:right w:type="dxa" w:w="90"/>
+            </w:tcMar>
+          </w:tcPr>
+          <w:p>
+            <w:r>
+              <w:rPr>
+                <w:rFonts w:ascii="Arial" w:cs="Arial" w:eastAsia="Arial" w:hAnsi="Arial"/>
+                <w:sz w:val="19"/>
+                <w:szCs w:val="19"/>
+              </w:rPr>
+              <w:t xml:space="preserve">ClickHouse</w:t>
+            </w:r>
+          </w:p>
+        </w:tc>
+      </w:tr>
+      <w:tr>
+        <w:tc>
+          <w:tcPr>
+            <w:tcW w:type="dxa" w:w="2600"/>
+            <w:tcMar>
+              <w:top w:type="dxa" w:w="60"/>
+              <w:left w:type="dxa" w:w="90"/>
+              <w:bottom w:type="dxa" w:w="60"/>
+              <w:right w:type="dxa" w:w="90"/>
+            </w:tcMar>
+          </w:tcPr>
+          <w:p>
+            <w:r>
+              <w:rPr>
+                <w:rFonts w:ascii="Arial" w:cs="Arial" w:eastAsia="Arial" w:hAnsi="Arial"/>
+                <w:sz w:val="19"/>
+                <w:szCs w:val="19"/>
+              </w:rPr>
+              <w:t xml:space="preserve">A small working sample: 1,500 customers, 5 lists, 13 campaigns over 15 months, 2 journeys, POS sales and returns uploads</w:t>
+            </w:r>
+          </w:p>
+        </w:tc>
+        <w:tc>
+          <w:tcPr>
+            <w:tcW w:type="dxa" w:w="3740"/>
+            <w:tcMar>
+              <w:top w:type="dxa" w:w="60"/>
+              <w:left w:type="dxa" w:w="90"/>
+              <w:bottom w:type="dxa" w:w="60"/>
+              <w:right w:type="dxa" w:w="90"/>
+            </w:tcMar>
+          </w:tcPr>
+          <w:p>
+            <w:r>
+              <w:rPr>
+                <w:rFonts w:ascii="Arial" w:cs="Arial" w:eastAsia="Arial" w:hAnsi="Arial"/>
+                <w:sz w:val="19"/>
+                <w:szCs w:val="19"/>
+              </w:rPr>
+              <w:t xml:space="preserve">thousands</w:t>
+            </w:r>
+          </w:p>
+        </w:tc>
+        <w:tc>
+          <w:tcPr>
+            <w:tcW w:type="dxa" w:w="3740"/>
+            <w:tcMar>
+              <w:top w:type="dxa" w:w="60"/>
+              <w:left w:type="dxa" w:w="90"/>
+              <w:bottom w:type="dxa" w:w="60"/>
+              <w:right w:type="dxa" w:w="90"/>
+            </w:tcMar>
+          </w:tcPr>
+          <w:p>
+            <w:r>
+              <w:rPr>
+                <w:rFonts w:ascii="Arial" w:cs="Arial" w:eastAsia="Arial" w:hAnsi="Arial"/>
+                <w:sz w:val="19"/>
+                <w:szCs w:val="19"/>
+              </w:rPr>
+              <w:t xml:space="preserve">PostgreSQL (and copied to ClickHouse)</w:t>
+            </w:r>
+          </w:p>
+        </w:tc>
+      </w:tr>
+      <w:tr>
+        <w:tc>
+          <w:tcPr>
+            <w:tcW w:type="dxa" w:w="2600"/>
+            <w:tcMar>
+              <w:top w:type="dxa" w:w="60"/>
+              <w:left w:type="dxa" w:w="90"/>
+              <w:bottom w:type="dxa" w:w="60"/>
+              <w:right w:type="dxa" w:w="90"/>
+            </w:tcMar>
+          </w:tcPr>
+          <w:p>
+            <w:r>
+              <w:rPr>
+                <w:rFonts w:ascii="Arial" w:cs="Arial" w:eastAsia="Arial" w:hAnsi="Arial"/>
+                <w:sz w:val="19"/>
+                <w:szCs w:val="19"/>
+              </w:rPr>
+              <w:t xml:space="preserve">20 "Demo ·" reports in a Demo folder, and 2 dashboards</w:t>
+            </w:r>
+          </w:p>
+        </w:tc>
+        <w:tc>
+          <w:tcPr>
+            <w:tcW w:type="dxa" w:w="3740"/>
+            <w:tcMar>
+              <w:top w:type="dxa" w:w="60"/>
+              <w:left w:type="dxa" w:w="90"/>
+              <w:bottom w:type="dxa" w:w="60"/>
+              <w:right w:type="dxa" w:w="90"/>
+            </w:tcMar>
+          </w:tcPr>
+          <w:p/>
+        </w:tc>
+        <w:tc>
+          <w:tcPr>
+            <w:tcW w:type="dxa" w:w="3740"/>
+            <w:tcMar>
+              <w:top w:type="dxa" w:w="60"/>
+              <w:left w:type="dxa" w:w="90"/>
+              <w:bottom w:type="dxa" w:w="60"/>
+              <w:right w:type="dxa" w:w="90"/>
+            </w:tcMar>
+          </w:tcPr>
+          <w:p>
+            <w:r>
+              <w:rPr>
+                <w:rFonts w:ascii="Arial" w:cs="Arial" w:eastAsia="Arial" w:hAnsi="Arial"/>
+                <w:sz w:val="19"/>
+                <w:szCs w:val="19"/>
+              </w:rPr>
+              <w:t xml:space="preserve">PostgreSQL</w:t>
+            </w:r>
+          </w:p>
+        </w:tc>
+      </w:tr>
+    </w:tbl>
+    <w:p>
+      <w:pPr>
+        <w:spacing w:after="120"/>
+      </w:pPr>
+    </w:p>
+    <w:p>
+      <w:pPr>
+        <w:spacing w:after="120"/>
+      </w:pPr>
+      <w:r>
+        <w:rPr>
+          <w:rFonts w:ascii="Arial" w:cs="Arial" w:eastAsia="Arial" w:hAnsi="Arial"/>
+          <w:sz w:val="21"/>
+          <w:szCs w:val="21"/>
+        </w:rPr>
+        <w:t xml:space="preserve">The large volume covers the last 24 months, busier towards today, on the sample's own campaigns (a weekly newsletter, seasonal email campaigns, e-receipts, two text campaigns) and journeys (Welcome Series, Win-Back), with realistic rates: about 23% of emails opened, 4.7% clicked, 1.8% bounced; 6% of orders refunded; 28% of orders credited to a campaign.</w:t>
+      </w:r>
+    </w:p>
+    <w:p>
+      <w:pPr>
+        <w:pStyle w:val="Heading2"/>
+        <w:spacing w:after="120" w:before="240"/>
+      </w:pPr>
+      <w:r>
+        <w:rPr>
+          <w:rFonts w:ascii="Arial" w:cs="Arial" w:eastAsia="Arial" w:hAnsi="Arial"/>
+        </w:rPr>
+        <w:t xml:space="preserve">Who can use it</w:t>
+      </w:r>
+    </w:p>
+    <w:p>
+      <w:pPr>
+        <w:spacing w:after="120"/>
+      </w:pPr>
+      <w:r>
+        <w:rPr>
+          <w:rFonts w:ascii="Arial" w:cs="Arial" w:eastAsia="Arial" w:hAnsi="Arial"/>
+          <w:sz w:val="21"/>
+          <w:szCs w:val="21"/>
+        </w:rPr>
+        <w:t xml:space="preserve">Platform staff, through </w:t>
+      </w:r>
+      <w:r>
+        <w:rPr>
+          <w:rFonts w:ascii="Arial" w:cs="Arial" w:eastAsia="Arial" w:hAnsi="Arial"/>
+          <w:b/>
+          <w:bCs/>
+          <w:sz w:val="21"/>
+          <w:szCs w:val="21"/>
+        </w:rPr>
+        <w:t xml:space="preserve">Sign In As</w:t>
+      </w:r>
+      <w:r>
+        <w:rPr>
+          <w:rFonts w:ascii="Arial" w:cs="Arial" w:eastAsia="Arial" w:hAnsi="Arial"/>
+          <w:sz w:val="21"/>
+          <w:szCs w:val="21"/>
+        </w:rPr>
+        <w:t xml:space="preserve"> on the workspace's one user, </w:t>
+      </w:r>
+      <w:r>
+        <w:rPr>
+          <w:rFonts w:ascii="Consolas" w:cs="Consolas" w:eastAsia="Consolas" w:hAnsi="Consolas"/>
+          <w:sz w:val="21"/>
+          <w:szCs w:val="21"/>
+        </w:rPr>
+        <w:t xml:space="preserve">demo.admin@cityht.example</w:t>
+      </w:r>
+      <w:r>
+        <w:rPr>
+          <w:rFonts w:ascii="Arial" w:cs="Arial" w:eastAsia="Arial" w:hAnsi="Arial"/>
+          <w:sz w:val="21"/>
+          <w:szCs w:val="21"/>
+        </w:rPr>
+        <w:t xml:space="preserve"> (Workspace Admin). That user has no password, so nobody can sign in as it directly.</w:t>
+      </w:r>
+    </w:p>
+    <w:p>
+      <w:pPr>
+        <w:pStyle w:val="Heading2"/>
+        <w:spacing w:after="120" w:before="240"/>
+      </w:pPr>
+      <w:r>
+        <w:rPr>
+          <w:rFonts w:ascii="Arial" w:cs="Arial" w:eastAsia="Arial" w:hAnsi="Arial"/>
+        </w:rPr>
+        <w:t xml:space="preserve">Step by step</w:t>
+      </w:r>
+    </w:p>
+    <w:p>
+      <w:pPr>
+        <w:spacing w:after="120"/>
+      </w:pPr>
+      <w:r>
+        <w:rPr>
+          <w:rFonts w:ascii="Arial" w:cs="Arial" w:eastAsia="Arial" w:hAnsi="Arial"/>
+          <w:b/>
+          <w:bCs/>
+          <w:sz w:val="21"/>
+          <w:szCs w:val="21"/>
+        </w:rPr>
+        <w:t xml:space="preserve">1. Open the workspace</w:t>
+      </w:r>
+    </w:p>
+    <w:p>
+      <w:pPr>
+        <w:pStyle w:val="ListParagraph"/>
+        <w:numPr>
+          <w:ilvl w:val="0"/>
+          <w:numId w:val="3"/>
+        </w:numPr>
+        <w:spacing w:after="60"/>
+      </w:pPr>
+      <w:r>
+        <w:rPr>
+          <w:rFonts w:ascii="Arial" w:cs="Arial" w:eastAsia="Arial" w:hAnsi="Arial"/>
+          <w:sz w:val="21"/>
+          <w:szCs w:val="21"/>
+        </w:rPr>
+        <w:t xml:space="preserve">In the back-office, open </w:t>
+      </w:r>
+      <w:r>
+        <w:rPr>
+          <w:rFonts w:ascii="Arial" w:cs="Arial" w:eastAsia="Arial" w:hAnsi="Arial"/>
+          <w:b/>
+          <w:bCs/>
+          <w:sz w:val="21"/>
+          <w:szCs w:val="21"/>
+        </w:rPr>
+        <w:t xml:space="preserve">People and Access → Users</w:t>
+      </w:r>
+      <w:r>
+        <w:rPr>
+          <w:rFonts w:ascii="Arial" w:cs="Arial" w:eastAsia="Arial" w:hAnsi="Arial"/>
+          <w:sz w:val="21"/>
+          <w:szCs w:val="21"/>
+        </w:rPr>
+        <w:t xml:space="preserve"> and search for </w:t>
+      </w:r>
+      <w:r>
+        <w:rPr>
+          <w:rFonts w:ascii="Consolas" w:cs="Consolas" w:eastAsia="Consolas" w:hAnsi="Consolas"/>
+          <w:sz w:val="21"/>
+          <w:szCs w:val="21"/>
+        </w:rPr>
+        <w:t xml:space="preserve">demo.admin@cityht.example</w:t>
+      </w:r>
+      <w:r>
+        <w:rPr>
+          <w:rFonts w:ascii="Arial" w:cs="Arial" w:eastAsia="Arial" w:hAnsi="Arial"/>
+          <w:sz w:val="21"/>
+          <w:szCs w:val="21"/>
+        </w:rPr>
+        <w:t xml:space="preserve">.</w:t>
+      </w:r>
+    </w:p>
+    <w:p>
+      <w:pPr>
+        <w:pStyle w:val="ListParagraph"/>
+        <w:numPr>
+          <w:ilvl w:val="0"/>
+          <w:numId w:val="3"/>
+        </w:numPr>
+        <w:spacing w:after="60"/>
+      </w:pPr>
+      <w:r>
+        <w:rPr>
+          <w:rFonts w:ascii="Arial" w:cs="Arial" w:eastAsia="Arial" w:hAnsi="Arial"/>
+          <w:sz w:val="21"/>
+          <w:szCs w:val="21"/>
+        </w:rPr>
+        <w:t xml:space="preserve">Open the user and choose </w:t>
+      </w:r>
+      <w:r>
+        <w:rPr>
+          <w:rFonts w:ascii="Arial" w:cs="Arial" w:eastAsia="Arial" w:hAnsi="Arial"/>
+          <w:b/>
+          <w:bCs/>
+          <w:sz w:val="21"/>
+          <w:szCs w:val="21"/>
+        </w:rPr>
+        <w:t xml:space="preserve">Sign In as This User (support session)</w:t>
+      </w:r>
+      <w:r>
+        <w:rPr>
+          <w:rFonts w:ascii="Arial" w:cs="Arial" w:eastAsia="Arial" w:hAnsi="Arial"/>
+          <w:sz w:val="21"/>
+          <w:szCs w:val="21"/>
+        </w:rPr>
+        <w:t xml:space="preserve">.</w:t>
+      </w:r>
+    </w:p>
+    <w:p>
+      <w:pPr>
+        <w:pStyle w:val="ListParagraph"/>
+        <w:numPr>
+          <w:ilvl w:val="0"/>
+          <w:numId w:val="3"/>
+        </w:numPr>
+        <w:spacing w:after="60"/>
+      </w:pPr>
+      <w:r>
+        <w:rPr>
+          <w:rFonts w:ascii="Arial" w:cs="Arial" w:eastAsia="Arial" w:hAnsi="Arial"/>
+          <w:sz w:val="21"/>
+          <w:szCs w:val="21"/>
+        </w:rPr>
+        <w:t xml:space="preserve">Write a reason (for example </w:t>
+      </w:r>
+      <w:r>
+        <w:rPr>
+          <w:rFonts w:ascii="Arial" w:cs="Arial" w:eastAsia="Arial" w:hAnsi="Arial"/>
+          <w:i/>
+          <w:iCs/>
+          <w:sz w:val="21"/>
+          <w:szCs w:val="21"/>
+        </w:rPr>
+        <w:t xml:space="preserve">ClickHouse demo</w:t>
+      </w:r>
+      <w:r>
+        <w:rPr>
+          <w:rFonts w:ascii="Arial" w:cs="Arial" w:eastAsia="Arial" w:hAnsi="Arial"/>
+          <w:sz w:val="21"/>
+          <w:szCs w:val="21"/>
+        </w:rPr>
+        <w:t xml:space="preserve">), keep the access </w:t>
+      </w:r>
+      <w:r>
+        <w:rPr>
+          <w:rFonts w:ascii="Arial" w:cs="Arial" w:eastAsia="Arial" w:hAnsi="Arial"/>
+          <w:b/>
+          <w:bCs/>
+          <w:sz w:val="21"/>
+          <w:szCs w:val="21"/>
+        </w:rPr>
+        <w:t xml:space="preserve">read-only</w:t>
+      </w:r>
+      <w:r>
+        <w:rPr>
+          <w:rFonts w:ascii="Arial" w:cs="Arial" w:eastAsia="Arial" w:hAnsi="Arial"/>
+          <w:sz w:val="21"/>
+          <w:szCs w:val="21"/>
+        </w:rPr>
+        <w:t xml:space="preserve"> unless you will change something, and confirm.</w:t>
+      </w:r>
+    </w:p>
+    <w:p>
+      <w:pPr>
+        <w:pStyle w:val="ListParagraph"/>
+        <w:numPr>
+          <w:ilvl w:val="0"/>
+          <w:numId w:val="3"/>
+        </w:numPr>
+        <w:spacing w:after="60"/>
+      </w:pPr>
+      <w:r>
+        <w:rPr>
+          <w:rFonts w:ascii="Arial" w:cs="Arial" w:eastAsia="Arial" w:hAnsi="Arial"/>
+          <w:sz w:val="21"/>
+          <w:szCs w:val="21"/>
+        </w:rPr>
+        <w:t xml:space="preserve">The app opens as City HT, with the support banner at the top.</w:t>
+      </w:r>
+    </w:p>
+    <w:p>
+      <w:pPr>
+        <w:spacing w:after="120"/>
+      </w:pPr>
+      <w:r>
+        <w:rPr>
+          <w:rFonts w:ascii="Arial" w:cs="Arial" w:eastAsia="Arial" w:hAnsi="Arial"/>
+          <w:b/>
+          <w:bCs/>
+          <w:sz w:val="21"/>
+          <w:szCs w:val="21"/>
+        </w:rPr>
+        <w:t xml:space="preserve">2. Show that the workspace runs on ClickHouse</w:t>
+      </w:r>
+    </w:p>
+    <w:p>
+      <w:pPr>
+        <w:pStyle w:val="ListParagraph"/>
+        <w:numPr>
+          <w:ilvl w:val="0"/>
+          <w:numId w:val="3"/>
+        </w:numPr>
+        <w:spacing w:after="60"/>
+      </w:pPr>
+      <w:r>
+        <w:rPr>
+          <w:rFonts w:ascii="Arial" w:cs="Arial" w:eastAsia="Arial" w:hAnsi="Arial"/>
+          <w:sz w:val="21"/>
+          <w:szCs w:val="21"/>
+        </w:rPr>
+        <w:t xml:space="preserve">In the back-office, open </w:t>
+      </w:r>
+      <w:r>
+        <w:rPr>
+          <w:rFonts w:ascii="Arial" w:cs="Arial" w:eastAsia="Arial" w:hAnsi="Arial"/>
+          <w:b/>
+          <w:bCs/>
+          <w:sz w:val="21"/>
+          <w:szCs w:val="21"/>
+        </w:rPr>
+        <w:t xml:space="preserve">Configuration → Report Engines</w:t>
+      </w:r>
+      <w:r>
+        <w:rPr>
+          <w:rFonts w:ascii="Arial" w:cs="Arial" w:eastAsia="Arial" w:hAnsi="Arial"/>
+          <w:sz w:val="21"/>
+          <w:szCs w:val="21"/>
+        </w:rPr>
+        <w:t xml:space="preserve"> and the CITYHT row: engine </w:t>
+      </w:r>
+      <w:r>
+        <w:rPr>
+          <w:rFonts w:ascii="Arial" w:cs="Arial" w:eastAsia="Arial" w:hAnsi="Arial"/>
+          <w:b/>
+          <w:bCs/>
+          <w:sz w:val="21"/>
+          <w:szCs w:val="21"/>
+        </w:rPr>
+        <w:t xml:space="preserve">clickhouse</w:t>
+      </w:r>
+      <w:r>
+        <w:rPr>
+          <w:rFonts w:ascii="Arial" w:cs="Arial" w:eastAsia="Arial" w:hAnsi="Arial"/>
+          <w:sz w:val="21"/>
+          <w:szCs w:val="21"/>
+        </w:rPr>
+        <w:t xml:space="preserve">, status </w:t>
+      </w:r>
+      <w:r>
+        <w:rPr>
+          <w:rFonts w:ascii="Arial" w:cs="Arial" w:eastAsia="Arial" w:hAnsi="Arial"/>
+          <w:b/>
+          <w:bCs/>
+          <w:sz w:val="21"/>
+          <w:szCs w:val="21"/>
+        </w:rPr>
+        <w:t xml:space="preserve">ACTIVE</w:t>
+      </w:r>
+      <w:r>
+        <w:rPr>
+          <w:rFonts w:ascii="Arial" w:cs="Arial" w:eastAsia="Arial" w:hAnsi="Arial"/>
+          <w:sz w:val="21"/>
+          <w:szCs w:val="21"/>
+        </w:rPr>
+        <w:t xml:space="preserve">, freshness </w:t>
+      </w:r>
+      <w:r>
+        <w:rPr>
+          <w:rFonts w:ascii="Arial" w:cs="Arial" w:eastAsia="Arial" w:hAnsi="Arial"/>
+          <w:b/>
+          <w:bCs/>
+          <w:sz w:val="21"/>
+          <w:szCs w:val="21"/>
+        </w:rPr>
+        <w:t xml:space="preserve">QUARTER_HOUR</w:t>
+      </w:r>
+      <w:r>
+        <w:rPr>
+          <w:rFonts w:ascii="Arial" w:cs="Arial" w:eastAsia="Arial" w:hAnsi="Arial"/>
+          <w:sz w:val="21"/>
+          <w:szCs w:val="21"/>
+        </w:rPr>
+        <w:t xml:space="preserve">.</w:t>
+      </w:r>
+    </w:p>
+    <w:p>
+      <w:pPr>
+        <w:pStyle w:val="ListParagraph"/>
+        <w:numPr>
+          <w:ilvl w:val="0"/>
+          <w:numId w:val="3"/>
+        </w:numPr>
+        <w:spacing w:after="60"/>
+      </w:pPr>
+      <w:r>
+        <w:rPr>
+          <w:rFonts w:ascii="Arial" w:cs="Arial" w:eastAsia="Arial" w:hAnsi="Arial"/>
+          <w:sz w:val="21"/>
+          <w:szCs w:val="21"/>
+        </w:rPr>
+        <w:t xml:space="preserve">In the app, every Insights report says under its title that the data is as of the last quarter hour.</w:t>
+      </w:r>
+    </w:p>
+    <w:p>
+      <w:pPr>
+        <w:spacing w:after="120"/>
+      </w:pPr>
+      <w:r>
+        <w:rPr>
+          <w:rFonts w:ascii="Arial" w:cs="Arial" w:eastAsia="Arial" w:hAnsi="Arial"/>
+          <w:b/>
+          <w:bCs/>
+          <w:sz w:val="21"/>
+          <w:szCs w:val="21"/>
+        </w:rPr>
+        <w:t xml:space="preserve">3. Run the saved reports</w:t>
+      </w:r>
+    </w:p>
+    <w:p>
+      <w:pPr>
+        <w:pStyle w:val="ListParagraph"/>
+        <w:numPr>
+          <w:ilvl w:val="0"/>
+          <w:numId w:val="3"/>
+        </w:numPr>
+        <w:spacing w:after="60"/>
+      </w:pPr>
+      <w:r>
+        <w:rPr>
+          <w:rFonts w:ascii="Arial" w:cs="Arial" w:eastAsia="Arial" w:hAnsi="Arial"/>
+          <w:sz w:val="21"/>
+          <w:szCs w:val="21"/>
+        </w:rPr>
+        <w:t xml:space="preserve">In the app, open </w:t>
+      </w:r>
+      <w:r>
+        <w:rPr>
+          <w:rFonts w:ascii="Arial" w:cs="Arial" w:eastAsia="Arial" w:hAnsi="Arial"/>
+          <w:b/>
+          <w:bCs/>
+          <w:sz w:val="21"/>
+          <w:szCs w:val="21"/>
+        </w:rPr>
+        <w:t xml:space="preserve">Insights → Reports</w:t>
+      </w:r>
+      <w:r>
+        <w:rPr>
+          <w:rFonts w:ascii="Arial" w:cs="Arial" w:eastAsia="Arial" w:hAnsi="Arial"/>
+          <w:sz w:val="21"/>
+          <w:szCs w:val="21"/>
+        </w:rPr>
+        <w:t xml:space="preserve"> and the </w:t>
+      </w:r>
+      <w:r>
+        <w:rPr>
+          <w:rFonts w:ascii="Arial" w:cs="Arial" w:eastAsia="Arial" w:hAnsi="Arial"/>
+          <w:b/>
+          <w:bCs/>
+          <w:sz w:val="21"/>
+          <w:szCs w:val="21"/>
+        </w:rPr>
+        <w:t xml:space="preserve">Demo</w:t>
+      </w:r>
+      <w:r>
+        <w:rPr>
+          <w:rFonts w:ascii="Arial" w:cs="Arial" w:eastAsia="Arial" w:hAnsi="Arial"/>
+          <w:sz w:val="21"/>
+          <w:szCs w:val="21"/>
+        </w:rPr>
+        <w:t xml:space="preserve"> folder.</w:t>
+      </w:r>
+    </w:p>
+    <w:p>
+      <w:pPr>
+        <w:pStyle w:val="ListParagraph"/>
+        <w:numPr>
+          <w:ilvl w:val="0"/>
+          <w:numId w:val="3"/>
+        </w:numPr>
+        <w:spacing w:after="60"/>
+      </w:pPr>
+      <w:r>
+        <w:rPr>
+          <w:rFonts w:ascii="Arial" w:cs="Arial" w:eastAsia="Arial" w:hAnsi="Arial"/>
+          <w:sz w:val="21"/>
+          <w:szCs w:val="21"/>
+        </w:rPr>
+        <w:t xml:space="preserve">Open the reports in this order, each a different kind of question over the large data:</w:t>
+      </w:r>
+    </w:p>
+    <w:tbl>
+      <w:tblPr>
+        <w:tblW w:type="dxa" w:w="10080"/>
+        <w:tblBorders>
+          <w:top w:val="single" w:color="D9DBE3" w:sz="4"/>
+          <w:left w:val="none"/>
+          <w:bottom w:val="single" w:color="D9DBE3" w:sz="4"/>
+          <w:right w:val="none"/>
+          <w:insideH w:val="single" w:color="E6E8EF" w:sz="4"/>
+          <w:insideV w:val="none"/>
+        </w:tblBorders>
+      </w:tblPr>
+      <w:tblGrid>
+        <w:gridCol w:w="2600"/>
+        <w:gridCol w:w="3740"/>
+        <w:gridCol w:w="3740"/>
+      </w:tblGrid>
+      <w:tr>
+        <w:trPr>
+          <w:tblHeader/>
+        </w:trPr>
+        <w:tc>
+          <w:tcPr>
+            <w:tcW w:type="dxa" w:w="2600"/>
+            <w:shd w:fill="EEEFF5" w:color="auto" w:val="clear"/>
+            <w:tcMar>
+              <w:top w:type="dxa" w:w="60"/>
+              <w:left w:type="dxa" w:w="90"/>
+              <w:bottom w:type="dxa" w:w="60"/>
+              <w:right w:type="dxa" w:w="90"/>
+            </w:tcMar>
+          </w:tcPr>
+          <w:p>
+            <w:r>
+              <w:rPr>
+                <w:rFonts w:ascii="Arial" w:cs="Arial" w:eastAsia="Arial" w:hAnsi="Arial"/>
+                <w:b/>
+                <w:bCs/>
+                <w:sz w:val="18"/>
+                <w:szCs w:val="18"/>
+              </w:rPr>
+              <w:t xml:space="preserve">Report</w:t>
+            </w:r>
+          </w:p>
+        </w:tc>
+        <w:tc>
+          <w:tcPr>
+            <w:tcW w:type="dxa" w:w="3740"/>
+            <w:shd w:fill="EEEFF5" w:color="auto" w:val="clear"/>
+            <w:tcMar>
+              <w:top w:type="dxa" w:w="60"/>
+              <w:left w:type="dxa" w:w="90"/>
+              <w:bottom w:type="dxa" w:w="60"/>
+              <w:right w:type="dxa" w:w="90"/>
+            </w:tcMar>
+          </w:tcPr>
+          <w:p>
+            <w:r>
+              <w:rPr>
+                <w:rFonts w:ascii="Arial" w:cs="Arial" w:eastAsia="Arial" w:hAnsi="Arial"/>
+                <w:b/>
+                <w:bCs/>
+                <w:sz w:val="18"/>
+                <w:szCs w:val="18"/>
+              </w:rPr>
+              <w:t xml:space="preserve">What it reads</w:t>
+            </w:r>
+          </w:p>
+        </w:tc>
+        <w:tc>
+          <w:tcPr>
+            <w:tcW w:type="dxa" w:w="3740"/>
+            <w:shd w:fill="EEEFF5" w:color="auto" w:val="clear"/>
+            <w:tcMar>
+              <w:top w:type="dxa" w:w="60"/>
+              <w:left w:type="dxa" w:w="90"/>
+              <w:bottom w:type="dxa" w:w="60"/>
+              <w:right w:type="dxa" w:w="90"/>
+            </w:tcMar>
+          </w:tcPr>
+          <w:p>
+            <w:r>
+              <w:rPr>
+                <w:rFonts w:ascii="Arial" w:cs="Arial" w:eastAsia="Arial" w:hAnsi="Arial"/>
+                <w:b/>
+                <w:bCs/>
+                <w:sz w:val="18"/>
+                <w:szCs w:val="18"/>
+              </w:rPr>
+              <w:t xml:space="preserve">First run (measured)</w:t>
+            </w:r>
+          </w:p>
+        </w:tc>
+      </w:tr>
+      <w:tr>
+        <w:tc>
+          <w:tcPr>
+            <w:tcW w:type="dxa" w:w="2600"/>
+            <w:tcMar>
+              <w:top w:type="dxa" w:w="60"/>
+              <w:left w:type="dxa" w:w="90"/>
+              <w:bottom w:type="dxa" w:w="60"/>
+              <w:right w:type="dxa" w:w="90"/>
+            </w:tcMar>
+          </w:tcPr>
+          <w:p>
+            <w:r>
+              <w:rPr>
+                <w:rFonts w:ascii="Arial" w:cs="Arial" w:eastAsia="Arial" w:hAnsi="Arial"/>
+                <w:sz w:val="19"/>
+                <w:szCs w:val="19"/>
+              </w:rPr>
+              <w:t xml:space="preserve">Demo · Channel Mix by Quarter</w:t>
+            </w:r>
+          </w:p>
+        </w:tc>
+        <w:tc>
+          <w:tcPr>
+            <w:tcW w:type="dxa" w:w="3740"/>
+            <w:tcMar>
+              <w:top w:type="dxa" w:w="60"/>
+              <w:left w:type="dxa" w:w="90"/>
+              <w:bottom w:type="dxa" w:w="60"/>
+              <w:right w:type="dxa" w:w="90"/>
+            </w:tcMar>
+          </w:tcPr>
+          <w:p>
+            <w:r>
+              <w:rPr>
+                <w:rFonts w:ascii="Arial" w:cs="Arial" w:eastAsia="Arial" w:hAnsi="Arial"/>
+                <w:sz w:val="19"/>
+                <w:szCs w:val="19"/>
+              </w:rPr>
+              <w:t xml:space="preserve">25M messages, grouped by quarter and channel</w:t>
+            </w:r>
+          </w:p>
+        </w:tc>
+        <w:tc>
+          <w:tcPr>
+            <w:tcW w:type="dxa" w:w="3740"/>
+            <w:tcMar>
+              <w:top w:type="dxa" w:w="60"/>
+              <w:left w:type="dxa" w:w="90"/>
+              <w:bottom w:type="dxa" w:w="60"/>
+              <w:right w:type="dxa" w:w="90"/>
+            </w:tcMar>
+          </w:tcPr>
+          <w:p>
+            <w:r>
+              <w:rPr>
+                <w:rFonts w:ascii="Arial" w:cs="Arial" w:eastAsia="Arial" w:hAnsi="Arial"/>
+                <w:sz w:val="19"/>
+                <w:szCs w:val="19"/>
+              </w:rPr>
+              <w:t xml:space="preserve">0.66 s</w:t>
+            </w:r>
+          </w:p>
+        </w:tc>
+      </w:tr>
+      <w:tr>
+        <w:tc>
+          <w:tcPr>
+            <w:tcW w:type="dxa" w:w="2600"/>
+            <w:tcMar>
+              <w:top w:type="dxa" w:w="60"/>
+              <w:left w:type="dxa" w:w="90"/>
+              <w:bottom w:type="dxa" w:w="60"/>
+              <w:right w:type="dxa" w:w="90"/>
+            </w:tcMar>
+          </w:tcPr>
+          <w:p>
+            <w:r>
+              <w:rPr>
+                <w:rFonts w:ascii="Arial" w:cs="Arial" w:eastAsia="Arial" w:hAnsi="Arial"/>
+                <w:sz w:val="19"/>
+                <w:szCs w:val="19"/>
+              </w:rPr>
+              <w:t xml:space="preserve">Demo · Email Funnel by Campaign</w:t>
+            </w:r>
+          </w:p>
+        </w:tc>
+        <w:tc>
+          <w:tcPr>
+            <w:tcW w:type="dxa" w:w="3740"/>
+            <w:tcMar>
+              <w:top w:type="dxa" w:w="60"/>
+              <w:left w:type="dxa" w:w="90"/>
+              <w:bottom w:type="dxa" w:w="60"/>
+              <w:right w:type="dxa" w:w="90"/>
+            </w:tcMar>
+          </w:tcPr>
+          <w:p>
+            <w:r>
+              <w:rPr>
+                <w:rFonts w:ascii="Arial" w:cs="Arial" w:eastAsia="Arial" w:hAnsi="Arial"/>
+                <w:sz w:val="19"/>
+                <w:szCs w:val="19"/>
+              </w:rPr>
+              <w:t xml:space="preserve">25M messages: sent, delivered, opened, clicked per campaign</w:t>
+            </w:r>
+          </w:p>
+        </w:tc>
+        <w:tc>
+          <w:tcPr>
+            <w:tcW w:type="dxa" w:w="3740"/>
+            <w:tcMar>
+              <w:top w:type="dxa" w:w="60"/>
+              <w:left w:type="dxa" w:w="90"/>
+              <w:bottom w:type="dxa" w:w="60"/>
+              <w:right w:type="dxa" w:w="90"/>
+            </w:tcMar>
+          </w:tcPr>
+          <w:p>
+            <w:r>
+              <w:rPr>
+                <w:rFonts w:ascii="Arial" w:cs="Arial" w:eastAsia="Arial" w:hAnsi="Arial"/>
+                <w:sz w:val="19"/>
+                <w:szCs w:val="19"/>
+              </w:rPr>
+              <w:t xml:space="preserve">0.54 s</w:t>
+            </w:r>
+          </w:p>
+        </w:tc>
+      </w:tr>
+      <w:tr>
+        <w:tc>
+          <w:tcPr>
+            <w:tcW w:type="dxa" w:w="2600"/>
+            <w:tcMar>
+              <w:top w:type="dxa" w:w="60"/>
+              <w:left w:type="dxa" w:w="90"/>
+              <w:bottom w:type="dxa" w:w="60"/>
+              <w:right w:type="dxa" w:w="90"/>
+            </w:tcMar>
+          </w:tcPr>
+          <w:p>
+            <w:r>
+              <w:rPr>
+                <w:rFonts w:ascii="Arial" w:cs="Arial" w:eastAsia="Arial" w:hAnsi="Arial"/>
+                <w:sz w:val="19"/>
+                <w:szCs w:val="19"/>
+              </w:rPr>
+              <w:t xml:space="preserve">Demo · Campaign Detail</w:t>
+            </w:r>
+          </w:p>
+        </w:tc>
+        <w:tc>
+          <w:tcPr>
+            <w:tcW w:type="dxa" w:w="3740"/>
+            <w:tcMar>
+              <w:top w:type="dxa" w:w="60"/>
+              <w:left w:type="dxa" w:w="90"/>
+              <w:bottom w:type="dxa" w:w="60"/>
+              <w:right w:type="dxa" w:w="90"/>
+            </w:tcMar>
+          </w:tcPr>
+          <w:p>
+            <w:r>
+              <w:rPr>
+                <w:rFonts w:ascii="Arial" w:cs="Arial" w:eastAsia="Arial" w:hAnsi="Arial"/>
+                <w:sz w:val="19"/>
+                <w:szCs w:val="19"/>
+              </w:rPr>
+              <w:t xml:space="preserve">25M messages, every campaign and run</w:t>
+            </w:r>
+          </w:p>
+        </w:tc>
+        <w:tc>
+          <w:tcPr>
+            <w:tcW w:type="dxa" w:w="3740"/>
+            <w:tcMar>
+              <w:top w:type="dxa" w:w="60"/>
+              <w:left w:type="dxa" w:w="90"/>
+              <w:bottom w:type="dxa" w:w="60"/>
+              <w:right w:type="dxa" w:w="90"/>
+            </w:tcMar>
+          </w:tcPr>
+          <w:p>
+            <w:r>
+              <w:rPr>
+                <w:rFonts w:ascii="Arial" w:cs="Arial" w:eastAsia="Arial" w:hAnsi="Arial"/>
+                <w:sz w:val="19"/>
+                <w:szCs w:val="19"/>
+              </w:rPr>
+              <w:t xml:space="preserve">0.80 s</w:t>
+            </w:r>
+          </w:p>
+        </w:tc>
+      </w:tr>
+      <w:tr>
+        <w:tc>
+          <w:tcPr>
+            <w:tcW w:type="dxa" w:w="2600"/>
+            <w:tcMar>
+              <w:top w:type="dxa" w:w="60"/>
+              <w:left w:type="dxa" w:w="90"/>
+              <w:bottom w:type="dxa" w:w="60"/>
+              <w:right w:type="dxa" w:w="90"/>
+            </w:tcMar>
+          </w:tcPr>
+          <w:p>
+            <w:r>
+              <w:rPr>
+                <w:rFonts w:ascii="Arial" w:cs="Arial" w:eastAsia="Arial" w:hAnsi="Arial"/>
+                <w:sz w:val="19"/>
+                <w:szCs w:val="19"/>
+              </w:rPr>
+              <w:t xml:space="preserve">Demo · What Drives Clicks</w:t>
+            </w:r>
+          </w:p>
+        </w:tc>
+        <w:tc>
+          <w:tcPr>
+            <w:tcW w:type="dxa" w:w="3740"/>
+            <w:tcMar>
+              <w:top w:type="dxa" w:w="60"/>
+              <w:left w:type="dxa" w:w="90"/>
+              <w:bottom w:type="dxa" w:w="60"/>
+              <w:right w:type="dxa" w:w="90"/>
+            </w:tcMar>
+          </w:tcPr>
+          <w:p>
+            <w:r>
+              <w:rPr>
+                <w:rFonts w:ascii="Arial" w:cs="Arial" w:eastAsia="Arial" w:hAnsi="Arial"/>
+                <w:sz w:val="19"/>
+                <w:szCs w:val="19"/>
+              </w:rPr>
+              <w:t xml:space="preserve">25M messages, Key Influencers</w:t>
+            </w:r>
+          </w:p>
+        </w:tc>
+        <w:tc>
+          <w:tcPr>
+            <w:tcW w:type="dxa" w:w="3740"/>
+            <w:tcMar>
+              <w:top w:type="dxa" w:w="60"/>
+              <w:left w:type="dxa" w:w="90"/>
+              <w:bottom w:type="dxa" w:w="60"/>
+              <w:right w:type="dxa" w:w="90"/>
+            </w:tcMar>
+          </w:tcPr>
+          <w:p>
+            <w:r>
+              <w:rPr>
+                <w:rFonts w:ascii="Arial" w:cs="Arial" w:eastAsia="Arial" w:hAnsi="Arial"/>
+                <w:sz w:val="19"/>
+                <w:szCs w:val="19"/>
+              </w:rPr>
+              <w:t xml:space="preserve">0.74 s</w:t>
+            </w:r>
+          </w:p>
+        </w:tc>
+      </w:tr>
+      <w:tr>
+        <w:tc>
+          <w:tcPr>
+            <w:tcW w:type="dxa" w:w="2600"/>
+            <w:tcMar>
+              <w:top w:type="dxa" w:w="60"/>
+              <w:left w:type="dxa" w:w="90"/>
+              <w:bottom w:type="dxa" w:w="60"/>
+              <w:right w:type="dxa" w:w="90"/>
+            </w:tcMar>
+          </w:tcPr>
+          <w:p>
+            <w:r>
+              <w:rPr>
+                <w:rFonts w:ascii="Arial" w:cs="Arial" w:eastAsia="Arial" w:hAnsi="Arial"/>
+                <w:sz w:val="19"/>
+                <w:szCs w:val="19"/>
+              </w:rPr>
+              <w:t xml:space="preserve">Demo · Weekly Sends vs the Week Before</w:t>
+            </w:r>
+          </w:p>
+        </w:tc>
+        <w:tc>
+          <w:tcPr>
+            <w:tcW w:type="dxa" w:w="3740"/>
+            <w:tcMar>
+              <w:top w:type="dxa" w:w="60"/>
+              <w:left w:type="dxa" w:w="90"/>
+              <w:bottom w:type="dxa" w:w="60"/>
+              <w:right w:type="dxa" w:w="90"/>
+            </w:tcMar>
+          </w:tcPr>
+          <w:p>
+            <w:r>
+              <w:rPr>
+                <w:rFonts w:ascii="Arial" w:cs="Arial" w:eastAsia="Arial" w:hAnsi="Arial"/>
+                <w:sz w:val="19"/>
+                <w:szCs w:val="19"/>
+              </w:rPr>
+              <w:t xml:space="preserve">25M messages, a week-on-week comparison</w:t>
+            </w:r>
+          </w:p>
+        </w:tc>
+        <w:tc>
+          <w:tcPr>
+            <w:tcW w:type="dxa" w:w="3740"/>
+            <w:tcMar>
+              <w:top w:type="dxa" w:w="60"/>
+              <w:left w:type="dxa" w:w="90"/>
+              <w:bottom w:type="dxa" w:w="60"/>
+              <w:right w:type="dxa" w:w="90"/>
+            </w:tcMar>
+          </w:tcPr>
+          <w:p>
+            <w:r>
+              <w:rPr>
+                <w:rFonts w:ascii="Arial" w:cs="Arial" w:eastAsia="Arial" w:hAnsi="Arial"/>
+                <w:sz w:val="19"/>
+                <w:szCs w:val="19"/>
+              </w:rPr>
+              <w:t xml:space="preserve">0.56 s</w:t>
+            </w:r>
+          </w:p>
+        </w:tc>
+      </w:tr>
+      <w:tr>
+        <w:tc>
+          <w:tcPr>
+            <w:tcW w:type="dxa" w:w="2600"/>
+            <w:tcMar>
+              <w:top w:type="dxa" w:w="60"/>
+              <w:left w:type="dxa" w:w="90"/>
+              <w:bottom w:type="dxa" w:w="60"/>
+              <w:right w:type="dxa" w:w="90"/>
+            </w:tcMar>
+          </w:tcPr>
+          <w:p>
+            <w:r>
+              <w:rPr>
+                <w:rFonts w:ascii="Arial" w:cs="Arial" w:eastAsia="Arial" w:hAnsi="Arial"/>
+                <w:sz w:val="19"/>
+                <w:szCs w:val="19"/>
+              </w:rPr>
+              <w:t xml:space="preserve">Demo · Attributed Revenue by Month</w:t>
+            </w:r>
+          </w:p>
+        </w:tc>
+        <w:tc>
+          <w:tcPr>
+            <w:tcW w:type="dxa" w:w="3740"/>
+            <w:tcMar>
+              <w:top w:type="dxa" w:w="60"/>
+              <w:left w:type="dxa" w:w="90"/>
+              <w:bottom w:type="dxa" w:w="60"/>
+              <w:right w:type="dxa" w:w="90"/>
+            </w:tcMar>
+          </w:tcPr>
+          <w:p>
+            <w:r>
+              <w:rPr>
+                <w:rFonts w:ascii="Arial" w:cs="Arial" w:eastAsia="Arial" w:hAnsi="Arial"/>
+                <w:sz w:val="19"/>
+                <w:szCs w:val="19"/>
+              </w:rPr>
+              <w:t xml:space="preserve">3M orders</w:t>
+            </w:r>
+          </w:p>
+        </w:tc>
+        <w:tc>
+          <w:tcPr>
+            <w:tcW w:type="dxa" w:w="3740"/>
+            <w:tcMar>
+              <w:top w:type="dxa" w:w="60"/>
+              <w:left w:type="dxa" w:w="90"/>
+              <w:bottom w:type="dxa" w:w="60"/>
+              <w:right w:type="dxa" w:w="90"/>
+            </w:tcMar>
+          </w:tcPr>
+          <w:p>
+            <w:r>
+              <w:rPr>
+                <w:rFonts w:ascii="Arial" w:cs="Arial" w:eastAsia="Arial" w:hAnsi="Arial"/>
+                <w:sz w:val="19"/>
+                <w:szCs w:val="19"/>
+              </w:rPr>
+              <w:t xml:space="preserve">0.05 s</w:t>
+            </w:r>
+          </w:p>
+        </w:tc>
+      </w:tr>
+      <w:tr>
+        <w:tc>
+          <w:tcPr>
+            <w:tcW w:type="dxa" w:w="2600"/>
+            <w:tcMar>
+              <w:top w:type="dxa" w:w="60"/>
+              <w:left w:type="dxa" w:w="90"/>
+              <w:bottom w:type="dxa" w:w="60"/>
+              <w:right w:type="dxa" w:w="90"/>
+            </w:tcMar>
+          </w:tcPr>
+          <w:p>
+            <w:r>
+              <w:rPr>
+                <w:rFonts w:ascii="Arial" w:cs="Arial" w:eastAsia="Arial" w:hAnsi="Arial"/>
+                <w:sz w:val="19"/>
+                <w:szCs w:val="19"/>
+              </w:rPr>
+              <w:t xml:space="preserve">Demo · Customers by State</w:t>
+            </w:r>
+          </w:p>
+        </w:tc>
+        <w:tc>
+          <w:tcPr>
+            <w:tcW w:type="dxa" w:w="3740"/>
+            <w:tcMar>
+              <w:top w:type="dxa" w:w="60"/>
+              <w:left w:type="dxa" w:w="90"/>
+              <w:bottom w:type="dxa" w:w="60"/>
+              <w:right w:type="dxa" w:w="90"/>
+            </w:tcMar>
+          </w:tcPr>
+          <w:p>
+            <w:r>
+              <w:rPr>
+                <w:rFonts w:ascii="Arial" w:cs="Arial" w:eastAsia="Arial" w:hAnsi="Arial"/>
+                <w:sz w:val="19"/>
+                <w:szCs w:val="19"/>
+              </w:rPr>
+              <w:t xml:space="preserve">2M contacts</w:t>
+            </w:r>
+          </w:p>
+        </w:tc>
+        <w:tc>
+          <w:tcPr>
+            <w:tcW w:type="dxa" w:w="3740"/>
+            <w:tcMar>
+              <w:top w:type="dxa" w:w="60"/>
+              <w:left w:type="dxa" w:w="90"/>
+              <w:bottom w:type="dxa" w:w="60"/>
+              <w:right w:type="dxa" w:w="90"/>
+            </w:tcMar>
+          </w:tcPr>
+          <w:p>
+            <w:r>
+              <w:rPr>
+                <w:rFonts w:ascii="Arial" w:cs="Arial" w:eastAsia="Arial" w:hAnsi="Arial"/>
+                <w:sz w:val="19"/>
+                <w:szCs w:val="19"/>
+              </w:rPr>
+              <w:t xml:space="preserve">0.03 s</w:t>
+            </w:r>
+          </w:p>
+        </w:tc>
+      </w:tr>
+      <w:tr>
+        <w:tc>
+          <w:tcPr>
+            <w:tcW w:type="dxa" w:w="2600"/>
+            <w:tcMar>
+              <w:top w:type="dxa" w:w="60"/>
+              <w:left w:type="dxa" w:w="90"/>
+              <w:bottom w:type="dxa" w:w="60"/>
+              <w:right w:type="dxa" w:w="90"/>
+            </w:tcMar>
+          </w:tcPr>
+          <w:p>
+            <w:r>
+              <w:rPr>
+                <w:rFonts w:ascii="Arial" w:cs="Arial" w:eastAsia="Arial" w:hAnsi="Arial"/>
+                <w:sz w:val="19"/>
+                <w:szCs w:val="19"/>
+              </w:rPr>
+              <w:t xml:space="preserve">Demo · Journey Conversion</w:t>
+            </w:r>
+          </w:p>
+        </w:tc>
+        <w:tc>
+          <w:tcPr>
+            <w:tcW w:type="dxa" w:w="3740"/>
+            <w:tcMar>
+              <w:top w:type="dxa" w:w="60"/>
+              <w:left w:type="dxa" w:w="90"/>
+              <w:bottom w:type="dxa" w:w="60"/>
+              <w:right w:type="dxa" w:w="90"/>
+            </w:tcMar>
+          </w:tcPr>
+          <w:p>
+            <w:r>
+              <w:rPr>
+                <w:rFonts w:ascii="Arial" w:cs="Arial" w:eastAsia="Arial" w:hAnsi="Arial"/>
+                <w:sz w:val="19"/>
+                <w:szCs w:val="19"/>
+              </w:rPr>
+              <w:t xml:space="preserve">0.5M enrolments</w:t>
+            </w:r>
+          </w:p>
+        </w:tc>
+        <w:tc>
+          <w:tcPr>
+            <w:tcW w:type="dxa" w:w="3740"/>
+            <w:tcMar>
+              <w:top w:type="dxa" w:w="60"/>
+              <w:left w:type="dxa" w:w="90"/>
+              <w:bottom w:type="dxa" w:w="60"/>
+              <w:right w:type="dxa" w:w="90"/>
+            </w:tcMar>
+          </w:tcPr>
+          <w:p>
+            <w:r>
+              <w:rPr>
+                <w:rFonts w:ascii="Arial" w:cs="Arial" w:eastAsia="Arial" w:hAnsi="Arial"/>
+                <w:sz w:val="19"/>
+                <w:szCs w:val="19"/>
+              </w:rPr>
+              <w:t xml:space="preserve">0.03 s</w:t>
+            </w:r>
+          </w:p>
+        </w:tc>
+      </w:tr>
+    </w:tbl>
+    <w:p>
+      <w:pPr>
+        <w:spacing w:after="120"/>
+      </w:pPr>
+    </w:p>
+    <w:p>
+      <w:pPr>
+        <w:pStyle w:val="ListParagraph"/>
+        <w:numPr>
+          <w:ilvl w:val="0"/>
+          <w:numId w:val="3"/>
+        </w:numPr>
+        <w:spacing w:after="60"/>
+      </w:pPr>
+      <w:r>
+        <w:rPr>
+          <w:rFonts w:ascii="Arial" w:cs="Arial" w:eastAsia="Arial" w:hAnsi="Arial"/>
+          <w:sz w:val="21"/>
+          <w:szCs w:val="21"/>
+        </w:rPr>
+        <w:t xml:space="preserve">Opening a report a second time is almost instant (1 to 2 milliseconds): that is the app's result cache, not ClickHouse. To show ClickHouse itself again, change a filter (for example the date range) and run it.</w:t>
+      </w:r>
+    </w:p>
+    <w:p>
+      <w:pPr>
+        <w:spacing w:after="120"/>
+      </w:pPr>
+      <w:r>
+        <w:rPr>
+          <w:rFonts w:ascii="Arial" w:cs="Arial" w:eastAsia="Arial" w:hAnsi="Arial"/>
+          <w:b/>
+          <w:bCs/>
+          <w:sz w:val="21"/>
+          <w:szCs w:val="21"/>
+        </w:rPr>
+        <w:t xml:space="preserve">4. Build a report live</w:t>
+      </w:r>
+    </w:p>
+    <w:p>
+      <w:pPr>
+        <w:pStyle w:val="ListParagraph"/>
+        <w:numPr>
+          <w:ilvl w:val="0"/>
+          <w:numId w:val="3"/>
+        </w:numPr>
+        <w:spacing w:after="60"/>
+      </w:pPr>
+      <w:r>
+        <w:rPr>
+          <w:rFonts w:ascii="Arial" w:cs="Arial" w:eastAsia="Arial" w:hAnsi="Arial"/>
+          <w:sz w:val="21"/>
+          <w:szCs w:val="21"/>
+        </w:rPr>
+        <w:t xml:space="preserve">In </w:t>
+      </w:r>
+      <w:r>
+        <w:rPr>
+          <w:rFonts w:ascii="Arial" w:cs="Arial" w:eastAsia="Arial" w:hAnsi="Arial"/>
+          <w:b/>
+          <w:bCs/>
+          <w:sz w:val="21"/>
+          <w:szCs w:val="21"/>
+        </w:rPr>
+        <w:t xml:space="preserve">Insights → Reports</w:t>
+      </w:r>
+      <w:r>
+        <w:rPr>
+          <w:rFonts w:ascii="Arial" w:cs="Arial" w:eastAsia="Arial" w:hAnsi="Arial"/>
+          <w:sz w:val="21"/>
+          <w:szCs w:val="21"/>
+        </w:rPr>
+        <w:t xml:space="preserve">, start a new report on </w:t>
+      </w:r>
+      <w:r>
+        <w:rPr>
+          <w:rFonts w:ascii="Arial" w:cs="Arial" w:eastAsia="Arial" w:hAnsi="Arial"/>
+          <w:b/>
+          <w:bCs/>
+          <w:sz w:val="21"/>
+          <w:szCs w:val="21"/>
+        </w:rPr>
+        <w:t xml:space="preserve">Messages</w:t>
+      </w:r>
+      <w:r>
+        <w:rPr>
+          <w:rFonts w:ascii="Arial" w:cs="Arial" w:eastAsia="Arial" w:hAnsi="Arial"/>
+          <w:sz w:val="21"/>
+          <w:szCs w:val="21"/>
+        </w:rPr>
+        <w:t xml:space="preserve">.</w:t>
+      </w:r>
+    </w:p>
+    <w:p>
+      <w:pPr>
+        <w:pStyle w:val="ListParagraph"/>
+        <w:numPr>
+          <w:ilvl w:val="0"/>
+          <w:numId w:val="3"/>
+        </w:numPr>
+        <w:spacing w:after="60"/>
+      </w:pPr>
+      <w:r>
+        <w:rPr>
+          <w:rFonts w:ascii="Arial" w:cs="Arial" w:eastAsia="Arial" w:hAnsi="Arial"/>
+          <w:sz w:val="21"/>
+          <w:szCs w:val="21"/>
+        </w:rPr>
+        <w:t xml:space="preserve">Group by the month of </w:t>
+      </w:r>
+      <w:r>
+        <w:rPr>
+          <w:rFonts w:ascii="Arial" w:cs="Arial" w:eastAsia="Arial" w:hAnsi="Arial"/>
+          <w:b/>
+          <w:bCs/>
+          <w:sz w:val="21"/>
+          <w:szCs w:val="21"/>
+        </w:rPr>
+        <w:t xml:space="preserve">Created</w:t>
+      </w:r>
+      <w:r>
+        <w:rPr>
+          <w:rFonts w:ascii="Arial" w:cs="Arial" w:eastAsia="Arial" w:hAnsi="Arial"/>
+          <w:sz w:val="21"/>
+          <w:szCs w:val="21"/>
+        </w:rPr>
+        <w:t xml:space="preserve"> and by </w:t>
+      </w:r>
+      <w:r>
+        <w:rPr>
+          <w:rFonts w:ascii="Arial" w:cs="Arial" w:eastAsia="Arial" w:hAnsi="Arial"/>
+          <w:b/>
+          <w:bCs/>
+          <w:sz w:val="21"/>
+          <w:szCs w:val="21"/>
+        </w:rPr>
+        <w:t xml:space="preserve">Channel</w:t>
+      </w:r>
+      <w:r>
+        <w:rPr>
+          <w:rFonts w:ascii="Arial" w:cs="Arial" w:eastAsia="Arial" w:hAnsi="Arial"/>
+          <w:sz w:val="21"/>
+          <w:szCs w:val="21"/>
+        </w:rPr>
+        <w:t xml:space="preserve">; add the counts of sent, opened and clicked messages.</w:t>
+      </w:r>
+    </w:p>
+    <w:p>
+      <w:pPr>
+        <w:pStyle w:val="ListParagraph"/>
+        <w:numPr>
+          <w:ilvl w:val="0"/>
+          <w:numId w:val="3"/>
+        </w:numPr>
+        <w:spacing w:after="60"/>
+      </w:pPr>
+      <w:r>
+        <w:rPr>
+          <w:rFonts w:ascii="Arial" w:cs="Arial" w:eastAsia="Arial" w:hAnsi="Arial"/>
+          <w:sz w:val="21"/>
+          <w:szCs w:val="21"/>
+        </w:rPr>
+        <w:t xml:space="preserve">Run it: 25 million messages are grouped and counted in under a second.</w:t>
+      </w:r>
+    </w:p>
+    <w:p>
+      <w:pPr>
+        <w:pStyle w:val="ListParagraph"/>
+        <w:numPr>
+          <w:ilvl w:val="0"/>
+          <w:numId w:val="3"/>
+        </w:numPr>
+        <w:spacing w:after="60"/>
+      </w:pPr>
+      <w:r>
+        <w:rPr>
+          <w:rFonts w:ascii="Arial" w:cs="Arial" w:eastAsia="Arial" w:hAnsi="Arial"/>
+          <w:sz w:val="21"/>
+          <w:szCs w:val="21"/>
+        </w:rPr>
+        <w:t xml:space="preserve">Add a filter on one campaign, or switch to a chart: each change runs again just as quickly.</w:t>
+      </w:r>
+    </w:p>
+    <w:p>
+      <w:pPr>
+        <w:spacing w:after="120"/>
+      </w:pPr>
+      <w:r>
+        <w:rPr>
+          <w:rFonts w:ascii="Arial" w:cs="Arial" w:eastAsia="Arial" w:hAnsi="Arial"/>
+          <w:b/>
+          <w:bCs/>
+          <w:sz w:val="21"/>
+          <w:szCs w:val="21"/>
+        </w:rPr>
+        <w:t xml:space="preserve">5. Open the dashboards</w:t>
+      </w:r>
+    </w:p>
+    <w:p>
+      <w:pPr>
+        <w:pStyle w:val="ListParagraph"/>
+        <w:numPr>
+          <w:ilvl w:val="0"/>
+          <w:numId w:val="3"/>
+        </w:numPr>
+        <w:spacing w:after="60"/>
+      </w:pPr>
+      <w:r>
+        <w:rPr>
+          <w:rFonts w:ascii="Arial" w:cs="Arial" w:eastAsia="Arial" w:hAnsi="Arial"/>
+          <w:sz w:val="21"/>
+          <w:szCs w:val="21"/>
+        </w:rPr>
+        <w:t xml:space="preserve">Open </w:t>
+      </w:r>
+      <w:r>
+        <w:rPr>
+          <w:rFonts w:ascii="Arial" w:cs="Arial" w:eastAsia="Arial" w:hAnsi="Arial"/>
+          <w:b/>
+          <w:bCs/>
+          <w:sz w:val="21"/>
+          <w:szCs w:val="21"/>
+        </w:rPr>
+        <w:t xml:space="preserve">Insights → Dashboards → Demo · Marketing Command Centre</w:t>
+      </w:r>
+      <w:r>
+        <w:rPr>
+          <w:rFonts w:ascii="Arial" w:cs="Arial" w:eastAsia="Arial" w:hAnsi="Arial"/>
+          <w:sz w:val="21"/>
+          <w:szCs w:val="21"/>
+        </w:rPr>
+        <w:t xml:space="preserve">: every tile reads the large data at once.</w:t>
+      </w:r>
+    </w:p>
+    <w:p>
+      <w:pPr>
+        <w:pStyle w:val="ListParagraph"/>
+        <w:numPr>
+          <w:ilvl w:val="0"/>
+          <w:numId w:val="3"/>
+        </w:numPr>
+        <w:spacing w:after="60"/>
+      </w:pPr>
+      <w:r>
+        <w:rPr>
+          <w:rFonts w:ascii="Arial" w:cs="Arial" w:eastAsia="Arial" w:hAnsi="Arial"/>
+          <w:b/>
+          <w:bCs/>
+          <w:sz w:val="21"/>
+          <w:szCs w:val="21"/>
+        </w:rPr>
+        <w:t xml:space="preserve">Demo · Store Performance</w:t>
+      </w:r>
+      <w:r>
+        <w:rPr>
+          <w:rFonts w:ascii="Arial" w:cs="Arial" w:eastAsia="Arial" w:hAnsi="Arial"/>
+          <w:sz w:val="21"/>
+          <w:szCs w:val="21"/>
+        </w:rPr>
+        <w:t xml:space="preserve"> reads the POS uploads, which stay in PostgreSQL (see </w:t>
+      </w:r>
+      <w:r>
+        <w:rPr>
+          <w:rFonts w:ascii="Arial" w:cs="Arial" w:eastAsia="Arial" w:hAnsi="Arial"/>
+          <w:i/>
+          <w:iCs/>
+          <w:sz w:val="21"/>
+          <w:szCs w:val="21"/>
+        </w:rPr>
+        <w:t xml:space="preserve">Things to know</w:t>
+      </w:r>
+      <w:r>
+        <w:rPr>
+          <w:rFonts w:ascii="Arial" w:cs="Arial" w:eastAsia="Arial" w:hAnsi="Arial"/>
+          <w:sz w:val="21"/>
+          <w:szCs w:val="21"/>
+        </w:rPr>
+        <w:t xml:space="preserve">).</w:t>
+      </w:r>
+    </w:p>
+    <w:p>
+      <w:pPr>
+        <w:spacing w:after="120"/>
+      </w:pPr>
+      <w:r>
+        <w:rPr>
+          <w:rFonts w:ascii="Arial" w:cs="Arial" w:eastAsia="Arial" w:hAnsi="Arial"/>
+          <w:b/>
+          <w:bCs/>
+          <w:sz w:val="21"/>
+          <w:szCs w:val="21"/>
+        </w:rPr>
+        <w:t xml:space="preserve">6. Check the speed in the Run Log</w:t>
+      </w:r>
+    </w:p>
+    <w:p>
+      <w:pPr>
+        <w:pStyle w:val="ListParagraph"/>
+        <w:numPr>
+          <w:ilvl w:val="0"/>
+          <w:numId w:val="3"/>
+        </w:numPr>
+        <w:spacing w:after="60"/>
+      </w:pPr>
+      <w:r>
+        <w:rPr>
+          <w:rFonts w:ascii="Arial" w:cs="Arial" w:eastAsia="Arial" w:hAnsi="Arial"/>
+          <w:sz w:val="21"/>
+          <w:szCs w:val="21"/>
+        </w:rPr>
+        <w:t xml:space="preserve">In the app, open </w:t>
+      </w:r>
+      <w:r>
+        <w:rPr>
+          <w:rFonts w:ascii="Arial" w:cs="Arial" w:eastAsia="Arial" w:hAnsi="Arial"/>
+          <w:b/>
+          <w:bCs/>
+          <w:sz w:val="21"/>
+          <w:szCs w:val="21"/>
+        </w:rPr>
+        <w:t xml:space="preserve">Insights → Run Log</w:t>
+      </w:r>
+      <w:r>
+        <w:rPr>
+          <w:rFonts w:ascii="Arial" w:cs="Arial" w:eastAsia="Arial" w:hAnsi="Arial"/>
+          <w:sz w:val="21"/>
+          <w:szCs w:val="21"/>
+        </w:rPr>
+        <w:t xml:space="preserve"> (report administrators; the demo admin is one).</w:t>
+      </w:r>
+    </w:p>
+    <w:p>
+      <w:pPr>
+        <w:pStyle w:val="ListParagraph"/>
+        <w:numPr>
+          <w:ilvl w:val="0"/>
+          <w:numId w:val="3"/>
+        </w:numPr>
+        <w:spacing w:after="60"/>
+      </w:pPr>
+      <w:r>
+        <w:rPr>
+          <w:rFonts w:ascii="Arial" w:cs="Arial" w:eastAsia="Arial" w:hAnsi="Arial"/>
+          <w:sz w:val="21"/>
+          <w:szCs w:val="21"/>
+        </w:rPr>
+        <w:t xml:space="preserve">Each run is listed with its time and rows, so the timings can be shown rather than told.</w:t>
+      </w:r>
+    </w:p>
+    <w:p>
+      <w:pPr>
+        <w:spacing w:after="120"/>
+      </w:pPr>
+      <w:r>
+        <w:rPr>
+          <w:rFonts w:ascii="Arial" w:cs="Arial" w:eastAsia="Arial" w:hAnsi="Arial"/>
+          <w:b/>
+          <w:bCs/>
+          <w:sz w:val="21"/>
+          <w:szCs w:val="21"/>
+        </w:rPr>
+        <w:t xml:space="preserve">7. Compare with PostgreSQL (optional)</w:t>
+      </w:r>
+    </w:p>
+    <w:p>
+      <w:pPr>
+        <w:pStyle w:val="ListParagraph"/>
+        <w:numPr>
+          <w:ilvl w:val="0"/>
+          <w:numId w:val="3"/>
+        </w:numPr>
+        <w:spacing w:after="60"/>
+      </w:pPr>
+      <w:r>
+        <w:rPr>
+          <w:rFonts w:ascii="Arial" w:cs="Arial" w:eastAsia="Arial" w:hAnsi="Arial"/>
+          <w:sz w:val="21"/>
+          <w:szCs w:val="21"/>
+        </w:rPr>
+        <w:t xml:space="preserve">In the back-office, on the CITYHT row of </w:t>
+      </w:r>
+      <w:r>
+        <w:rPr>
+          <w:rFonts w:ascii="Arial" w:cs="Arial" w:eastAsia="Arial" w:hAnsi="Arial"/>
+          <w:b/>
+          <w:bCs/>
+          <w:sz w:val="21"/>
+          <w:szCs w:val="21"/>
+        </w:rPr>
+        <w:t xml:space="preserve">Configuration → Report Engines</w:t>
+      </w:r>
+      <w:r>
+        <w:rPr>
+          <w:rFonts w:ascii="Arial" w:cs="Arial" w:eastAsia="Arial" w:hAnsi="Arial"/>
+          <w:sz w:val="21"/>
+          <w:szCs w:val="21"/>
+        </w:rPr>
+        <w:t xml:space="preserve">, press </w:t>
+      </w:r>
+      <w:r>
+        <w:rPr>
+          <w:rFonts w:ascii="Arial" w:cs="Arial" w:eastAsia="Arial" w:hAnsi="Arial"/>
+          <w:b/>
+          <w:bCs/>
+          <w:sz w:val="21"/>
+          <w:szCs w:val="21"/>
+        </w:rPr>
+        <w:t xml:space="preserve">Roll Back to PostgreSQL</w:t>
+      </w:r>
+      <w:r>
+        <w:rPr>
+          <w:rFonts w:ascii="Arial" w:cs="Arial" w:eastAsia="Arial" w:hAnsi="Arial"/>
+          <w:sz w:val="21"/>
+          <w:szCs w:val="21"/>
+        </w:rPr>
+        <w:t xml:space="preserve">.</w:t>
+      </w:r>
+    </w:p>
+    <w:p>
+      <w:pPr>
+        <w:pStyle w:val="ListParagraph"/>
+        <w:numPr>
+          <w:ilvl w:val="0"/>
+          <w:numId w:val="3"/>
+        </w:numPr>
+        <w:spacing w:after="60"/>
+      </w:pPr>
+      <w:r>
+        <w:rPr>
+          <w:rFonts w:ascii="Arial" w:cs="Arial" w:eastAsia="Arial" w:hAnsi="Arial"/>
+          <w:sz w:val="21"/>
+          <w:szCs w:val="21"/>
+        </w:rPr>
+        <w:t xml:space="preserve">Run the same report in the app: it now reads the small PostgreSQL sample only (about 12,700 messages), because the 25 million rows exist in ClickHouse alone.</w:t>
+      </w:r>
+    </w:p>
+    <w:p>
+      <w:pPr>
+        <w:pStyle w:val="ListParagraph"/>
+        <w:numPr>
+          <w:ilvl w:val="0"/>
+          <w:numId w:val="3"/>
+        </w:numPr>
+        <w:spacing w:after="60"/>
+      </w:pPr>
+      <w:r>
+        <w:rPr>
+          <w:rFonts w:ascii="Arial" w:cs="Arial" w:eastAsia="Arial" w:hAnsi="Arial"/>
+          <w:sz w:val="21"/>
+          <w:szCs w:val="21"/>
+        </w:rPr>
+        <w:t xml:space="preserve">To go back, press </w:t>
+      </w:r>
+      <w:r>
+        <w:rPr>
+          <w:rFonts w:ascii="Arial" w:cs="Arial" w:eastAsia="Arial" w:hAnsi="Arial"/>
+          <w:b/>
+          <w:bCs/>
+          <w:sz w:val="21"/>
+          <w:szCs w:val="21"/>
+        </w:rPr>
+        <w:t xml:space="preserve">Backfill ClickHouse</w:t>
+      </w:r>
+      <w:r>
+        <w:rPr>
+          <w:rFonts w:ascii="Arial" w:cs="Arial" w:eastAsia="Arial" w:hAnsi="Arial"/>
+          <w:sz w:val="21"/>
+          <w:szCs w:val="21"/>
+        </w:rPr>
+        <w:t xml:space="preserve"> (it copies the small sample again; the 25 million rows stay where they are), then </w:t>
+      </w:r>
+      <w:r>
+        <w:rPr>
+          <w:rFonts w:ascii="Arial" w:cs="Arial" w:eastAsia="Arial" w:hAnsi="Arial"/>
+          <w:b/>
+          <w:bCs/>
+          <w:sz w:val="21"/>
+          <w:szCs w:val="21"/>
+        </w:rPr>
+        <w:t xml:space="preserve">Activate ClickHouse</w:t>
+      </w:r>
+      <w:r>
+        <w:rPr>
+          <w:rFonts w:ascii="Arial" w:cs="Arial" w:eastAsia="Arial" w:hAnsi="Arial"/>
+          <w:sz w:val="21"/>
+          <w:szCs w:val="21"/>
+        </w:rPr>
+        <w:t xml:space="preserve">.</w:t>
+      </w:r>
+    </w:p>
+    <w:p>
+      <w:pPr>
+        <w:spacing w:after="120"/>
+      </w:pPr>
+      <w:r>
+        <w:rPr>
+          <w:rFonts w:ascii="Arial" w:cs="Arial" w:eastAsia="Arial" w:hAnsi="Arial"/>
+          <w:b/>
+          <w:bCs/>
+          <w:sz w:val="21"/>
+          <w:szCs w:val="21"/>
+        </w:rPr>
+        <w:t xml:space="preserve">8. End the session</w:t>
+      </w:r>
+    </w:p>
+    <w:p>
+      <w:pPr>
+        <w:spacing w:after="120"/>
+      </w:pPr>
+      <w:r>
+        <w:rPr>
+          <w:rFonts w:ascii="Arial" w:cs="Arial" w:eastAsia="Arial" w:hAnsi="Arial"/>
+          <w:sz w:val="21"/>
+          <w:szCs w:val="21"/>
+        </w:rPr>
+        <w:t xml:space="preserve">Press </w:t>
+      </w:r>
+      <w:r>
+        <w:rPr>
+          <w:rFonts w:ascii="Arial" w:cs="Arial" w:eastAsia="Arial" w:hAnsi="Arial"/>
+          <w:b/>
+          <w:bCs/>
+          <w:sz w:val="21"/>
+          <w:szCs w:val="21"/>
+        </w:rPr>
+        <w:t xml:space="preserve">End session</w:t>
+      </w:r>
+      <w:r>
+        <w:rPr>
+          <w:rFonts w:ascii="Arial" w:cs="Arial" w:eastAsia="Arial" w:hAnsi="Arial"/>
+          <w:sz w:val="21"/>
+          <w:szCs w:val="21"/>
+        </w:rPr>
+        <w:t xml:space="preserve"> on the support banner in the app, or let it expire.</w:t>
+      </w:r>
+    </w:p>
+    <w:p>
+      <w:pPr>
+        <w:pStyle w:val="Heading2"/>
+        <w:spacing w:after="120" w:before="240"/>
+      </w:pPr>
+      <w:r>
+        <w:rPr>
+          <w:rFonts w:ascii="Arial" w:cs="Arial" w:eastAsia="Arial" w:hAnsi="Arial"/>
+        </w:rPr>
+        <w:t xml:space="preserve">Things to know</w:t>
+      </w:r>
+    </w:p>
+    <w:p>
+      <w:pPr>
+        <w:pStyle w:val="ListParagraph"/>
+        <w:numPr>
+          <w:ilvl w:val="0"/>
+          <w:numId w:val="2"/>
+        </w:numPr>
+        <w:spacing w:after="60"/>
+      </w:pPr>
+      <w:r>
+        <w:rPr>
+          <w:rFonts w:ascii="Arial" w:cs="Arial" w:eastAsia="Arial" w:hAnsi="Arial"/>
+          <w:b/>
+          <w:bCs/>
+          <w:sz w:val="21"/>
+          <w:szCs w:val="21"/>
+        </w:rPr>
+        <w:t xml:space="preserve">Reconcile</w:t>
+      </w:r>
+      <w:r>
+        <w:rPr>
+          <w:rFonts w:ascii="Arial" w:cs="Arial" w:eastAsia="Arial" w:hAnsi="Arial"/>
+          <w:sz w:val="21"/>
+          <w:szCs w:val="21"/>
+        </w:rPr>
+        <w:t xml:space="preserve"> on the Report Engines row shows PostgreSQL far smaller than ClickHouse. That is by design: the large volume was generated straight into ClickHouse, so the dev server's PostgreSQL disk is not filled.</w:t>
+      </w:r>
+    </w:p>
+    <w:p>
+      <w:pPr>
+        <w:pStyle w:val="ListParagraph"/>
+        <w:numPr>
+          <w:ilvl w:val="0"/>
+          <w:numId w:val="2"/>
+        </w:numPr>
+        <w:spacing w:after="60"/>
+      </w:pPr>
+      <w:r>
+        <w:rPr>
+          <w:rFonts w:ascii="Arial" w:cs="Arial" w:eastAsia="Arial" w:hAnsi="Arial"/>
+          <w:sz w:val="21"/>
+          <w:szCs w:val="21"/>
+        </w:rPr>
+        <w:t xml:space="preserve">The quarter-hourly </w:t>
+      </w:r>
+      <w:r>
+        <w:rPr>
+          <w:rFonts w:ascii="Consolas" w:cs="Consolas" w:eastAsia="Consolas" w:hAnsi="Consolas"/>
+          <w:sz w:val="21"/>
+          <w:szCs w:val="21"/>
+        </w:rPr>
+        <w:t xml:space="preserve">refresh-clickhouse-reporting</w:t>
+      </w:r>
+      <w:r>
+        <w:rPr>
+          <w:rFonts w:ascii="Arial" w:cs="Arial" w:eastAsia="Arial" w:hAnsi="Arial"/>
+          <w:sz w:val="21"/>
+          <w:szCs w:val="21"/>
+        </w:rPr>
+        <w:t xml:space="preserve"> job keeps copying the sample's recent changes to ClickHouse; it never removes the generated rows.</w:t>
+      </w:r>
+    </w:p>
+    <w:p>
+      <w:pPr>
+        <w:pStyle w:val="ListParagraph"/>
+        <w:numPr>
+          <w:ilvl w:val="0"/>
+          <w:numId w:val="2"/>
+        </w:numPr>
+        <w:spacing w:after="60"/>
+      </w:pPr>
+      <w:r>
+        <w:rPr>
+          <w:rFonts w:ascii="Arial" w:cs="Arial" w:eastAsia="Arial" w:hAnsi="Arial"/>
+          <w:sz w:val="21"/>
+          <w:szCs w:val="21"/>
+        </w:rPr>
+        <w:t xml:space="preserve">The seven POS reports (store sales, returns, margins) read uploaded files, which Insights keeps in PostgreSQL whatever the engine; they are not part of the ClickHouse comparison.</w:t>
+      </w:r>
+    </w:p>
+    <w:p>
+      <w:pPr>
+        <w:pStyle w:val="ListParagraph"/>
+        <w:numPr>
+          <w:ilvl w:val="0"/>
+          <w:numId w:val="2"/>
+        </w:numPr>
+        <w:spacing w:after="60"/>
+      </w:pPr>
+      <w:r>
+        <w:rPr>
+          <w:rFonts w:ascii="Arial" w:cs="Arial" w:eastAsia="Arial" w:hAnsi="Arial"/>
+          <w:sz w:val="21"/>
+          <w:szCs w:val="21"/>
+        </w:rPr>
+        <w:t xml:space="preserve">The back-office Security page lists </w:t>
+      </w:r>
+      <w:r>
+        <w:rPr>
+          <w:rFonts w:ascii="Consolas" w:cs="Consolas" w:eastAsia="Consolas" w:hAnsi="Consolas"/>
+          <w:sz w:val="21"/>
+          <w:szCs w:val="21"/>
+        </w:rPr>
+        <w:t xml:space="preserve">demo.admin@cityht.example</w:t>
+      </w:r>
+      <w:r>
+        <w:rPr>
+          <w:rFonts w:ascii="Arial" w:cs="Arial" w:eastAsia="Arial" w:hAnsi="Arial"/>
+          <w:sz w:val="21"/>
+          <w:szCs w:val="21"/>
+        </w:rPr>
+        <w:t xml:space="preserve"> as an account that looks like a test account (Low). Accept the risk there with a reason such as </w:t>
+      </w:r>
+      <w:r>
+        <w:rPr>
+          <w:rFonts w:ascii="Arial" w:cs="Arial" w:eastAsia="Arial" w:hAnsi="Arial"/>
+          <w:i/>
+          <w:iCs/>
+          <w:sz w:val="21"/>
+          <w:szCs w:val="21"/>
+        </w:rPr>
+        <w:t xml:space="preserve">demo workspace on the dev server</w:t>
+      </w:r>
+      <w:r>
+        <w:rPr>
+          <w:rFonts w:ascii="Arial" w:cs="Arial" w:eastAsia="Arial" w:hAnsi="Arial"/>
+          <w:sz w:val="21"/>
+          <w:szCs w:val="21"/>
+        </w:rPr>
+        <w:t xml:space="preserve">.</w:t>
+      </w:r>
+    </w:p>
+    <w:p>
+      <w:pPr>
+        <w:pStyle w:val="ListParagraph"/>
+        <w:numPr>
+          <w:ilvl w:val="0"/>
+          <w:numId w:val="2"/>
+        </w:numPr>
+        <w:spacing w:after="60"/>
+      </w:pPr>
+      <w:r>
+        <w:rPr>
+          <w:rFonts w:ascii="Arial" w:cs="Arial" w:eastAsia="Arial" w:hAnsi="Arial"/>
+          <w:sz w:val="21"/>
+          <w:szCs w:val="21"/>
+        </w:rPr>
+        <w:t xml:space="preserve">Campaigns cannot be sent from City HT: it has no sending engine.</w:t>
+      </w:r>
+    </w:p>
+    <w:p>
+      <w:pPr>
+        <w:pStyle w:val="Heading2"/>
+        <w:spacing w:after="120" w:before="240"/>
+      </w:pPr>
+      <w:r>
+        <w:rPr>
+          <w:rFonts w:ascii="Arial" w:cs="Arial" w:eastAsia="Arial" w:hAnsi="Arial"/>
+        </w:rPr>
+        <w:t xml:space="preserve">Rebuilding or removing the demo</w:t>
+      </w:r>
+    </w:p>
+    <w:p>
+      <w:pPr>
+        <w:spacing w:after="120"/>
+      </w:pPr>
+      <w:r>
+        <w:rPr>
+          <w:rFonts w:ascii="Arial" w:cs="Arial" w:eastAsia="Arial" w:hAnsi="Arial"/>
+          <w:sz w:val="21"/>
+          <w:szCs w:val="21"/>
+        </w:rPr>
+        <w:t xml:space="preserve">The scripts that built it are on the dev server in </w:t>
+      </w:r>
+      <w:r>
+        <w:rPr>
+          <w:rFonts w:ascii="Consolas" w:cs="Consolas" w:eastAsia="Consolas" w:hAnsi="Consolas"/>
+          <w:sz w:val="21"/>
+          <w:szCs w:val="21"/>
+        </w:rPr>
+        <w:t xml:space="preserve">~/cep-demo</w:t>
+      </w:r>
+      <w:r>
+        <w:rPr>
+          <w:rFonts w:ascii="Arial" w:cs="Arial" w:eastAsia="Arial" w:hAnsi="Arial"/>
+          <w:sz w:val="21"/>
+          <w:szCs w:val="21"/>
+        </w:rPr>
+        <w:t xml:space="preserve"> (they are never pushed to the repository); each runs with </w:t>
+      </w:r>
+      <w:r>
+        <w:rPr>
+          <w:rFonts w:ascii="Consolas" w:cs="Consolas" w:eastAsia="Consolas" w:hAnsi="Consolas"/>
+          <w:sz w:val="21"/>
+          <w:szCs w:val="21"/>
+        </w:rPr>
+        <w:t xml:space="preserve">manage.py shell -c "exec(open(...).read())"</w:t>
+      </w:r>
+      <w:r>
+        <w:rPr>
+          <w:rFonts w:ascii="Arial" w:cs="Arial" w:eastAsia="Arial" w:hAnsi="Arial"/>
+          <w:sz w:val="21"/>
+          <w:szCs w:val="21"/>
+        </w:rPr>
+        <w:t xml:space="preserve"> under the production settings, from </w:t>
+      </w:r>
+      <w:r>
+        <w:rPr>
+          <w:rFonts w:ascii="Consolas" w:cs="Consolas" w:eastAsia="Consolas" w:hAnsi="Consolas"/>
+          <w:sz w:val="21"/>
+          <w:szCs w:val="21"/>
+        </w:rPr>
+        <w:t xml:space="preserve">/app/cep/backend</w:t>
+      </w:r>
+      <w:r>
+        <w:rPr>
+          <w:rFonts w:ascii="Arial" w:cs="Arial" w:eastAsia="Arial" w:hAnsi="Arial"/>
+          <w:sz w:val="21"/>
+          <w:szCs w:val="21"/>
+        </w:rPr>
+        <w:t xml:space="preserve">.</w:t>
+      </w:r>
+    </w:p>
+    <w:tbl>
+      <w:tblPr>
+        <w:tblW w:type="dxa" w:w="10080"/>
+        <w:tblBorders>
+          <w:top w:val="single" w:color="D9DBE3" w:sz="4"/>
+          <w:left w:val="none"/>
+          <w:bottom w:val="single" w:color="D9DBE3" w:sz="4"/>
+          <w:right w:val="none"/>
+          <w:insideH w:val="single" w:color="E6E8EF" w:sz="4"/>
+          <w:insideV w:val="none"/>
+        </w:tblBorders>
+      </w:tblPr>
+      <w:tblGrid>
+        <w:gridCol w:w="2600"/>
+        <w:gridCol w:w="7480"/>
+      </w:tblGrid>
+      <w:tr>
+        <w:trPr>
+          <w:tblHeader/>
+        </w:trPr>
+        <w:tc>
+          <w:tcPr>
+            <w:tcW w:type="dxa" w:w="2600"/>
+            <w:shd w:fill="EEEFF5" w:color="auto" w:val="clear"/>
+            <w:tcMar>
+              <w:top w:type="dxa" w:w="60"/>
+              <w:left w:type="dxa" w:w="90"/>
+              <w:bottom w:type="dxa" w:w="60"/>
+              <w:right w:type="dxa" w:w="90"/>
+            </w:tcMar>
+          </w:tcPr>
+          <w:p>
+            <w:r>
+              <w:rPr>
+                <w:rFonts w:ascii="Arial" w:cs="Arial" w:eastAsia="Arial" w:hAnsi="Arial"/>
+                <w:b/>
+                <w:bCs/>
+                <w:sz w:val="18"/>
+                <w:szCs w:val="18"/>
+              </w:rPr>
+              <w:t xml:space="preserve">Script</w:t>
+            </w:r>
+          </w:p>
+        </w:tc>
+        <w:tc>
+          <w:tcPr>
+            <w:tcW w:type="dxa" w:w="7480"/>
+            <w:shd w:fill="EEEFF5" w:color="auto" w:val="clear"/>
+            <w:tcMar>
+              <w:top w:type="dxa" w:w="60"/>
+              <w:left w:type="dxa" w:w="90"/>
+              <w:bottom w:type="dxa" w:w="60"/>
+              <w:right w:type="dxa" w:w="90"/>
+            </w:tcMar>
+          </w:tcPr>
+          <w:p>
+            <w:r>
+              <w:rPr>
+                <w:rFonts w:ascii="Arial" w:cs="Arial" w:eastAsia="Arial" w:hAnsi="Arial"/>
+                <w:b/>
+                <w:bCs/>
+                <w:sz w:val="18"/>
+                <w:szCs w:val="18"/>
+              </w:rPr>
+              <w:t xml:space="preserve">What it does</w:t>
+            </w:r>
+          </w:p>
+        </w:tc>
+      </w:tr>
+      <w:tr>
+        <w:tc>
+          <w:tcPr>
+            <w:tcW w:type="dxa" w:w="2600"/>
+            <w:tcMar>
+              <w:top w:type="dxa" w:w="60"/>
+              <w:left w:type="dxa" w:w="90"/>
+              <w:bottom w:type="dxa" w:w="60"/>
+              <w:right w:type="dxa" w:w="90"/>
+            </w:tcMar>
+          </w:tcPr>
+          <w:p>
+            <w:r>
+              <w:rPr>
+                <w:rFonts w:ascii="Consolas" w:cs="Consolas" w:eastAsia="Consolas" w:hAnsi="Consolas"/>
+                <w:sz w:val="19"/>
+                <w:szCs w:val="19"/>
+              </w:rPr>
+              <w:t xml:space="preserve">create_cityht.py</w:t>
+            </w:r>
+          </w:p>
+        </w:tc>
+        <w:tc>
+          <w:tcPr>
+            <w:tcW w:type="dxa" w:w="7480"/>
+            <w:tcMar>
+              <w:top w:type="dxa" w:w="60"/>
+              <w:left w:type="dxa" w:w="90"/>
+              <w:bottom w:type="dxa" w:w="60"/>
+              <w:right w:type="dxa" w:w="90"/>
+            </w:tcMar>
+          </w:tcPr>
+          <w:p>
+            <w:r>
+              <w:rPr>
+                <w:rFonts w:ascii="Arial" w:cs="Arial" w:eastAsia="Arial" w:hAnsi="Arial"/>
+                <w:sz w:val="19"/>
+                <w:szCs w:val="19"/>
+              </w:rPr>
+              <w:t xml:space="preserve">Creates the workspace and its demo admin; does nothing if they exist.</w:t>
+            </w:r>
+          </w:p>
+        </w:tc>
+      </w:tr>
+      <w:tr>
+        <w:tc>
+          <w:tcPr>
+            <w:tcW w:type="dxa" w:w="2600"/>
+            <w:tcMar>
+              <w:top w:type="dxa" w:w="60"/>
+              <w:left w:type="dxa" w:w="90"/>
+              <w:bottom w:type="dxa" w:w="60"/>
+              <w:right w:type="dxa" w:w="90"/>
+            </w:tcMar>
+          </w:tcPr>
+          <w:p>
+            <w:r>
+              <w:rPr>
+                <w:rFonts w:ascii="Consolas" w:cs="Consolas" w:eastAsia="Consolas" w:hAnsi="Consolas"/>
+                <w:sz w:val="19"/>
+                <w:szCs w:val="19"/>
+              </w:rPr>
+              <w:t xml:space="preserve">seed_insights_demo.py</w:t>
+            </w:r>
+            <w:r>
+              <w:rPr>
+                <w:rFonts w:ascii="Arial" w:cs="Arial" w:eastAsia="Arial" w:hAnsi="Arial"/>
+                <w:sz w:val="19"/>
+                <w:szCs w:val="19"/>
+              </w:rPr>
+              <w:t xml:space="preserve"> with </w:t>
+            </w:r>
+            <w:r>
+              <w:rPr>
+                <w:rFonts w:ascii="Consolas" w:cs="Consolas" w:eastAsia="Consolas" w:hAnsi="Consolas"/>
+                <w:sz w:val="19"/>
+                <w:szCs w:val="19"/>
+              </w:rPr>
+              <w:t xml:space="preserve">DEMO_TENANT=CITYHT</w:t>
+            </w:r>
+          </w:p>
+        </w:tc>
+        <w:tc>
+          <w:tcPr>
+            <w:tcW w:type="dxa" w:w="7480"/>
+            <w:tcMar>
+              <w:top w:type="dxa" w:w="60"/>
+              <w:left w:type="dxa" w:w="90"/>
+              <w:bottom w:type="dxa" w:w="60"/>
+              <w:right w:type="dxa" w:w="90"/>
+            </w:tcMar>
+          </w:tcPr>
+          <w:p>
+            <w:r>
+              <w:rPr>
+                <w:rFonts w:ascii="Arial" w:cs="Arial" w:eastAsia="Arial" w:hAnsi="Arial"/>
+                <w:sz w:val="19"/>
+                <w:szCs w:val="19"/>
+              </w:rPr>
+              <w:t xml:space="preserve">The PostgreSQL sample, reports and dashboards; </w:t>
+            </w:r>
+            <w:r>
+              <w:rPr>
+                <w:rFonts w:ascii="Consolas" w:cs="Consolas" w:eastAsia="Consolas" w:hAnsi="Consolas"/>
+                <w:sz w:val="19"/>
+                <w:szCs w:val="19"/>
+              </w:rPr>
+              <w:t xml:space="preserve">DEMO_MODE=clean</w:t>
+            </w:r>
+            <w:r>
+              <w:rPr>
+                <w:rFonts w:ascii="Arial" w:cs="Arial" w:eastAsia="Arial" w:hAnsi="Arial"/>
+                <w:sz w:val="19"/>
+                <w:szCs w:val="19"/>
+              </w:rPr>
+              <w:t xml:space="preserve"> removes them.</w:t>
+            </w:r>
+          </w:p>
+        </w:tc>
+      </w:tr>
+      <w:tr>
+        <w:tc>
+          <w:tcPr>
+            <w:tcW w:type="dxa" w:w="2600"/>
+            <w:tcMar>
+              <w:top w:type="dxa" w:w="60"/>
+              <w:left w:type="dxa" w:w="90"/>
+              <w:bottom w:type="dxa" w:w="60"/>
+              <w:right w:type="dxa" w:w="90"/>
+            </w:tcMar>
+          </w:tcPr>
+          <w:p>
+            <w:r>
+              <w:rPr>
+                <w:rFonts w:ascii="Consolas" w:cs="Consolas" w:eastAsia="Consolas" w:hAnsi="Consolas"/>
+                <w:sz w:val="19"/>
+                <w:szCs w:val="19"/>
+              </w:rPr>
+              <w:t xml:space="preserve">cityht_backfill_vocab.py</w:t>
+            </w:r>
+          </w:p>
+        </w:tc>
+        <w:tc>
+          <w:tcPr>
+            <w:tcW w:type="dxa" w:w="7480"/>
+            <w:tcMar>
+              <w:top w:type="dxa" w:w="60"/>
+              <w:left w:type="dxa" w:w="90"/>
+              <w:bottom w:type="dxa" w:w="60"/>
+              <w:right w:type="dxa" w:w="90"/>
+            </w:tcMar>
+          </w:tcPr>
+          <w:p>
+            <w:r>
+              <w:rPr>
+                <w:rFonts w:ascii="Arial" w:cs="Arial" w:eastAsia="Arial" w:hAnsi="Arial"/>
+                <w:sz w:val="19"/>
+                <w:szCs w:val="19"/>
+              </w:rPr>
+              <w:t xml:space="preserve">Copies the sample into ClickHouse (Backfill) and prints its values.</w:t>
+            </w:r>
+          </w:p>
+        </w:tc>
+      </w:tr>
+      <w:tr>
+        <w:tc>
+          <w:tcPr>
+            <w:tcW w:type="dxa" w:w="2600"/>
+            <w:tcMar>
+              <w:top w:type="dxa" w:w="60"/>
+              <w:left w:type="dxa" w:w="90"/>
+              <w:bottom w:type="dxa" w:w="60"/>
+              <w:right w:type="dxa" w:w="90"/>
+            </w:tcMar>
+          </w:tcPr>
+          <w:p>
+            <w:r>
+              <w:rPr>
+                <w:rFonts w:ascii="Consolas" w:cs="Consolas" w:eastAsia="Consolas" w:hAnsi="Consolas"/>
+                <w:sz w:val="19"/>
+                <w:szCs w:val="19"/>
+              </w:rPr>
+              <w:t xml:space="preserve">cityht_generate.py</w:t>
+            </w:r>
+          </w:p>
+        </w:tc>
+        <w:tc>
+          <w:tcPr>
+            <w:tcW w:type="dxa" w:w="7480"/>
+            <w:tcMar>
+              <w:top w:type="dxa" w:w="60"/>
+              <w:left w:type="dxa" w:w="90"/>
+              <w:bottom w:type="dxa" w:w="60"/>
+              <w:right w:type="dxa" w:w="90"/>
+            </w:tcMar>
+          </w:tcPr>
+          <w:p>
+            <w:r>
+              <w:rPr>
+                <w:rFonts w:ascii="Arial" w:cs="Arial" w:eastAsia="Arial" w:hAnsi="Arial"/>
+                <w:sz w:val="19"/>
+                <w:szCs w:val="19"/>
+              </w:rPr>
+              <w:t xml:space="preserve">Removes and regenerates the large volume inside ClickHouse, merges the tables and sets the engine to ClickHouse (about 90 seconds).</w:t>
+            </w:r>
+          </w:p>
+        </w:tc>
+      </w:tr>
+      <w:tr>
+        <w:tc>
+          <w:tcPr>
+            <w:tcW w:type="dxa" w:w="2600"/>
+            <w:tcMar>
+              <w:top w:type="dxa" w:w="60"/>
+              <w:left w:type="dxa" w:w="90"/>
+              <w:bottom w:type="dxa" w:w="60"/>
+              <w:right w:type="dxa" w:w="90"/>
+            </w:tcMar>
+          </w:tcPr>
+          <w:p>
+            <w:r>
+              <w:rPr>
+                <w:rFonts w:ascii="Consolas" w:cs="Consolas" w:eastAsia="Consolas" w:hAnsi="Consolas"/>
+                <w:sz w:val="19"/>
+                <w:szCs w:val="19"/>
+              </w:rPr>
+              <w:t xml:space="preserve">cityht_timing.py</w:t>
+            </w:r>
+          </w:p>
+        </w:tc>
+        <w:tc>
+          <w:tcPr>
+            <w:tcW w:type="dxa" w:w="7480"/>
+            <w:tcMar>
+              <w:top w:type="dxa" w:w="60"/>
+              <w:left w:type="dxa" w:w="90"/>
+              <w:bottom w:type="dxa" w:w="60"/>
+              <w:right w:type="dxa" w:w="90"/>
+            </w:tcMar>
+          </w:tcPr>
+          <w:p>
+            <w:r>
+              <w:rPr>
+                <w:rFonts w:ascii="Arial" w:cs="Arial" w:eastAsia="Arial" w:hAnsi="Arial"/>
+                <w:sz w:val="19"/>
+                <w:szCs w:val="19"/>
+              </w:rPr>
+              <w:t xml:space="preserve">Times the saved reports through the report runner.</w:t>
+            </w:r>
+          </w:p>
+        </w:tc>
+      </w:tr>
+    </w:tbl>
+    <w:p>
+      <w:pPr>
+        <w:spacing w:after="120"/>
+      </w:pPr>
+    </w:p>
+    <w:p>
+      <w:pPr>
+        <w:spacing w:after="120"/>
+      </w:pPr>
+      <w:r>
+        <w:rPr>
+          <w:rFonts w:ascii="Arial" w:cs="Arial" w:eastAsia="Arial" w:hAnsi="Arial"/>
+          <w:sz w:val="21"/>
+          <w:szCs w:val="21"/>
+        </w:rPr>
+        <w:t xml:space="preserve">To remove the large volume only, roll the workspace back to PostgreSQL and delete the generated rows in ClickHouse (their ids start with </w:t>
+      </w:r>
+      <w:r>
+        <w:rPr>
+          <w:rFonts w:ascii="Consolas" w:cs="Consolas" w:eastAsia="Consolas" w:hAnsi="Consolas"/>
+          <w:sz w:val="21"/>
+          <w:szCs w:val="21"/>
+        </w:rPr>
+        <w:t xml:space="preserve">g</w:t>
+      </w:r>
+      <w:r>
+        <w:rPr>
+          <w:rFonts w:ascii="Arial" w:cs="Arial" w:eastAsia="Arial" w:hAnsi="Arial"/>
+          <w:sz w:val="21"/>
+          <w:szCs w:val="21"/>
+        </w:rPr>
+        <w:t xml:space="preserve">, </w:t>
+      </w:r>
+      <w:r>
+        <w:rPr>
+          <w:rFonts w:ascii="Consolas" w:cs="Consolas" w:eastAsia="Consolas" w:hAnsi="Consolas"/>
+          <w:sz w:val="21"/>
+          <w:szCs w:val="21"/>
+        </w:rPr>
+        <w:t xml:space="preserve">go</w:t>
+      </w:r>
+      <w:r>
+        <w:rPr>
+          <w:rFonts w:ascii="Arial" w:cs="Arial" w:eastAsia="Arial" w:hAnsi="Arial"/>
+          <w:sz w:val="21"/>
+          <w:szCs w:val="21"/>
+        </w:rPr>
+        <w:t xml:space="preserve">, </w:t>
+      </w:r>
+      <w:r>
+        <w:rPr>
+          <w:rFonts w:ascii="Consolas" w:cs="Consolas" w:eastAsia="Consolas" w:hAnsi="Consolas"/>
+          <w:sz w:val="21"/>
+          <w:szCs w:val="21"/>
+        </w:rPr>
+        <w:t xml:space="preserve">gj</w:t>
+      </w:r>
+      <w:r>
+        <w:rPr>
+          <w:rFonts w:ascii="Arial" w:cs="Arial" w:eastAsia="Arial" w:hAnsi="Arial"/>
+          <w:sz w:val="21"/>
+          <w:szCs w:val="21"/>
+        </w:rPr>
+        <w:t xml:space="preserve"> and </w:t>
+      </w:r>
+      <w:r>
+        <w:rPr>
+          <w:rFonts w:ascii="Consolas" w:cs="Consolas" w:eastAsia="Consolas" w:hAnsi="Consolas"/>
+          <w:sz w:val="21"/>
+          <w:szCs w:val="21"/>
+        </w:rPr>
+        <w:t xml:space="preserve">CHT-</w:t>
+      </w:r>
+      <w:r>
+        <w:rPr>
+          <w:rFonts w:ascii="Arial" w:cs="Arial" w:eastAsia="Arial" w:hAnsi="Arial"/>
+          <w:sz w:val="21"/>
+          <w:szCs w:val="21"/>
+        </w:rPr>
+        <w:t xml:space="preserve">), as the start of </w:t>
+      </w:r>
+      <w:r>
+        <w:rPr>
+          <w:rFonts w:ascii="Consolas" w:cs="Consolas" w:eastAsia="Consolas" w:hAnsi="Consolas"/>
+          <w:sz w:val="21"/>
+          <w:szCs w:val="21"/>
+        </w:rPr>
+        <w:t xml:space="preserve">cityht_generate.py</w:t>
+      </w:r>
+      <w:r>
+        <w:rPr>
+          <w:rFonts w:ascii="Arial" w:cs="Arial" w:eastAsia="Arial" w:hAnsi="Arial"/>
+          <w:sz w:val="21"/>
+          <w:szCs w:val="21"/>
+        </w:rPr>
+        <w:t xml:space="preserve"> does.</w:t>
+      </w:r>
+    </w:p>
+    <w:p>
+      <w:pPr>
+        <w:pStyle w:val="Heading2"/>
+        <w:spacing w:after="120" w:before="240"/>
+      </w:pPr>
+      <w:r>
+        <w:rPr>
+          <w:rFonts w:ascii="Arial" w:cs="Arial" w:eastAsia="Arial" w:hAnsi="Arial"/>
+        </w:rPr>
+        <w:t xml:space="preserve">Related chapters</w:t>
+      </w:r>
+    </w:p>
+    <w:p>
+      <w:pPr>
+        <w:spacing w:after="120"/>
+      </w:pPr>
+      <w:r>
+        <w:rPr>
+          <w:rFonts w:ascii="Arial" w:cs="Arial" w:eastAsia="Arial" w:hAnsi="Arial"/>
+          <w:sz w:val="21"/>
+          <w:szCs w:val="21"/>
+        </w:rPr>
+        <w:t xml:space="preserve">Report Datasets and Report Engines (switching any workspace between PostgreSQL and ClickHouse); Tenants and People and Access (the workspace and its user); Security (accepting the demo admin as a known risk).</w:t>
       </w:r>
     </w:p>
     <w:p>

</xml_diff>